<commit_message>
Escreve o capítulo de Desenvolvimento no documento do TCC
Preenche a seção "2 DESENVOLVIMENTO" do documento
Grupo_7__Fazer_correção.docx, que estava vazia, com cinco subseções
(numeradas automaticamente pelo próprio estilo do template):
Arquitetura do Sistema, Modelagem do Banco de Dados, Desenvolvimento
do Back-end, Desenvolvimento do Firmware do ESP32 e Desenvolvimento
do Front-end.

Nenhuma outra parte do documento foi alterada (Introdução, Objetivos,
Metodologia, Modelo Conceitual, Considerações Finais, Referências,
Apêndices e Anexos permanecem exatamente como estavam).

Co-Authored-By: Claude Sonnet 5 <noreply@anthropic.com>
Claude-Session: https://claude.ai/code/session_013Rc2Ee8C1bMj8YbxRKjhcM
</commit_message>
<xml_diff>
--- a/docs/TCC/Grupo_7__Fazer_correção.docx
+++ b/docs/TCC/Grupo_7__Fazer_correção.docx
@@ -15,19 +15,7 @@
         <w:pStyle w:val="ABNT-Capa"/>
       </w:pPr>
       <w:r>
-        <w:t>e</w:t>
-      </w:r>
-      <w:r>
-        <w:t xml:space="preserve">scola </w:t>
-      </w:r>
-      <w:r>
-        <w:t>t</w:t>
-      </w:r>
-      <w:r>
-        <w:t>ecnica estadual</w:t>
-      </w:r>
-      <w:r>
-        <w:t xml:space="preserve"> pedro badran</w:t>
+        <w:t xml:space="preserve">escola tecnica estadual pedro badran</w:t>
       </w:r>
     </w:p>
     <w:p>
@@ -35,10 +23,7 @@
         <w:pStyle w:val="ABNT-Capa"/>
       </w:pPr>
       <w:r>
-        <w:t xml:space="preserve">CURSO DE </w:t>
-      </w:r>
-      <w:r>
-        <w:t xml:space="preserve">Ensino Médio com Habilitação Profissional de </w:t>
+        <w:t xml:space="preserve">CURSO DE Ensino Médio com Habilitação Profissional de </w:t>
       </w:r>
     </w:p>
     <w:p>
@@ -236,15 +221,7 @@
         </w:rPr>
       </w:pPr>
       <w:r>
-        <w:t xml:space="preserve">dezembro - </w:t>
-      </w:r>
-      <w:r>
-        <w:t>202</w:t>
-      </w:r>
-      <w:r>
-        <w:t>6</w:t>
-      </w:r>
-      <w:r>
+        <w:t xml:space="preserve">dezembro - 2026</w:t>
         <w:br w:type="page"/>
       </w:r>
     </w:p>
@@ -275,10 +252,7 @@
         <w:pStyle w:val="ABNT-Corpodetexto"/>
       </w:pPr>
       <w:r>
-        <w:t>Aos professores Andrea Avezum Martus e Juliano</w:t>
-      </w:r>
-      <w:r>
-        <w:t xml:space="preserve"> Aparecido Dezem Telles...</w:t>
+        <w:t xml:space="preserve">Aos professores Andrea Avezum Martus e Juliano Aparecido Dezem Telles...</w:t>
       </w:r>
     </w:p>
     <w:p>
@@ -405,11 +379,7 @@
       </w:pPr>
       <w:r>
         <w:fldChar w:fldCharType="begin"/>
-      </w:r>
-      <w:r>
         <w:instrText xml:space="preserve"> TOC \h \z \t "ABNT - Lista de ilustrações" \c </w:instrText>
-      </w:r>
-      <w:r>
         <w:fldChar w:fldCharType="separate"/>
       </w:r>
       <w:hyperlink w:anchor="_Toc58249391" w:history="1">
@@ -426,46 +396,10 @@
             <w:webHidden/>
           </w:rPr>
           <w:tab/>
-        </w:r>
-        <w:r>
-          <w:rPr>
-            <w:noProof/>
-            <w:webHidden/>
-          </w:rPr>
           <w:fldChar w:fldCharType="begin"/>
-        </w:r>
-        <w:r>
-          <w:rPr>
-            <w:noProof/>
-            <w:webHidden/>
-          </w:rPr>
           <w:instrText xml:space="preserve"> PAGEREF _Toc58249391 \h </w:instrText>
-        </w:r>
-        <w:r>
-          <w:rPr>
-            <w:noProof/>
-            <w:webHidden/>
-          </w:rPr>
-        </w:r>
-        <w:r>
-          <w:rPr>
-            <w:noProof/>
-            <w:webHidden/>
-          </w:rPr>
           <w:fldChar w:fldCharType="separate"/>
-        </w:r>
-        <w:r>
-          <w:rPr>
-            <w:noProof/>
-            <w:webHidden/>
-          </w:rPr>
           <w:t>17</w:t>
-        </w:r>
-        <w:r>
-          <w:rPr>
-            <w:noProof/>
-            <w:webHidden/>
-          </w:rPr>
           <w:fldChar w:fldCharType="end"/>
         </w:r>
       </w:hyperlink>
@@ -497,46 +431,10 @@
             <w:webHidden/>
           </w:rPr>
           <w:tab/>
-        </w:r>
-        <w:r>
-          <w:rPr>
-            <w:noProof/>
-            <w:webHidden/>
-          </w:rPr>
           <w:fldChar w:fldCharType="begin"/>
-        </w:r>
-        <w:r>
-          <w:rPr>
-            <w:noProof/>
-            <w:webHidden/>
-          </w:rPr>
           <w:instrText xml:space="preserve"> PAGEREF _Toc58249392 \h </w:instrText>
-        </w:r>
-        <w:r>
-          <w:rPr>
-            <w:noProof/>
-            <w:webHidden/>
-          </w:rPr>
-        </w:r>
-        <w:r>
-          <w:rPr>
-            <w:noProof/>
-            <w:webHidden/>
-          </w:rPr>
           <w:fldChar w:fldCharType="separate"/>
-        </w:r>
-        <w:r>
-          <w:rPr>
-            <w:noProof/>
-            <w:webHidden/>
-          </w:rPr>
           <w:t>18</w:t>
-        </w:r>
-        <w:r>
-          <w:rPr>
-            <w:noProof/>
-            <w:webHidden/>
-          </w:rPr>
           <w:fldChar w:fldCharType="end"/>
         </w:r>
       </w:hyperlink>
@@ -568,46 +466,10 @@
             <w:webHidden/>
           </w:rPr>
           <w:tab/>
-        </w:r>
-        <w:r>
-          <w:rPr>
-            <w:noProof/>
-            <w:webHidden/>
-          </w:rPr>
           <w:fldChar w:fldCharType="begin"/>
-        </w:r>
-        <w:r>
-          <w:rPr>
-            <w:noProof/>
-            <w:webHidden/>
-          </w:rPr>
           <w:instrText xml:space="preserve"> PAGEREF _Toc58249393 \h </w:instrText>
-        </w:r>
-        <w:r>
-          <w:rPr>
-            <w:noProof/>
-            <w:webHidden/>
-          </w:rPr>
-        </w:r>
-        <w:r>
-          <w:rPr>
-            <w:noProof/>
-            <w:webHidden/>
-          </w:rPr>
           <w:fldChar w:fldCharType="separate"/>
-        </w:r>
-        <w:r>
-          <w:rPr>
-            <w:noProof/>
-            <w:webHidden/>
-          </w:rPr>
           <w:t>18</w:t>
-        </w:r>
-        <w:r>
-          <w:rPr>
-            <w:noProof/>
-            <w:webHidden/>
-          </w:rPr>
           <w:fldChar w:fldCharType="end"/>
         </w:r>
       </w:hyperlink>
@@ -654,11 +516,7 @@
       </w:pPr>
       <w:r>
         <w:fldChar w:fldCharType="begin"/>
-      </w:r>
-      <w:r>
         <w:instrText xml:space="preserve"> TOC \h \z \t "ABNT - Lista de tabelas" \c </w:instrText>
-      </w:r>
-      <w:r>
         <w:fldChar w:fldCharType="separate"/>
       </w:r>
       <w:hyperlink w:anchor="_Toc58249346" w:history="1">
@@ -675,46 +533,10 @@
             <w:webHidden/>
           </w:rPr>
           <w:tab/>
-        </w:r>
-        <w:r>
-          <w:rPr>
-            <w:noProof/>
-            <w:webHidden/>
-          </w:rPr>
           <w:fldChar w:fldCharType="begin"/>
-        </w:r>
-        <w:r>
-          <w:rPr>
-            <w:noProof/>
-            <w:webHidden/>
-          </w:rPr>
           <w:instrText xml:space="preserve"> PAGEREF _Toc58249346 \h </w:instrText>
-        </w:r>
-        <w:r>
-          <w:rPr>
-            <w:noProof/>
-            <w:webHidden/>
-          </w:rPr>
-        </w:r>
-        <w:r>
-          <w:rPr>
-            <w:noProof/>
-            <w:webHidden/>
-          </w:rPr>
           <w:fldChar w:fldCharType="separate"/>
-        </w:r>
-        <w:r>
-          <w:rPr>
-            <w:noProof/>
-            <w:webHidden/>
-          </w:rPr>
           <w:t>17</w:t>
-        </w:r>
-        <w:r>
-          <w:rPr>
-            <w:noProof/>
-            <w:webHidden/>
-          </w:rPr>
           <w:fldChar w:fldCharType="end"/>
         </w:r>
       </w:hyperlink>
@@ -755,11 +577,7 @@
       </w:pPr>
       <w:r>
         <w:t>ABNT</w:t>
-      </w:r>
-      <w:r>
         <w:tab/>
-      </w:r>
-      <w:r>
         <w:tab/>
         <w:t>Associação Brasileira de Normas Técnicas</w:t>
       </w:r>
@@ -770,11 +588,7 @@
       </w:pPr>
       <w:r>
         <w:t>UFFS</w:t>
-      </w:r>
-      <w:r>
         <w:tab/>
-      </w:r>
-      <w:r>
         <w:tab/>
         <w:t>Universidade Federal da Fronteira Sul</w:t>
       </w:r>
@@ -812,8 +626,6 @@
       </w:pPr>
       <w:r>
         <w:t>Σ</w:t>
-      </w:r>
-      <w:r>
         <w:tab/>
         <w:t>Somatório</w:t>
       </w:r>
@@ -824,8 +636,6 @@
       </w:pPr>
       <w:r>
         <w:t>¬</w:t>
-      </w:r>
-      <w:r>
         <w:tab/>
         <w:t>Negação lógica</w:t>
       </w:r>
@@ -841,12 +651,8 @@
       </w:pPr>
       <w:r>
         <w:t>∩</w:t>
-      </w:r>
-      <w:r>
         <w:tab/>
         <w:t>Intersecção</w:t>
-      </w:r>
-      <w:r>
         <w:tab/>
       </w:r>
     </w:p>
@@ -877,10 +683,7 @@
       </w:pPr>
       <w:r>
         <w:lastRenderedPageBreak/>
-        <w:t>SUMÁRIO</w:t>
-      </w:r>
-      <w:r>
-        <w:t xml:space="preserve"> – </w:t>
+        <w:t xml:space="preserve">SUMÁRIO – </w:t>
       </w:r>
       <w:r>
         <w:rPr>
@@ -905,11 +708,7 @@
       </w:pPr>
       <w:r>
         <w:fldChar w:fldCharType="begin"/>
-      </w:r>
-      <w:r>
         <w:instrText xml:space="preserve"> TOC \o "1-6" \h \z \u </w:instrText>
-      </w:r>
-      <w:r>
         <w:fldChar w:fldCharType="separate"/>
       </w:r>
       <w:hyperlink w:anchor="_Toc192620994" w:history="1">
@@ -946,46 +745,10 @@
             <w:webHidden/>
           </w:rPr>
           <w:tab/>
-        </w:r>
-        <w:r>
-          <w:rPr>
-            <w:noProof/>
-            <w:webHidden/>
-          </w:rPr>
           <w:fldChar w:fldCharType="begin"/>
-        </w:r>
-        <w:r>
-          <w:rPr>
-            <w:noProof/>
-            <w:webHidden/>
-          </w:rPr>
           <w:instrText xml:space="preserve"> PAGEREF _Toc192620994 \h </w:instrText>
-        </w:r>
-        <w:r>
-          <w:rPr>
-            <w:noProof/>
-            <w:webHidden/>
-          </w:rPr>
-        </w:r>
-        <w:r>
-          <w:rPr>
-            <w:noProof/>
-            <w:webHidden/>
-          </w:rPr>
           <w:fldChar w:fldCharType="separate"/>
-        </w:r>
-        <w:r>
-          <w:rPr>
-            <w:noProof/>
-            <w:webHidden/>
-          </w:rPr>
           <w:t>8</w:t>
-        </w:r>
-        <w:r>
-          <w:rPr>
-            <w:noProof/>
-            <w:webHidden/>
-          </w:rPr>
           <w:fldChar w:fldCharType="end"/>
         </w:r>
       </w:hyperlink>
@@ -1039,46 +802,10 @@
             <w:webHidden/>
           </w:rPr>
           <w:tab/>
-        </w:r>
-        <w:r>
-          <w:rPr>
-            <w:noProof/>
-            <w:webHidden/>
-          </w:rPr>
           <w:fldChar w:fldCharType="begin"/>
-        </w:r>
-        <w:r>
-          <w:rPr>
-            <w:noProof/>
-            <w:webHidden/>
-          </w:rPr>
           <w:instrText xml:space="preserve"> PAGEREF _Toc192620995 \h </w:instrText>
-        </w:r>
-        <w:r>
-          <w:rPr>
-            <w:noProof/>
-            <w:webHidden/>
-          </w:rPr>
-        </w:r>
-        <w:r>
-          <w:rPr>
-            <w:noProof/>
-            <w:webHidden/>
-          </w:rPr>
           <w:fldChar w:fldCharType="separate"/>
-        </w:r>
-        <w:r>
-          <w:rPr>
-            <w:noProof/>
-            <w:webHidden/>
-          </w:rPr>
           <w:t>8</w:t>
-        </w:r>
-        <w:r>
-          <w:rPr>
-            <w:noProof/>
-            <w:webHidden/>
-          </w:rPr>
           <w:fldChar w:fldCharType="end"/>
         </w:r>
       </w:hyperlink>
@@ -1132,46 +859,10 @@
             <w:webHidden/>
           </w:rPr>
           <w:tab/>
-        </w:r>
-        <w:r>
-          <w:rPr>
-            <w:noProof/>
-            <w:webHidden/>
-          </w:rPr>
           <w:fldChar w:fldCharType="begin"/>
-        </w:r>
-        <w:r>
-          <w:rPr>
-            <w:noProof/>
-            <w:webHidden/>
-          </w:rPr>
           <w:instrText xml:space="preserve"> PAGEREF _Toc192620996 \h </w:instrText>
-        </w:r>
-        <w:r>
-          <w:rPr>
-            <w:noProof/>
-            <w:webHidden/>
-          </w:rPr>
-        </w:r>
-        <w:r>
-          <w:rPr>
-            <w:noProof/>
-            <w:webHidden/>
-          </w:rPr>
           <w:fldChar w:fldCharType="separate"/>
-        </w:r>
-        <w:r>
-          <w:rPr>
-            <w:noProof/>
-            <w:webHidden/>
-          </w:rPr>
           <w:t>8</w:t>
-        </w:r>
-        <w:r>
-          <w:rPr>
-            <w:noProof/>
-            <w:webHidden/>
-          </w:rPr>
           <w:fldChar w:fldCharType="end"/>
         </w:r>
       </w:hyperlink>
@@ -1225,46 +916,10 @@
             <w:webHidden/>
           </w:rPr>
           <w:tab/>
-        </w:r>
-        <w:r>
-          <w:rPr>
-            <w:noProof/>
-            <w:webHidden/>
-          </w:rPr>
           <w:fldChar w:fldCharType="begin"/>
-        </w:r>
-        <w:r>
-          <w:rPr>
-            <w:noProof/>
-            <w:webHidden/>
-          </w:rPr>
           <w:instrText xml:space="preserve"> PAGEREF _Toc192620997 \h </w:instrText>
-        </w:r>
-        <w:r>
-          <w:rPr>
-            <w:noProof/>
-            <w:webHidden/>
-          </w:rPr>
-        </w:r>
-        <w:r>
-          <w:rPr>
-            <w:noProof/>
-            <w:webHidden/>
-          </w:rPr>
           <w:fldChar w:fldCharType="separate"/>
-        </w:r>
-        <w:r>
-          <w:rPr>
-            <w:noProof/>
-            <w:webHidden/>
-          </w:rPr>
           <w:t>8</w:t>
-        </w:r>
-        <w:r>
-          <w:rPr>
-            <w:noProof/>
-            <w:webHidden/>
-          </w:rPr>
           <w:fldChar w:fldCharType="end"/>
         </w:r>
       </w:hyperlink>
@@ -1317,46 +972,10 @@
             <w:webHidden/>
           </w:rPr>
           <w:tab/>
-        </w:r>
-        <w:r>
-          <w:rPr>
-            <w:noProof/>
-            <w:webHidden/>
-          </w:rPr>
           <w:fldChar w:fldCharType="begin"/>
-        </w:r>
-        <w:r>
-          <w:rPr>
-            <w:noProof/>
-            <w:webHidden/>
-          </w:rPr>
           <w:instrText xml:space="preserve"> PAGEREF _Toc192620998 \h </w:instrText>
-        </w:r>
-        <w:r>
-          <w:rPr>
-            <w:noProof/>
-            <w:webHidden/>
-          </w:rPr>
-        </w:r>
-        <w:r>
-          <w:rPr>
-            <w:noProof/>
-            <w:webHidden/>
-          </w:rPr>
           <w:fldChar w:fldCharType="separate"/>
-        </w:r>
-        <w:r>
-          <w:rPr>
-            <w:noProof/>
-            <w:webHidden/>
-          </w:rPr>
           <w:t>10</w:t>
-        </w:r>
-        <w:r>
-          <w:rPr>
-            <w:noProof/>
-            <w:webHidden/>
-          </w:rPr>
           <w:fldChar w:fldCharType="end"/>
         </w:r>
       </w:hyperlink>
@@ -1410,46 +1029,10 @@
             <w:webHidden/>
           </w:rPr>
           <w:tab/>
-        </w:r>
-        <w:r>
-          <w:rPr>
-            <w:noProof/>
-            <w:webHidden/>
-          </w:rPr>
           <w:fldChar w:fldCharType="begin"/>
-        </w:r>
-        <w:r>
-          <w:rPr>
-            <w:noProof/>
-            <w:webHidden/>
-          </w:rPr>
           <w:instrText xml:space="preserve"> PAGEREF _Toc192620999 \h </w:instrText>
-        </w:r>
-        <w:r>
-          <w:rPr>
-            <w:noProof/>
-            <w:webHidden/>
-          </w:rPr>
-        </w:r>
-        <w:r>
-          <w:rPr>
-            <w:noProof/>
-            <w:webHidden/>
-          </w:rPr>
           <w:fldChar w:fldCharType="separate"/>
-        </w:r>
-        <w:r>
-          <w:rPr>
-            <w:noProof/>
-            <w:webHidden/>
-          </w:rPr>
           <w:t>10</w:t>
-        </w:r>
-        <w:r>
-          <w:rPr>
-            <w:noProof/>
-            <w:webHidden/>
-          </w:rPr>
           <w:fldChar w:fldCharType="end"/>
         </w:r>
       </w:hyperlink>
@@ -1502,46 +1085,10 @@
             <w:webHidden/>
           </w:rPr>
           <w:tab/>
-        </w:r>
-        <w:r>
-          <w:rPr>
-            <w:noProof/>
-            <w:webHidden/>
-          </w:rPr>
           <w:fldChar w:fldCharType="begin"/>
-        </w:r>
-        <w:r>
-          <w:rPr>
-            <w:noProof/>
-            <w:webHidden/>
-          </w:rPr>
           <w:instrText xml:space="preserve"> PAGEREF _Toc192621000 \h </w:instrText>
-        </w:r>
-        <w:r>
-          <w:rPr>
-            <w:noProof/>
-            <w:webHidden/>
-          </w:rPr>
-        </w:r>
-        <w:r>
-          <w:rPr>
-            <w:noProof/>
-            <w:webHidden/>
-          </w:rPr>
           <w:fldChar w:fldCharType="separate"/>
-        </w:r>
-        <w:r>
-          <w:rPr>
-            <w:noProof/>
-            <w:webHidden/>
-          </w:rPr>
           <w:t>13</w:t>
-        </w:r>
-        <w:r>
-          <w:rPr>
-            <w:noProof/>
-            <w:webHidden/>
-          </w:rPr>
           <w:fldChar w:fldCharType="end"/>
         </w:r>
       </w:hyperlink>
@@ -1576,46 +1123,10 @@
             <w:webHidden/>
           </w:rPr>
           <w:tab/>
-        </w:r>
-        <w:r>
-          <w:rPr>
-            <w:noProof/>
-            <w:webHidden/>
-          </w:rPr>
           <w:fldChar w:fldCharType="begin"/>
-        </w:r>
-        <w:r>
-          <w:rPr>
-            <w:noProof/>
-            <w:webHidden/>
-          </w:rPr>
           <w:instrText xml:space="preserve"> PAGEREF _Toc192621001 \h </w:instrText>
-        </w:r>
-        <w:r>
-          <w:rPr>
-            <w:noProof/>
-            <w:webHidden/>
-          </w:rPr>
-        </w:r>
-        <w:r>
-          <w:rPr>
-            <w:noProof/>
-            <w:webHidden/>
-          </w:rPr>
           <w:fldChar w:fldCharType="separate"/>
-        </w:r>
-        <w:r>
-          <w:rPr>
-            <w:noProof/>
-            <w:webHidden/>
-          </w:rPr>
           <w:t>14</w:t>
-        </w:r>
-        <w:r>
-          <w:rPr>
-            <w:noProof/>
-            <w:webHidden/>
-          </w:rPr>
           <w:fldChar w:fldCharType="end"/>
         </w:r>
       </w:hyperlink>
@@ -1650,46 +1161,10 @@
             <w:webHidden/>
           </w:rPr>
           <w:tab/>
-        </w:r>
-        <w:r>
-          <w:rPr>
-            <w:noProof/>
-            <w:webHidden/>
-          </w:rPr>
           <w:fldChar w:fldCharType="begin"/>
-        </w:r>
-        <w:r>
-          <w:rPr>
-            <w:noProof/>
-            <w:webHidden/>
-          </w:rPr>
           <w:instrText xml:space="preserve"> PAGEREF _Toc192621002 \h </w:instrText>
-        </w:r>
-        <w:r>
-          <w:rPr>
-            <w:noProof/>
-            <w:webHidden/>
-          </w:rPr>
-        </w:r>
-        <w:r>
-          <w:rPr>
-            <w:noProof/>
-            <w:webHidden/>
-          </w:rPr>
           <w:fldChar w:fldCharType="separate"/>
-        </w:r>
-        <w:r>
-          <w:rPr>
-            <w:noProof/>
-            <w:webHidden/>
-          </w:rPr>
           <w:t>15</w:t>
-        </w:r>
-        <w:r>
-          <w:rPr>
-            <w:noProof/>
-            <w:webHidden/>
-          </w:rPr>
           <w:fldChar w:fldCharType="end"/>
         </w:r>
       </w:hyperlink>
@@ -1724,46 +1199,10 @@
             <w:webHidden/>
           </w:rPr>
           <w:tab/>
-        </w:r>
-        <w:r>
-          <w:rPr>
-            <w:noProof/>
-            <w:webHidden/>
-          </w:rPr>
           <w:fldChar w:fldCharType="begin"/>
-        </w:r>
-        <w:r>
-          <w:rPr>
-            <w:noProof/>
-            <w:webHidden/>
-          </w:rPr>
           <w:instrText xml:space="preserve"> PAGEREF _Toc192621003 \h </w:instrText>
-        </w:r>
-        <w:r>
-          <w:rPr>
-            <w:noProof/>
-            <w:webHidden/>
-          </w:rPr>
-        </w:r>
-        <w:r>
-          <w:rPr>
-            <w:noProof/>
-            <w:webHidden/>
-          </w:rPr>
           <w:fldChar w:fldCharType="separate"/>
-        </w:r>
-        <w:r>
-          <w:rPr>
-            <w:noProof/>
-            <w:webHidden/>
-          </w:rPr>
           <w:t>16</w:t>
-        </w:r>
-        <w:r>
-          <w:rPr>
-            <w:noProof/>
-            <w:webHidden/>
-          </w:rPr>
           <w:fldChar w:fldCharType="end"/>
         </w:r>
       </w:hyperlink>
@@ -1798,46 +1237,10 @@
             <w:webHidden/>
           </w:rPr>
           <w:tab/>
-        </w:r>
-        <w:r>
-          <w:rPr>
-            <w:noProof/>
-            <w:webHidden/>
-          </w:rPr>
           <w:fldChar w:fldCharType="begin"/>
-        </w:r>
-        <w:r>
-          <w:rPr>
-            <w:noProof/>
-            <w:webHidden/>
-          </w:rPr>
           <w:instrText xml:space="preserve"> PAGEREF _Toc192621004 \h </w:instrText>
-        </w:r>
-        <w:r>
-          <w:rPr>
-            <w:noProof/>
-            <w:webHidden/>
-          </w:rPr>
-        </w:r>
-        <w:r>
-          <w:rPr>
-            <w:noProof/>
-            <w:webHidden/>
-          </w:rPr>
           <w:fldChar w:fldCharType="separate"/>
-        </w:r>
-        <w:r>
-          <w:rPr>
-            <w:noProof/>
-            <w:webHidden/>
-          </w:rPr>
           <w:t>17</w:t>
-        </w:r>
-        <w:r>
-          <w:rPr>
-            <w:noProof/>
-            <w:webHidden/>
-          </w:rPr>
           <w:fldChar w:fldCharType="end"/>
         </w:r>
       </w:hyperlink>
@@ -1872,46 +1275,10 @@
             <w:webHidden/>
           </w:rPr>
           <w:tab/>
-        </w:r>
-        <w:r>
-          <w:rPr>
-            <w:noProof/>
-            <w:webHidden/>
-          </w:rPr>
           <w:fldChar w:fldCharType="begin"/>
-        </w:r>
-        <w:r>
-          <w:rPr>
-            <w:noProof/>
-            <w:webHidden/>
-          </w:rPr>
           <w:instrText xml:space="preserve"> PAGEREF _Toc192621005 \h </w:instrText>
-        </w:r>
-        <w:r>
-          <w:rPr>
-            <w:noProof/>
-            <w:webHidden/>
-          </w:rPr>
-        </w:r>
-        <w:r>
-          <w:rPr>
-            <w:noProof/>
-            <w:webHidden/>
-          </w:rPr>
           <w:fldChar w:fldCharType="separate"/>
-        </w:r>
-        <w:r>
-          <w:rPr>
-            <w:noProof/>
-            <w:webHidden/>
-          </w:rPr>
           <w:t>18</w:t>
-        </w:r>
-        <w:r>
-          <w:rPr>
-            <w:noProof/>
-            <w:webHidden/>
-          </w:rPr>
           <w:fldChar w:fldCharType="end"/>
         </w:r>
       </w:hyperlink>
@@ -2072,12 +1439,6 @@
           <w:highlight w:val="yellow"/>
         </w:rPr>
         <w:t xml:space="preserve">Diante deste cenário, o objetivo desta pesquisa é desenvolver um sistema computacional de monitoramento de temperatura e umidade que possa contribuir para o </w:t>
-      </w:r>
-      <w:r>
-        <w:rPr>
-          <w:rFonts w:ascii="Arial" w:hAnsi="Arial" w:cs="Arial"/>
-          <w:highlight w:val="yellow"/>
-        </w:rPr>
         <w:lastRenderedPageBreak/>
         <w:t>controle do ambiente, como por exemplo uma estufa, e prevenir problemas causados por alterações inadequadas dessas condições.</w:t>
       </w:r>
@@ -2243,12 +1604,6 @@
           <w:highlight w:val="yellow"/>
         </w:rPr>
         <w:t xml:space="preserve">Para desenvolver essa pesquisa, foi utilizada uma abordagem baseada em pesquisa bibliográfica e aplicação prática, envolvendo conceitos de Engenharia de Software e Desenvolvimento de Sistemas, com caráter exploratório e qualitativo, uma vez que o foco esteve no desenvolvimento de uma solução tecnológica baseada em necessidades reais de controle ambiental. No ambiente de desenvolvimento de software, foi utilizado o Visual Studio </w:t>
-      </w:r>
-      <w:r>
-        <w:rPr>
-          <w:rFonts w:ascii="Arial" w:hAnsi="Arial" w:cs="Arial"/>
-          <w:highlight w:val="yellow"/>
-        </w:rPr>
         <w:lastRenderedPageBreak/>
         <w:t>Code (VS Code) como editor de código principal, com o back-end desenvolvido em Node.js e Express.js e o front-end em React, seguindo uma arquitetura cliente-servidor com comunicação via API REST. Para o armazenamento dos dados coletados, foi utilizado o banco de dados relacional PostgreSQL, gerenciado por meio do ORM Prisma, responsável por armazenar o histórico das medições de temperatura e umidade, as configurações de cada usuário e os alertas gerados, permitindo consultas e geração de relatórios.</w:t>
       </w:r>
@@ -2323,12 +1678,6 @@
           <w:highlight w:val="yellow"/>
         </w:rPr>
         <w:t xml:space="preserve">Além disso, o desenvolvimento contou com o apoio de uma ferramenta de inteligência artificial (Claude, da Anthropic, na variante Claude Code, um assistente de programação baseado em agentes) como recurso auxiliar ao longo de todas as etapas do projeto. A ferramenta foi utilizada na geração e revisão de código do back-end, do front-end e do firmware do ESP32; na elaboração da documentação técnica (arquitetura, integração, segurança e documentação técnica consolidada); na escrita e execução de testes automatizados de back-end com Jest e Supertest; e na verificação manual de fluxos de ponta a ponta em navegador real (login, cadastro de dispositivos, geração de alertas, filtros de histórico, entre outros), sem uma suíte automatizada dedicada no front-end. A IA também </w:t>
-      </w:r>
-      <w:r>
-        <w:rPr>
-          <w:rFonts w:ascii="Arial" w:hAnsi="Arial" w:cs="Arial"/>
-          <w:highlight w:val="yellow"/>
-        </w:rPr>
         <w:lastRenderedPageBreak/>
         <w:t>apoiou a depuração de erros durante a configuração do ambiente de desenvolvimento local (banco de dados, variáveis de ambiente, política de execução do PowerShell) e a correção iterativa de problemas identificados durante o uso prático do sistema — como uma falha na leitura de valores decimais digitados com vírgula, o ajuste do intervalo de leituras automáticas do firmware e a reformulação da tela de notificações para separá-las por dispositivo.</w:t>
       </w:r>
@@ -2585,14 +1934,11 @@
     </w:p>
     <w:p>
       <w:pPr>
-        <w:pStyle w:val="Ttulo1"/>
-      </w:pPr>
-      <w:bookmarkStart w:id="7" w:name="_Toc192621000"/>
-      <w:r>
-        <w:lastRenderedPageBreak/>
-        <w:t>Considerações finais</w:t>
-      </w:r>
-      <w:bookmarkEnd w:id="7"/>
+        <w:pStyle w:val="Ttulo2"/>
+      </w:pPr>
+      <w:r>
+        <w:t>Arquitetura do Sistema</w:t>
+      </w:r>
     </w:p>
     <w:p>
       <w:pPr>
@@ -2611,17 +1957,19 @@
           <w:szCs w:val="24"/>
           <w:lang w:eastAsia="pt-BR"/>
         </w:rPr>
-        <w:t xml:space="preserve">O desenvolvimento deste trabalho demonstrou a importância do monitoramento de temperatura e umidade para o controle das condições ambientais. A integração entre o ESP32, os sensores e o banco de dados </w:t>
-      </w:r>
-      <w:r>
+        <w:t xml:space="preserve">O sistema foi estruturado em três camadas independentes, que se comunicam exclusivamente por meio de requisições HTTP/HTTPS: o firmware do microcontrolador ESP32, responsável pela leitura do sensor e pelo envio periódico das medições; o back-end, uma API REST desenvolvida em Node.js e Express, responsável por autenticar as requisições, validar os dados recebidos, aplicar as regras de negócio e persistir as informações no banco de dados PostgreSQL por meio do ORM Prisma; e o front-end, uma aplicação de página única desenvolvida em React, que consome a mesma API REST para exibir o painel ao usuário.</w:t>
+      </w:r>
+    </w:p>
+    <w:p>
+      <w:pPr>
+        <w:spacing w:before="100" w:beforeAutospacing="1" w:after="100" w:afterAutospacing="1" w:line="240" w:lineRule="auto"/>
         <w:rPr>
           <w:rFonts w:ascii="Arial" w:eastAsia="Times New Roman" w:hAnsi="Arial" w:cs="Arial"/>
           <w:sz w:val="24"/>
           <w:szCs w:val="24"/>
           <w:lang w:eastAsia="pt-BR"/>
         </w:rPr>
-        <w:t>Post</w:t>
-      </w:r>
+      </w:pPr>
       <w:r>
         <w:rPr>
           <w:rFonts w:ascii="Arial" w:eastAsia="Times New Roman" w:hAnsi="Arial" w:cs="Arial"/>
@@ -2629,55 +1977,289 @@
           <w:szCs w:val="24"/>
           <w:lang w:eastAsia="pt-BR"/>
         </w:rPr>
-        <w:t>gre</w:t>
-      </w:r>
-      <w:r>
+        <w:t xml:space="preserve">Essa separação garante que nenhum dos dois clientes — o ESP32 e o navegador — acesse o banco de dados diretamente, centralizando toda a lógica de negócio no back-end. O ESP32 se autentica perante a API por meio de um identificador de dispositivo e de um token secreto, enviado no cabeçalho HTTP "X-Device-Key" — um mecanismo independente da autenticação de usuário, já que o microcontrolador não realiza login interativo. Já o navegador se autentica por meio de uma sessão de usuário, mantida por um token JWT armazenado em um cookie do tipo httpOnly, inacessível a código JavaScript executado na página.</w:t>
+      </w:r>
+    </w:p>
+    <w:p>
+      <w:pPr>
+        <w:pStyle w:val="Ttulo2"/>
+      </w:pPr>
+      <w:r>
+        <w:t>Modelagem do Banco de Dados</w:t>
+      </w:r>
+    </w:p>
+    <w:p>
+      <w:pPr>
+        <w:spacing w:before="100" w:beforeAutospacing="1" w:after="100" w:afterAutospacing="1" w:line="240" w:lineRule="auto"/>
         <w:rPr>
           <w:rFonts w:ascii="Arial" w:eastAsia="Times New Roman" w:hAnsi="Arial" w:cs="Arial"/>
           <w:sz w:val="24"/>
           <w:szCs w:val="24"/>
           <w:lang w:eastAsia="pt-BR"/>
         </w:rPr>
-        <w:t>SQL possibilitou a coleta, o armazenamento e a visualização das informações.</w:t>
-      </w:r>
-    </w:p>
-    <w:p>
-      <w:pPr>
-        <w:spacing w:before="100" w:beforeAutospacing="1" w:after="100" w:afterAutospacing="1" w:line="240" w:lineRule="auto"/>
+      </w:pPr>
+      <w:r>
         <w:rPr>
           <w:rFonts w:ascii="Arial" w:eastAsia="Times New Roman" w:hAnsi="Arial" w:cs="Arial"/>
           <w:sz w:val="24"/>
           <w:szCs w:val="24"/>
           <w:lang w:eastAsia="pt-BR"/>
         </w:rPr>
-      </w:pPr>
-      <w:r>
+        <w:t xml:space="preserve">O esquema do banco de dados foi definido por meio do Prisma, a partir do qual são geradas as migrations aplicadas ao PostgreSQL. O modelo de dados é composto por cinco entidades principais: usuários, com nome, e-mail, hash da senha e dados de recuperação de conta; dispositivos, cada um representando um ESP32 cadastrado por um usuário, com identificador público e hash do token de autenticação; medições, com a temperatura, a umidade e o horário de cada leitura registrada; configurações, com a faixa aceitável de temperatura e umidade definida por cada usuário; e alertas, que representam os eventos de anomalia.</w:t>
+      </w:r>
+    </w:p>
+    <w:p>
+      <w:pPr>
+        <w:spacing w:before="100" w:beforeAutospacing="1" w:after="100" w:afterAutospacing="1" w:line="240" w:lineRule="auto"/>
         <w:rPr>
           <w:rFonts w:ascii="Arial" w:eastAsia="Times New Roman" w:hAnsi="Arial" w:cs="Arial"/>
           <w:sz w:val="24"/>
           <w:szCs w:val="24"/>
           <w:lang w:eastAsia="pt-BR"/>
         </w:rPr>
-        <w:t>Os objetivos propostos foram alcançados por meio da pesquisa e da aplicação prática dos conhecimentos relacionados à Internet das Coisas e ao desenvolvimento de sistemas. O protótipo apresentou uma solução simples e funcional para o acompanhamento das condições do ambiente.</w:t>
-      </w:r>
-    </w:p>
-    <w:p>
-      <w:pPr>
-        <w:spacing w:before="100" w:beforeAutospacing="1" w:after="100" w:afterAutospacing="1" w:line="240" w:lineRule="auto"/>
+      </w:pPr>
+      <w:r>
         <w:rPr>
           <w:rFonts w:ascii="Arial" w:eastAsia="Times New Roman" w:hAnsi="Arial" w:cs="Arial"/>
           <w:sz w:val="24"/>
           <w:szCs w:val="24"/>
           <w:lang w:eastAsia="pt-BR"/>
         </w:rPr>
-      </w:pPr>
-      <w:r>
+        <w:t xml:space="preserve">Uma decisão de modelagem relevante do sistema é o tratamento dos alertas como eventos, e não como um registro por leitura fora da faixa. Quando uma medição chega fora dos limites configurados, o sistema verifica se já existe um alerta ativo para aquele dispositivo e variável: em caso positivo, apenas o valor de pico do alerta é atualizado; em caso negativo, um novo alerta é aberto. Quando uma leitura subsequente retorna à faixa normal, o alerta ativo é encerrado. Esse mecanismo evita que uma sequência de leituras consecutivas fora da faixa gere uma notificação repetida a cada leitura, produzindo, em vez disso, um único evento com início e fim bem definidos.</w:t>
+      </w:r>
+    </w:p>
+    <w:p>
+      <w:pPr>
+        <w:pStyle w:val="Ttulo2"/>
+      </w:pPr>
+      <w:r>
+        <w:t>Desenvolvimento do Back-end</w:t>
+      </w:r>
+    </w:p>
+    <w:p>
+      <w:pPr>
+        <w:spacing w:before="100" w:beforeAutospacing="1" w:after="100" w:afterAutospacing="1" w:line="240" w:lineRule="auto"/>
         <w:rPr>
           <w:rFonts w:ascii="Arial" w:eastAsia="Times New Roman" w:hAnsi="Arial" w:cs="Arial"/>
           <w:sz w:val="24"/>
           <w:szCs w:val="24"/>
           <w:lang w:eastAsia="pt-BR"/>
         </w:rPr>
+      </w:pPr>
+      <w:r>
+        <w:rPr>
+          <w:rFonts w:ascii="Arial" w:eastAsia="Times New Roman" w:hAnsi="Arial" w:cs="Arial"/>
+          <w:sz w:val="24"/>
+          <w:szCs w:val="24"/>
+          <w:lang w:eastAsia="pt-BR"/>
+        </w:rPr>
+        <w:t xml:space="preserve">O back-end foi organizado em módulos por área de funcionalidade — autenticação, usuários, dispositivos, medições, configurações, alertas e histórico —, cada um dividido em três camadas: rotas, responsáveis por interpretar a requisição HTTP; validação, responsável por conferir o formato dos dados recebidos antes de qualquer processamento; e regra de negócio, responsável pela lógica de fato e pelo acesso ao banco de dados por meio do Prisma.</w:t>
+      </w:r>
+    </w:p>
+    <w:p>
+      <w:pPr>
+        <w:spacing w:before="100" w:beforeAutospacing="1" w:after="100" w:afterAutospacing="1" w:line="240" w:lineRule="auto"/>
+        <w:rPr>
+          <w:rFonts w:ascii="Arial" w:eastAsia="Times New Roman" w:hAnsi="Arial" w:cs="Arial"/>
+          <w:sz w:val="24"/>
+          <w:szCs w:val="24"/>
+          <w:lang w:eastAsia="pt-BR"/>
+        </w:rPr>
+      </w:pPr>
+      <w:r>
+        <w:rPr>
+          <w:rFonts w:ascii="Arial" w:eastAsia="Times New Roman" w:hAnsi="Arial" w:cs="Arial"/>
+          <w:sz w:val="24"/>
+          <w:szCs w:val="24"/>
+          <w:lang w:eastAsia="pt-BR"/>
+        </w:rPr>
+        <w:t xml:space="preserve">A senha do usuário nunca é armazenada em texto legível, sendo transformada por uma função de hash (bcrypt) antes de ser gravada no banco de dados. Após o login, uma sessão é mantida por um token JWT com validade de sete dias, entregue em um cookie httpOnly. Dispositivos ESP32, por sua vez, autenticam-se por um token de acesso gerado no momento do cadastro, exibido em texto puro uma única vez e, a partir de então, armazenado apenas em forma de hash. Como medidas adicionais de segurança, o sistema aplica limitação de taxa de requisições nas rotas de autenticação e de envio de medições, cabeçalhos HTTP de segurança e validação de todo dado de entrada antes que ele chegue à camada de regra de negócio.</w:t>
+      </w:r>
+    </w:p>
+    <w:p>
+      <w:pPr>
+        <w:spacing w:before="100" w:beforeAutospacing="1" w:after="100" w:afterAutospacing="1" w:line="240" w:lineRule="auto"/>
+        <w:rPr>
+          <w:rFonts w:ascii="Arial" w:eastAsia="Times New Roman" w:hAnsi="Arial" w:cs="Arial"/>
+          <w:sz w:val="24"/>
+          <w:szCs w:val="24"/>
+          <w:lang w:eastAsia="pt-BR"/>
+        </w:rPr>
+      </w:pPr>
+      <w:r>
+        <w:rPr>
+          <w:rFonts w:ascii="Arial" w:eastAsia="Times New Roman" w:hAnsi="Arial" w:cs="Arial"/>
+          <w:sz w:val="24"/>
+          <w:szCs w:val="24"/>
+          <w:lang w:eastAsia="pt-BR"/>
+        </w:rPr>
+        <w:t xml:space="preserve">A funcionalidade de geração de alertas foi implementada como uma rotina executada após o registro de cada nova medição, real ou simulada. Essa rotina calcula, a partir das configurações do usuário, a faixa aceitável de cada variável e decide entre abrir um novo evento, atualizar o valor de pico de um evento já em andamento, ou encerrar o evento quando o valor retorna à faixa normal.</w:t>
+      </w:r>
+    </w:p>
+    <w:p>
+      <w:pPr>
+        <w:pStyle w:val="Ttulo2"/>
+      </w:pPr>
+      <w:r>
+        <w:t>Desenvolvimento do Firmware do ESP32</w:t>
+      </w:r>
+    </w:p>
+    <w:p>
+      <w:pPr>
+        <w:spacing w:before="100" w:beforeAutospacing="1" w:after="100" w:afterAutospacing="1" w:line="240" w:lineRule="auto"/>
+        <w:rPr>
+          <w:rFonts w:ascii="Arial" w:eastAsia="Times New Roman" w:hAnsi="Arial" w:cs="Arial"/>
+          <w:sz w:val="24"/>
+          <w:szCs w:val="24"/>
+          <w:lang w:eastAsia="pt-BR"/>
+        </w:rPr>
+      </w:pPr>
+      <w:r>
+        <w:rPr>
+          <w:rFonts w:ascii="Arial" w:eastAsia="Times New Roman" w:hAnsi="Arial" w:cs="Arial"/>
+          <w:sz w:val="24"/>
+          <w:szCs w:val="24"/>
+          <w:lang w:eastAsia="pt-BR"/>
+        </w:rPr>
+        <w:t xml:space="preserve">O firmware do ESP32 foi desenvolvido em C++ na IDE Arduino, sendo responsável por conectar o microcontrolador à rede Wi-Fi, sincronizar o relógio interno por meio do protocolo NTP, realizar a leitura periódica do sensor DHT11 e enviar cada leitura válida à API por meio de uma requisição HTTP POST. A leitura do sensor foi isolada em um módulo próprio, de modo que a substituição do modelo de sensor no futuro exija alterações apenas nesse módulo, sem impacto no restante do firmware.</w:t>
+      </w:r>
+    </w:p>
+    <w:p>
+      <w:pPr>
+        <w:spacing w:before="100" w:beforeAutospacing="1" w:after="100" w:afterAutospacing="1" w:line="240" w:lineRule="auto"/>
+        <w:rPr>
+          <w:rFonts w:ascii="Arial" w:eastAsia="Times New Roman" w:hAnsi="Arial" w:cs="Arial"/>
+          <w:sz w:val="24"/>
+          <w:szCs w:val="24"/>
+          <w:lang w:eastAsia="pt-BR"/>
+        </w:rPr>
+      </w:pPr>
+      <w:r>
+        <w:rPr>
+          <w:rFonts w:ascii="Arial" w:eastAsia="Times New Roman" w:hAnsi="Arial" w:cs="Arial"/>
+          <w:sz w:val="24"/>
+          <w:szCs w:val="24"/>
+          <w:lang w:eastAsia="pt-BR"/>
+        </w:rPr>
+        <w:t xml:space="preserve">O firmware foi projetado para não interromper sua execução em caso de falhas transitórias: a perda de conexão Wi-Fi é detectada a cada iteração do laço principal do programa e uma nova tentativa de conexão é realizada periodicamente, sem bloquear a leitura do sensor; da mesma forma, uma falha ao sincronizar o relógio via NTP não impede o envio da leitura — nesse caso, o campo de data e hora é omitido, e o servidor utiliza o horário de recebimento da requisição como substituto. O firmware também já contempla o envio de dados por HTTPS, o que permite apontá-lo para um servidor remoto sem qualquer alteração de código, apenas de configuração.</w:t>
+      </w:r>
+    </w:p>
+    <w:p>
+      <w:pPr>
+        <w:pStyle w:val="Ttulo2"/>
+      </w:pPr>
+      <w:r>
+        <w:t>Desenvolvimento do Front-end</w:t>
+      </w:r>
+    </w:p>
+    <w:p>
+      <w:pPr>
+        <w:spacing w:before="100" w:beforeAutospacing="1" w:after="100" w:afterAutospacing="1" w:line="240" w:lineRule="auto"/>
+        <w:rPr>
+          <w:rFonts w:ascii="Arial" w:eastAsia="Times New Roman" w:hAnsi="Arial" w:cs="Arial"/>
+          <w:sz w:val="24"/>
+          <w:szCs w:val="24"/>
+          <w:lang w:eastAsia="pt-BR"/>
+        </w:rPr>
+      </w:pPr>
+      <w:r>
+        <w:rPr>
+          <w:rFonts w:ascii="Arial" w:eastAsia="Times New Roman" w:hAnsi="Arial" w:cs="Arial"/>
+          <w:sz w:val="24"/>
+          <w:szCs w:val="24"/>
+          <w:lang w:eastAsia="pt-BR"/>
+        </w:rPr>
+        <w:t xml:space="preserve">A interface do usuário foi desenvolvida como uma aplicação de página única em React, consumindo a API REST do back-end por meio de requisições HTTP autenticadas por cookie de sessão. O painel principal (Dashboard) exibe a última leitura de temperatura e umidade do dispositivo selecionado, o status de comunicação do dispositivo e gráficos de linha com o histórico de leituras no período selecionado, atualizados por sondagem periódica a cada dez segundos. Quando o usuário possui mais de um dispositivo cadastrado, o Dashboard exibe um seletor para trocar entre eles e um resumo compacto dos demais dispositivos, cada um com seu próprio indicador de status e contagem de notificações pendentes.</w:t>
+      </w:r>
+    </w:p>
+    <w:p>
+      <w:pPr>
+        <w:spacing w:before="100" w:beforeAutospacing="1" w:after="100" w:afterAutospacing="1" w:line="240" w:lineRule="auto"/>
+        <w:rPr>
+          <w:rFonts w:ascii="Arial" w:eastAsia="Times New Roman" w:hAnsi="Arial" w:cs="Arial"/>
+          <w:sz w:val="24"/>
+          <w:szCs w:val="24"/>
+          <w:lang w:eastAsia="pt-BR"/>
+        </w:rPr>
+      </w:pPr>
+      <w:r>
+        <w:rPr>
+          <w:rFonts w:ascii="Arial" w:eastAsia="Times New Roman" w:hAnsi="Arial" w:cs="Arial"/>
+          <w:sz w:val="24"/>
+          <w:szCs w:val="24"/>
+          <w:lang w:eastAsia="pt-BR"/>
+        </w:rPr>
+        <w:t xml:space="preserve">A tela de histórico apresenta uma tabela paginada com todas as medições registradas, permitindo filtrar por dispositivo, período, faixa de valores e situação de cada variável, além de ordenar os resultados e exportar os dados filtrados em formato CSV. A tela de notificações reúne o histórico de alertas gerados pelo sistema, agrupados por dispositivo em abas quando há mais de um cadastrado, cada aba exibindo sua própria contagem de notificações não visualizadas. As telas de configurações, dispositivos e perfil completam a interface, permitindo, respectivamente, ajustar os limites de temperatura e umidade, gerenciar os dispositivos ESP32 do usuário e administrar os dados da conta.</w:t>
+      </w:r>
+    </w:p>
+    <w:p>
+      <w:pPr>
+        <w:pStyle w:val="Ttulo1"/>
+      </w:pPr>
+      <w:bookmarkStart w:id="7" w:name="_Toc192621000"/>
+      <w:r>
+        <w:lastRenderedPageBreak/>
+        <w:t>Considerações finais</w:t>
+      </w:r>
+      <w:bookmarkEnd w:id="7"/>
+    </w:p>
+    <w:p>
+      <w:pPr>
+        <w:spacing w:before="100" w:beforeAutospacing="1" w:after="100" w:afterAutospacing="1" w:line="240" w:lineRule="auto"/>
+        <w:rPr>
+          <w:rFonts w:ascii="Arial" w:eastAsia="Times New Roman" w:hAnsi="Arial" w:cs="Arial"/>
+          <w:sz w:val="24"/>
+          <w:szCs w:val="24"/>
+          <w:lang w:eastAsia="pt-BR"/>
+        </w:rPr>
+      </w:pPr>
+      <w:r>
+        <w:rPr>
+          <w:rFonts w:ascii="Arial" w:eastAsia="Times New Roman" w:hAnsi="Arial" w:cs="Arial"/>
+          <w:sz w:val="24"/>
+          <w:szCs w:val="24"/>
+          <w:lang w:eastAsia="pt-BR"/>
+        </w:rPr>
+        <w:t xml:space="preserve">O desenvolvimento deste trabalho demonstrou a importância do monitoramento de temperatura e umidade para o controle das condições ambientais. A integração entre o ESP32, os sensores e o banco de dados PostgreSQL possibilitou a coleta, o armazenamento e a visualização das informações.</w:t>
+      </w:r>
+    </w:p>
+    <w:p>
+      <w:pPr>
+        <w:spacing w:before="100" w:beforeAutospacing="1" w:after="100" w:afterAutospacing="1" w:line="240" w:lineRule="auto"/>
+        <w:rPr>
+          <w:rFonts w:ascii="Arial" w:eastAsia="Times New Roman" w:hAnsi="Arial" w:cs="Arial"/>
+          <w:sz w:val="24"/>
+          <w:szCs w:val="24"/>
+          <w:lang w:eastAsia="pt-BR"/>
+        </w:rPr>
+      </w:pPr>
+      <w:r>
+        <w:rPr>
+          <w:rFonts w:ascii="Arial" w:eastAsia="Times New Roman" w:hAnsi="Arial" w:cs="Arial"/>
+          <w:sz w:val="24"/>
+          <w:szCs w:val="24"/>
+          <w:lang w:eastAsia="pt-BR"/>
+        </w:rPr>
+        <w:t>Os objetivos propostos foram alcançados por meio da pesquisa e da aplicação prática dos conhecimentos relacionados à Internet das Coisas e ao desenvolvimento de sistemas. O protótipo apresentou uma solução simples e funcional para o acompanhamento das condições do ambiente.</w:t>
+      </w:r>
+    </w:p>
+    <w:p>
+      <w:pPr>
+        <w:spacing w:before="100" w:beforeAutospacing="1" w:after="100" w:afterAutospacing="1" w:line="240" w:lineRule="auto"/>
+        <w:rPr>
+          <w:rFonts w:ascii="Arial" w:eastAsia="Times New Roman" w:hAnsi="Arial" w:cs="Arial"/>
+          <w:sz w:val="24"/>
+          <w:szCs w:val="24"/>
+          <w:lang w:eastAsia="pt-BR"/>
+        </w:rPr>
+      </w:pPr>
+      <w:r>
+        <w:rPr>
+          <w:rFonts w:ascii="Arial" w:eastAsia="Times New Roman" w:hAnsi="Arial" w:cs="Arial"/>
+          <w:sz w:val="24"/>
+          <w:szCs w:val="24"/>
+          <w:lang w:eastAsia="pt-BR"/>
+        </w:rPr>
         <w:t>Como melhorias futuras, o sistema poderá contar com alertas, gráficos e relatórios mais detalhados, ampliando sua utilidade e eficiência no monitoramento ambiental.</w:t>
       </w:r>
     </w:p>
@@ -2716,25 +2298,7 @@
         <w:rPr>
           <w:highlight w:val="yellow"/>
         </w:rPr>
-        <w:t>ASHTON</w:t>
-      </w:r>
-      <w:r>
-        <w:rPr>
-          <w:highlight w:val="yellow"/>
-        </w:rPr>
-        <w:t>, K</w:t>
-      </w:r>
-      <w:r>
-        <w:rPr>
-          <w:highlight w:val="yellow"/>
-        </w:rPr>
-        <w:t>.</w:t>
-      </w:r>
-      <w:r>
-        <w:rPr>
-          <w:highlight w:val="yellow"/>
-        </w:rPr>
-        <w:t xml:space="preserve">  </w:t>
+        <w:t xml:space="preserve">ASHTON, K.  </w:t>
       </w:r>
       <w:r>
         <w:rPr>
@@ -2748,55 +2312,7 @@
         <w:rPr>
           <w:highlight w:val="yellow"/>
         </w:rPr>
-        <w:t xml:space="preserve"> RFID Journal</w:t>
-      </w:r>
-      <w:r>
-        <w:rPr>
-          <w:highlight w:val="yellow"/>
-        </w:rPr>
-        <w:t xml:space="preserve"> (2009)</w:t>
-      </w:r>
-      <w:r>
-        <w:rPr>
-          <w:highlight w:val="yellow"/>
-        </w:rPr>
-        <w:t>. Disponível em: &lt;</w:t>
-      </w:r>
-      <w:r>
-        <w:rPr>
-          <w:highlight w:val="yellow"/>
-        </w:rPr>
-        <w:t>https://www.rfidjournal.com/expert-views/that-internet-of-things-thing/73881/</w:t>
-      </w:r>
-      <w:r>
-        <w:rPr>
-          <w:highlight w:val="yellow"/>
-        </w:rPr>
-        <w:t>&gt;. Acesso em</w:t>
-      </w:r>
-      <w:r>
-        <w:rPr>
-          <w:highlight w:val="yellow"/>
-        </w:rPr>
-        <w:t xml:space="preserve">: 19 </w:t>
-      </w:r>
-      <w:r>
-        <w:rPr>
-          <w:highlight w:val="yellow"/>
-        </w:rPr>
-        <w:t>m</w:t>
-      </w:r>
-      <w:r>
-        <w:rPr>
-          <w:highlight w:val="yellow"/>
-        </w:rPr>
-        <w:t>ai 2026</w:t>
-      </w:r>
-      <w:r>
-        <w:rPr>
-          <w:highlight w:val="yellow"/>
-        </w:rPr>
-        <w:t>.</w:t>
+        <w:t xml:space="preserve"> RFID Journal (2009). Disponível em: &lt;https://www.rfidjournal.com/expert-views/that-internet-of-things-thing/73881/&gt;. Acesso em: 19 mai 2026.</w:t>
       </w:r>
     </w:p>
     <w:p>
@@ -2810,19 +2326,7 @@
         <w:rPr>
           <w:highlight w:val="yellow"/>
         </w:rPr>
-        <w:t>KAMIENSKI,</w:t>
-      </w:r>
-      <w:r>
-        <w:rPr>
-          <w:highlight w:val="yellow"/>
-        </w:rPr>
-        <w:t xml:space="preserve"> </w:t>
-      </w:r>
-      <w:r>
-        <w:rPr>
-          <w:highlight w:val="yellow"/>
-        </w:rPr>
-        <w:t xml:space="preserve">C.; SOININEN, J. P.; TAUMBERGER, M.; DANTAS, R.; TOSCANO, A.; CINOTTI, T. S.; MAIA, R. F.; TORRE NETO, A. (2019) </w:t>
+        <w:t xml:space="preserve">KAMIENSKI, C.; SOININEN, J. P.; TAUMBERGER, M.; DANTAS, R.; TOSCANO, A.; CINOTTI, T. S.; MAIA, R. F.; TORRE NETO, A. (2019) </w:t>
       </w:r>
       <w:r>
         <w:rPr>
@@ -2836,43 +2340,7 @@
         <w:rPr>
           <w:highlight w:val="yellow"/>
         </w:rPr>
-        <w:t>. Disponível em: &lt;</w:t>
-      </w:r>
-      <w:r>
-        <w:rPr>
-          <w:highlight w:val="yellow"/>
-        </w:rPr>
-        <w:t>https://www.mdpi.com/1424-8220/19/2/276</w:t>
-      </w:r>
-      <w:r>
-        <w:rPr>
-          <w:highlight w:val="yellow"/>
-        </w:rPr>
-        <w:t xml:space="preserve">&gt;. Acesso em: </w:t>
-      </w:r>
-      <w:r>
-        <w:rPr>
-          <w:highlight w:val="yellow"/>
-        </w:rPr>
-        <w:t xml:space="preserve">20 </w:t>
-      </w:r>
-      <w:r>
-        <w:rPr>
-          <w:highlight w:val="yellow"/>
-        </w:rPr>
-        <w:t>a</w:t>
-      </w:r>
-      <w:r>
-        <w:rPr>
-          <w:highlight w:val="yellow"/>
-        </w:rPr>
-        <w:t>go 2026</w:t>
-      </w:r>
-      <w:r>
-        <w:rPr>
-          <w:highlight w:val="yellow"/>
-        </w:rPr>
-        <w:t>.</w:t>
+        <w:t xml:space="preserve">. Disponível em: &lt;https://www.mdpi.com/1424-8220/19/2/276&gt;. Acesso em: 20 ago 2026.</w:t>
       </w:r>
     </w:p>
     <w:p>
@@ -2900,43 +2368,7 @@
         <w:rPr>
           <w:highlight w:val="yellow"/>
         </w:rPr>
-        <w:t xml:space="preserve"> — CERP IoT. Disponível em: &lt;</w:t>
-      </w:r>
-      <w:r>
-        <w:rPr>
-          <w:highlight w:val="yellow"/>
-        </w:rPr>
-        <w:t xml:space="preserve"> https://www.researchgate.net/publication/228664767_Vision_and_Challenges_for_Realizing_the_Internet_of_Things </w:t>
-      </w:r>
-      <w:r>
-        <w:rPr>
-          <w:highlight w:val="yellow"/>
-        </w:rPr>
-        <w:t xml:space="preserve">&gt;. Acesso em: </w:t>
-      </w:r>
-      <w:r>
-        <w:rPr>
-          <w:highlight w:val="yellow"/>
-        </w:rPr>
-        <w:t xml:space="preserve">18 </w:t>
-      </w:r>
-      <w:r>
-        <w:rPr>
-          <w:highlight w:val="yellow"/>
-        </w:rPr>
-        <w:t>a</w:t>
-      </w:r>
-      <w:r>
-        <w:rPr>
-          <w:highlight w:val="yellow"/>
-        </w:rPr>
-        <w:t>go 2026</w:t>
-      </w:r>
-      <w:r>
-        <w:rPr>
-          <w:highlight w:val="yellow"/>
-        </w:rPr>
-        <w:t>.</w:t>
+        <w:t xml:space="preserve"> — CERP IoT. Disponível em: &lt; https://www.researchgate.net/publication/228664767_Vision_and_Challenges_for_Realizing_the_Internet_of_Things &gt;. Acesso em: 18 ago 2026.</w:t>
       </w:r>
     </w:p>
     <w:p>
@@ -2955,13 +2387,7 @@
         <w:rPr>
           <w:highlight w:val="yellow"/>
         </w:rPr>
-        <w:t>WOLFERT</w:t>
-      </w:r>
-      <w:r>
-        <w:rPr>
-          <w:highlight w:val="yellow"/>
-        </w:rPr>
-        <w:t xml:space="preserve">, S., Ge, L., Verdouw, C., &amp; Bogaardt, M. J. (2017) </w:t>
+        <w:t xml:space="preserve">WOLFERT, S., Ge, L., Verdouw, C., &amp; Bogaardt, M. J. (2017) </w:t>
       </w:r>
       <w:r>
         <w:rPr>
@@ -2969,81 +2395,13 @@
           <w:bCs/>
           <w:highlight w:val="yellow"/>
         </w:rPr>
-        <w:t>Big Data in Smart Farming</w:t>
-      </w:r>
-      <w:r>
-        <w:rPr>
-          <w:b/>
-          <w:bCs/>
-          <w:highlight w:val="yellow"/>
-        </w:rPr>
-        <w:t xml:space="preserve"> </w:t>
-      </w:r>
-      <w:r>
-        <w:rPr>
-          <w:b/>
-          <w:bCs/>
-          <w:highlight w:val="yellow"/>
-        </w:rPr>
-        <w:t>—</w:t>
-      </w:r>
-      <w:r>
-        <w:rPr>
-          <w:b/>
-          <w:bCs/>
-          <w:highlight w:val="yellow"/>
-        </w:rPr>
-        <w:t xml:space="preserve"> </w:t>
-      </w:r>
-      <w:r>
-        <w:rPr>
-          <w:b/>
-          <w:bCs/>
-          <w:highlight w:val="yellow"/>
-        </w:rPr>
-        <w:t>A Review</w:t>
-      </w:r>
-      <w:r>
-        <w:rPr>
-          <w:highlight w:val="yellow"/>
-        </w:rPr>
-        <w:t>. Agricultural Systems. Disponível em: &lt;</w:t>
-      </w:r>
-      <w:r>
-        <w:rPr>
-          <w:highlight w:val="yellow"/>
-        </w:rPr>
-        <w:t xml:space="preserve"> https://www.researchgate.net/publication/313448667_Big_Data_in_Smart_Farming_-_A_review</w:t>
-      </w:r>
-      <w:r>
-        <w:rPr>
-          <w:highlight w:val="yellow"/>
-        </w:rPr>
-        <w:t xml:space="preserve">&gt;. Acesso em: </w:t>
-      </w:r>
-      <w:r>
-        <w:rPr>
-          <w:highlight w:val="yellow"/>
-        </w:rPr>
-        <w:t xml:space="preserve">15 </w:t>
-      </w:r>
-      <w:r>
-        <w:rPr>
-          <w:highlight w:val="yellow"/>
-        </w:rPr>
-        <w:t>m</w:t>
-      </w:r>
-      <w:r>
-        <w:rPr>
-          <w:highlight w:val="yellow"/>
-        </w:rPr>
-        <w:t>ai 2026</w:t>
-      </w:r>
-      <w:r>
-        <w:rPr>
-          <w:highlight w:val="yellow"/>
-        </w:rPr>
-        <w:t>.</w:t>
+        <w:t xml:space="preserve">Big Data in Smart Farming — A Review</w:t>
+      </w:r>
+      <w:r>
+        <w:rPr>
+          <w:highlight w:val="yellow"/>
+        </w:rPr>
+        <w:t xml:space="preserve">. Agricultural Systems. Disponível em: &lt; https://www.researchgate.net/publication/313448667_Big_Data_in_Smart_Farming_-_A_review&gt;. Acesso em: 15 mai 2026.</w:t>
       </w:r>
     </w:p>
     <w:p>
@@ -3077,14 +2435,7 @@
           <w:rFonts w:ascii="Arial" w:hAnsi="Arial" w:cs="Arial"/>
           <w:highlight w:val="yellow"/>
         </w:rPr>
-        <w:t xml:space="preserve">Reproduz-se abaixo a função responsável pela lógica central do motor de alertas do sistema, descrita na Seção 5.3.2, extraída do arquivo alerts.service.js do back-end. A função é executada após o registro de cada medição e decide, para cada variável monitorada, entre abrir um novo evento de alerta, atualizar o valor de pico de um </w:t>
-      </w:r>
-      <w:r>
-        <w:rPr>
-          <w:rFonts w:ascii="Arial" w:hAnsi="Arial" w:cs="Arial"/>
-          <w:highlight w:val="yellow"/>
-        </w:rPr>
-        <w:t>evento em andamento, ou encerrar um evento cuja leitura retornou à faixa normal.</w:t>
+        <w:t xml:space="preserve">Reproduz-se abaixo a função responsável pela lógica central do motor de alertas do sistema, descrita na Seção 5.3.2, extraída do arquivo alerts.service.js do back-end. A função é executada após o registro de cada medição e decide, para cada variável monitorada, entre abrir um novo evento de alerta, atualizar o valor de pico de um evento em andamento, ou encerrar um evento cuja leitura retornou à faixa normal.</w:t>
       </w:r>
     </w:p>
     <w:tbl>
@@ -3924,21 +3275,7 @@
           <w:rFonts w:ascii="Arial" w:hAnsi="Arial" w:cs="Arial"/>
           <w:highlight w:val="yellow"/>
         </w:rPr>
-        <w:t xml:space="preserve">Além deste trabalho, o desenvolvimento do sistema foi documentado por um conjunto de </w:t>
-      </w:r>
-      <w:r>
-        <w:rPr>
-          <w:rFonts w:ascii="Arial" w:hAnsi="Arial" w:cs="Arial"/>
-          <w:highlight w:val="yellow"/>
-        </w:rPr>
-        <w:t>dez</w:t>
-      </w:r>
-      <w:r>
-        <w:rPr>
-          <w:rFonts w:ascii="Arial" w:hAnsi="Arial" w:cs="Arial"/>
-          <w:highlight w:val="yellow"/>
-        </w:rPr>
-        <w:t xml:space="preserve"> documentos técnicos, mantidos junto ao código-fonte do projeto (diretório docs/documentacao/ do repositório), referenciados ao longo deste trabalho como material de apoio técnico. O Quadro 1 relaciona o conteúdo de cada um.</w:t>
+        <w:t xml:space="preserve">Além deste trabalho, o desenvolvimento do sistema foi documentado por um conjunto de dez documentos técnicos, mantidos junto ao código-fonte do projeto (diretório docs/documentacao/ do repositório), referenciados ao longo deste trabalho como material de apoio técnico. O Quadro 1 relaciona o conteúdo de cada um.</w:t>
       </w:r>
     </w:p>
     <w:p>
@@ -4477,25 +3814,7 @@
                 <w:szCs w:val="18"/>
                 <w:highlight w:val="yellow"/>
               </w:rPr>
-              <w:t>08-</w:t>
-            </w:r>
-            <w:r>
-              <w:rPr>
-                <w:rFonts w:ascii="Arial" w:eastAsia="Courier New" w:hAnsi="Arial" w:cs="Arial"/>
-                <w:sz w:val="18"/>
-                <w:szCs w:val="18"/>
-                <w:highlight w:val="yellow"/>
-              </w:rPr>
-              <w:t>explicacao-sistema</w:t>
-            </w:r>
-            <w:r>
-              <w:rPr>
-                <w:rFonts w:ascii="Arial" w:eastAsia="Courier New" w:hAnsi="Arial" w:cs="Arial"/>
-                <w:sz w:val="18"/>
-                <w:szCs w:val="18"/>
-                <w:highlight w:val="yellow"/>
-              </w:rPr>
-              <w:t>.md</w:t>
+              <w:t>08-explicacao-sistema.md</w:t>
             </w:r>
           </w:p>
         </w:tc>
@@ -4553,25 +3872,7 @@
                 <w:szCs w:val="18"/>
                 <w:highlight w:val="yellow"/>
               </w:rPr>
-              <w:t>09-</w:t>
-            </w:r>
-            <w:r>
-              <w:rPr>
-                <w:rFonts w:ascii="Arial" w:eastAsia="Courier New" w:hAnsi="Arial" w:cs="Arial"/>
-                <w:sz w:val="18"/>
-                <w:szCs w:val="18"/>
-                <w:highlight w:val="yellow"/>
-              </w:rPr>
-              <w:t>funcao-e-conceito</w:t>
-            </w:r>
-            <w:r>
-              <w:rPr>
-                <w:rFonts w:ascii="Arial" w:eastAsia="Courier New" w:hAnsi="Arial" w:cs="Arial"/>
-                <w:sz w:val="18"/>
-                <w:szCs w:val="18"/>
-                <w:highlight w:val="yellow"/>
-              </w:rPr>
-              <w:t>.md</w:t>
+              <w:t>09-funcao-e-conceito.md</w:t>
             </w:r>
           </w:p>
         </w:tc>
@@ -4629,25 +3930,7 @@
                 <w:szCs w:val="18"/>
                 <w:highlight w:val="yellow"/>
               </w:rPr>
-              <w:t>10-</w:t>
-            </w:r>
-            <w:r>
-              <w:rPr>
-                <w:rFonts w:ascii="Arial" w:eastAsia="Courier New" w:hAnsi="Arial" w:cs="Arial"/>
-                <w:sz w:val="18"/>
-                <w:szCs w:val="18"/>
-                <w:highlight w:val="yellow"/>
-              </w:rPr>
-              <w:t>referencia-pasta-arquivo</w:t>
-            </w:r>
-            <w:r>
-              <w:rPr>
-                <w:rFonts w:ascii="Arial" w:eastAsia="Courier New" w:hAnsi="Arial" w:cs="Arial"/>
-                <w:sz w:val="18"/>
-                <w:szCs w:val="18"/>
-                <w:highlight w:val="yellow"/>
-              </w:rPr>
-              <w:t>.md</w:t>
+              <w:t>10-referencia-pasta-arquivo.md</w:t>
             </w:r>
           </w:p>
         </w:tc>
@@ -4702,10 +3985,7 @@
         <w:pStyle w:val="ABNT-Corpodetexto"/>
       </w:pPr>
       <w:r>
-        <w:t>[Inserir anexo, se houver</w:t>
-      </w:r>
-      <w:r>
-        <w:t>.</w:t>
+        <w:t>[Inserir anexo, se houver.</w:t>
       </w:r>
     </w:p>
     <w:p>
@@ -4713,10 +3993,7 @@
         <w:pStyle w:val="ABNT-Corpodetexto"/>
       </w:pPr>
       <w:r>
-        <w:t>S</w:t>
-      </w:r>
-      <w:r>
-        <w:t>ão documentos criados por terceiros, e usados pelo autor.</w:t>
+        <w:t>São documentos criados por terceiros, e usados pelo autor.</w:t>
       </w:r>
     </w:p>
     <w:p>
@@ -4724,10 +4001,7 @@
         <w:pStyle w:val="ABNT-Corpodetexto"/>
       </w:pPr>
       <w:r>
-        <w:t>Mapas, estatutos, leis, imagens, etc.</w:t>
-      </w:r>
-      <w:r>
-        <w:t>].</w:t>
+        <w:t>Mapas, estatutos, leis, imagens, etc.].</w:t>
       </w:r>
     </w:p>
     <w:p>

</xml_diff>

<commit_message>
minhas alterações no documento
</commit_message>
<xml_diff>
--- a/docs/TCC/Grupo_7__Fazer_correção.docx
+++ b/docs/TCC/Grupo_7__Fazer_correção.docx
@@ -275,10 +275,26 @@
         <w:pStyle w:val="ABNT-Corpodetexto"/>
       </w:pPr>
       <w:r>
-        <w:t>Aos professores Andrea Avezum Martus e Juliano</w:t>
-      </w:r>
-      <w:r>
-        <w:t xml:space="preserve"> Aparecido Dezem Telles...</w:t>
+        <w:t xml:space="preserve">Aos professores Andrea </w:t>
+      </w:r>
+      <w:proofErr w:type="spellStart"/>
+      <w:r>
+        <w:t>Avezum</w:t>
+      </w:r>
+      <w:proofErr w:type="spellEnd"/>
+      <w:r>
+        <w:t xml:space="preserve"> Martus e Juliano</w:t>
+      </w:r>
+      <w:r>
+        <w:t xml:space="preserve"> Aparecido </w:t>
+      </w:r>
+      <w:proofErr w:type="spellStart"/>
+      <w:r>
+        <w:t>Dezem</w:t>
+      </w:r>
+      <w:proofErr w:type="spellEnd"/>
+      <w:r>
+        <w:t xml:space="preserve"> Telles...</w:t>
       </w:r>
     </w:p>
     <w:p>
@@ -292,15 +308,6 @@
       </w:pPr>
       <w:r>
         <w:br w:type="page"/>
-      </w:r>
-    </w:p>
-    <w:p>
-      <w:pPr>
-        <w:pStyle w:val="ABNT-Ttulospr-textuais"/>
-      </w:pPr>
-      <w:r>
-        <w:lastRenderedPageBreak/>
-        <w:t>RESUMO</w:t>
       </w:r>
     </w:p>
     <w:p>
@@ -340,7 +347,55 @@
           <w:rFonts w:ascii="Arial" w:hAnsi="Arial" w:cs="Arial"/>
           <w:highlight w:val="yellow"/>
         </w:rPr>
-        <w:t>O controle de temperatura e umidade é um fator determinante para a conservação de materiais, a preservação de alimentos e medicamentos e o funcionamento adequado de diversos processos. Este trabalho apresenta o desenvolvimento do ThermoSense, um sistema computacional de monitoramento ambiental composto por um microcontrolador ESP32 acoplado a um sensor DHT11, uma API REST desenvolvida em Node.js e Express com persistência em banco de dados relacional PostgreSQL por meio do ORM Prisma, e uma interface web desenvolvida em React. O sistema captura leituras de temperatura e umidade, armazena o histórico das medições, disponibiliza um painel com gráficos e permite a configuração de faixas aceitáveis para cada variável, gerando alertas automáticos — modelados como eventos com início e fim, e não como uma notificação por leitura — quando os valores medidos saem da faixa configurada. O desenvolvimento seguiu uma abordagem incremental e iterativa, estruturada em nove etapas sequenciais com validação ao final de cada uma, e contou com o apoio de uma ferramenta de inteligência artificial como recurso auxiliar, sob supervisão integral do autor. Os resultados obtidos demonstram o funcionamento completo do fluxo de dados, do sensor ao painel do usuário, validado por meio de testes automatizados de back-end e de verificação manual de todos os fluxos da interface. Conclui-se que o sistema desenvolvido atende aos objetivos propostos, oferecendo uma solução funcional e replicável de monitoramento ambiental baseada em Internet das Coisas.</w:t>
+        <w:t xml:space="preserve">O controle de temperatura e umidade é um fator determinante para a conservação de materiais, a preservação de alimentos e medicamentos e o funcionamento adequado de diversos processos. Este trabalho apresenta o desenvolvimento do </w:t>
+      </w:r>
+      <w:proofErr w:type="spellStart"/>
+      <w:r>
+        <w:rPr>
+          <w:rFonts w:ascii="Arial" w:hAnsi="Arial" w:cs="Arial"/>
+          <w:highlight w:val="yellow"/>
+        </w:rPr>
+        <w:t>ThermoSense</w:t>
+      </w:r>
+      <w:proofErr w:type="spellEnd"/>
+      <w:r>
+        <w:rPr>
+          <w:rFonts w:ascii="Arial" w:hAnsi="Arial" w:cs="Arial"/>
+          <w:highlight w:val="yellow"/>
+        </w:rPr>
+        <w:t xml:space="preserve">, um sistema computacional de monitoramento ambiental composto por um microcontrolador ESP32 acoplado a um sensor DHT11, uma API REST desenvolvida em Node.js e Express com persistência em banco de dados relacional PostgreSQL por meio do ORM Prisma, e uma interface web desenvolvida em </w:t>
+      </w:r>
+      <w:proofErr w:type="spellStart"/>
+      <w:r>
+        <w:rPr>
+          <w:rFonts w:ascii="Arial" w:hAnsi="Arial" w:cs="Arial"/>
+          <w:highlight w:val="yellow"/>
+        </w:rPr>
+        <w:t>React</w:t>
+      </w:r>
+      <w:proofErr w:type="spellEnd"/>
+      <w:r>
+        <w:rPr>
+          <w:rFonts w:ascii="Arial" w:hAnsi="Arial" w:cs="Arial"/>
+          <w:highlight w:val="yellow"/>
+        </w:rPr>
+        <w:t xml:space="preserve">. O sistema captura leituras de temperatura e umidade, armazena o histórico das medições, disponibiliza um painel com gráficos e permite a configuração de faixas aceitáveis para cada variável, gerando alertas automáticos — modelados como eventos com início e fim, e não como uma notificação por leitura — quando os valores medidos saem da faixa configurada. O desenvolvimento seguiu uma abordagem incremental e iterativa, estruturada em nove etapas sequenciais com validação ao final de cada uma, e contou com o apoio de uma ferramenta de inteligência artificial como recurso auxiliar, sob supervisão integral do autor. Os resultados obtidos demonstram o funcionamento completo do fluxo de dados, do sensor ao painel do usuário, validado por meio de testes automatizados de </w:t>
+      </w:r>
+      <w:proofErr w:type="spellStart"/>
+      <w:r>
+        <w:rPr>
+          <w:rFonts w:ascii="Arial" w:hAnsi="Arial" w:cs="Arial"/>
+          <w:highlight w:val="yellow"/>
+        </w:rPr>
+        <w:t>back-end</w:t>
+      </w:r>
+      <w:proofErr w:type="spellEnd"/>
+      <w:r>
+        <w:rPr>
+          <w:rFonts w:ascii="Arial" w:hAnsi="Arial" w:cs="Arial"/>
+          <w:highlight w:val="yellow"/>
+        </w:rPr>
+        <w:t xml:space="preserve"> e de verificação manual de todos os fluxos da interface. Conclui-se que o sistema desenvolvido atende aos objetivos propostos, oferecendo uma solução funcional e replicável de monitoramento ambiental baseada em Internet das Coisas.</w:t>
       </w:r>
     </w:p>
     <w:p>
@@ -810,6 +865,7 @@
       <w:pPr>
         <w:pStyle w:val="ABNT-Resumoeabreviaturas"/>
       </w:pPr>
+      <w:proofErr w:type="gramStart"/>
       <w:r>
         <w:t>Σ</w:t>
       </w:r>
@@ -817,6 +873,7 @@
         <w:tab/>
         <w:t>Somatório</w:t>
       </w:r>
+      <w:proofErr w:type="gramEnd"/>
     </w:p>
     <w:p>
       <w:pPr>
@@ -1999,7 +2056,23 @@
           <w:rFonts w:ascii="Arial" w:hAnsi="Arial" w:cs="Arial"/>
           <w:highlight w:val="yellow"/>
         </w:rPr>
-        <w:t>A Internet das Coisas (IoT) foi concebida para conectar objetos, de modo que o mundo físico e o ambiente digital deixem de ser separados. Kevin Ashton apresentou essa ideia ainda em seus estágios iniciais, e Sundmaeker e colaboradores (2010) descreveram como sensores e atuadores poderiam torná-la realidade. Dessa forma, os dispositivos passam a se comunicar entre si sem a necessidade de intervenção humana, coletando e compartilhando dados em tempo real (ASHTON, 2009; SUNDMAEKER et al., 2010).</w:t>
+        <w:t xml:space="preserve">A Internet das Coisas (IoT) foi concebida para conectar objetos, de modo que o mundo físico e o ambiente digital deixem de ser separados. Kevin Ashton apresentou essa ideia ainda em seus estágios iniciais, e </w:t>
+      </w:r>
+      <w:proofErr w:type="spellStart"/>
+      <w:r>
+        <w:rPr>
+          <w:rFonts w:ascii="Arial" w:hAnsi="Arial" w:cs="Arial"/>
+          <w:highlight w:val="yellow"/>
+        </w:rPr>
+        <w:t>Sundmaeker</w:t>
+      </w:r>
+      <w:proofErr w:type="spellEnd"/>
+      <w:r>
+        <w:rPr>
+          <w:rFonts w:ascii="Arial" w:hAnsi="Arial" w:cs="Arial"/>
+          <w:highlight w:val="yellow"/>
+        </w:rPr>
+        <w:t xml:space="preserve"> e colaboradores (2010) descreveram como sensores e atuadores poderiam torná-la realidade. Dessa forma, os dispositivos passam a se comunicar entre si sem a necessidade de intervenção humana, coletando e compartilhando dados em tempo real (ASHTON, 2009; SUNDMAEKER et al., 2010).</w:t>
       </w:r>
     </w:p>
     <w:p>
@@ -2244,13 +2317,86 @@
         </w:rPr>
         <w:t xml:space="preserve">Para desenvolver essa pesquisa, foi utilizada uma abordagem baseada em pesquisa bibliográfica e aplicação prática, envolvendo conceitos de Engenharia de Software e Desenvolvimento de Sistemas, com caráter exploratório e qualitativo, uma vez que o foco esteve no desenvolvimento de uma solução tecnológica baseada em necessidades reais de controle ambiental. No ambiente de desenvolvimento de software, foi utilizado o Visual Studio </w:t>
       </w:r>
+      <w:proofErr w:type="spellStart"/>
       <w:r>
         <w:rPr>
           <w:rFonts w:ascii="Arial" w:hAnsi="Arial" w:cs="Arial"/>
           <w:highlight w:val="yellow"/>
         </w:rPr>
         <w:lastRenderedPageBreak/>
-        <w:t>Code (VS Code) como editor de código principal, com o back-end desenvolvido em Node.js e Express.js e o front-end em React, seguindo uma arquitetura cliente-servidor com comunicação via API REST. Para o armazenamento dos dados coletados, foi utilizado o banco de dados relacional PostgreSQL, gerenciado por meio do ORM Prisma, responsável por armazenar o histórico das medições de temperatura e umidade, as configurações de cada usuário e os alertas gerados, permitindo consultas e geração de relatórios.</w:t>
+        <w:t>Code</w:t>
+      </w:r>
+      <w:proofErr w:type="spellEnd"/>
+      <w:r>
+        <w:rPr>
+          <w:rFonts w:ascii="Arial" w:hAnsi="Arial" w:cs="Arial"/>
+          <w:highlight w:val="yellow"/>
+        </w:rPr>
+        <w:t xml:space="preserve"> (VS </w:t>
+      </w:r>
+      <w:proofErr w:type="spellStart"/>
+      <w:r>
+        <w:rPr>
+          <w:rFonts w:ascii="Arial" w:hAnsi="Arial" w:cs="Arial"/>
+          <w:highlight w:val="yellow"/>
+        </w:rPr>
+        <w:t>Code</w:t>
+      </w:r>
+      <w:proofErr w:type="spellEnd"/>
+      <w:r>
+        <w:rPr>
+          <w:rFonts w:ascii="Arial" w:hAnsi="Arial" w:cs="Arial"/>
+          <w:highlight w:val="yellow"/>
+        </w:rPr>
+        <w:t xml:space="preserve">) como editor de código principal, com o </w:t>
+      </w:r>
+      <w:proofErr w:type="spellStart"/>
+      <w:r>
+        <w:rPr>
+          <w:rFonts w:ascii="Arial" w:hAnsi="Arial" w:cs="Arial"/>
+          <w:highlight w:val="yellow"/>
+        </w:rPr>
+        <w:t>back-end</w:t>
+      </w:r>
+      <w:proofErr w:type="spellEnd"/>
+      <w:r>
+        <w:rPr>
+          <w:rFonts w:ascii="Arial" w:hAnsi="Arial" w:cs="Arial"/>
+          <w:highlight w:val="yellow"/>
+        </w:rPr>
+        <w:t xml:space="preserve"> desenvolvido em Node.js e Express.js e o front-</w:t>
+      </w:r>
+      <w:proofErr w:type="spellStart"/>
+      <w:r>
+        <w:rPr>
+          <w:rFonts w:ascii="Arial" w:hAnsi="Arial" w:cs="Arial"/>
+          <w:highlight w:val="yellow"/>
+        </w:rPr>
+        <w:t>end</w:t>
+      </w:r>
+      <w:proofErr w:type="spellEnd"/>
+      <w:r>
+        <w:rPr>
+          <w:rFonts w:ascii="Arial" w:hAnsi="Arial" w:cs="Arial"/>
+          <w:highlight w:val="yellow"/>
+        </w:rPr>
+        <w:t xml:space="preserve"> em </w:t>
+      </w:r>
+      <w:proofErr w:type="spellStart"/>
+      <w:r>
+        <w:rPr>
+          <w:rFonts w:ascii="Arial" w:hAnsi="Arial" w:cs="Arial"/>
+          <w:highlight w:val="yellow"/>
+        </w:rPr>
+        <w:t>React</w:t>
+      </w:r>
+      <w:proofErr w:type="spellEnd"/>
+      <w:r>
+        <w:rPr>
+          <w:rFonts w:ascii="Arial" w:hAnsi="Arial" w:cs="Arial"/>
+          <w:highlight w:val="yellow"/>
+        </w:rPr>
+        <w:t>, seguindo uma arquitetura cliente-servidor com comunicação via API REST. Para o armazenamento dos dados coletados, foi utilizado o banco de dados relacional PostgreSQL, gerenciado por meio do ORM Prisma, responsável por armazenar o histórico das medições de temperatura e umidade, as configurações de cada usuário e os alertas gerados, permitindo consultas e geração de relatórios.</w:t>
       </w:r>
     </w:p>
     <w:p>
@@ -2304,7 +2450,39 @@
           <w:rFonts w:ascii="Arial" w:hAnsi="Arial" w:cs="Arial"/>
           <w:highlight w:val="yellow"/>
         </w:rPr>
-        <w:t>O desenvolvimento do sistema seguiu uma abordagem incremental e iterativa, estruturada em etapas sequenciais com validação ao final de cada uma: (1) definição da arquitetura e das decisões técnicas; (2) modelagem e implementação do banco de dados; (3) desenvolvimento do back-end e das regras de negócio; (4) desenvolvimento do front-end; (5) desenvolvimento do firmware do ESP32; (6) verificação de integração entre os módulos; (7) revisão de segurança da aplicação; (8) implementação de testes automatizados; e (9) consolidação da documentação técnica. Cada etapa produziu um documento de decisões técnicas antes da implementação, de modo que escolhas estruturais — como o modelo de dados, o mecanismo de autenticação e a estratégia de geração de alertas — fossem avaliadas antes de se tornarem código.</w:t>
+        <w:t xml:space="preserve">O desenvolvimento do sistema seguiu uma abordagem incremental e iterativa, estruturada em etapas sequenciais com validação ao final de cada uma: (1) definição da arquitetura e das decisões técnicas; (2) modelagem e implementação do banco de dados; (3) desenvolvimento do </w:t>
+      </w:r>
+      <w:proofErr w:type="spellStart"/>
+      <w:r>
+        <w:rPr>
+          <w:rFonts w:ascii="Arial" w:hAnsi="Arial" w:cs="Arial"/>
+          <w:highlight w:val="yellow"/>
+        </w:rPr>
+        <w:t>back-end</w:t>
+      </w:r>
+      <w:proofErr w:type="spellEnd"/>
+      <w:r>
+        <w:rPr>
+          <w:rFonts w:ascii="Arial" w:hAnsi="Arial" w:cs="Arial"/>
+          <w:highlight w:val="yellow"/>
+        </w:rPr>
+        <w:t xml:space="preserve"> e das regras de negócio; (4) desenvolvimento do front-</w:t>
+      </w:r>
+      <w:proofErr w:type="spellStart"/>
+      <w:r>
+        <w:rPr>
+          <w:rFonts w:ascii="Arial" w:hAnsi="Arial" w:cs="Arial"/>
+          <w:highlight w:val="yellow"/>
+        </w:rPr>
+        <w:t>end</w:t>
+      </w:r>
+      <w:proofErr w:type="spellEnd"/>
+      <w:r>
+        <w:rPr>
+          <w:rFonts w:ascii="Arial" w:hAnsi="Arial" w:cs="Arial"/>
+          <w:highlight w:val="yellow"/>
+        </w:rPr>
+        <w:t>; (5) desenvolvimento do firmware do ESP32; (6) verificação de integração entre os módulos; (7) revisão de segurança da aplicação; (8) implementação de testes automatizados; e (9) consolidação da documentação técnica. Cada etapa produziu um documento de decisões técnicas antes da implementação, de modo que escolhas estruturais — como o modelo de dados, o mecanismo de autenticação e a estratégia de geração de alertas — fossem avaliadas antes de se tornarem código.</w:t>
       </w:r>
     </w:p>
     <w:p>
@@ -2322,7 +2500,119 @@
           <w:rFonts w:ascii="Arial" w:hAnsi="Arial" w:cs="Arial"/>
           <w:highlight w:val="yellow"/>
         </w:rPr>
-        <w:t xml:space="preserve">Além disso, o desenvolvimento contou com o apoio de uma ferramenta de inteligência artificial (Claude, da Anthropic, na variante Claude Code, um assistente de programação baseado em agentes) como recurso auxiliar ao longo de todas as etapas do projeto. A ferramenta foi utilizada na geração e revisão de código do back-end, do front-end e do firmware do ESP32; na elaboração da documentação técnica (arquitetura, integração, segurança e documentação técnica consolidada); na escrita e execução de testes automatizados de back-end com Jest e Supertest; e na verificação manual de fluxos de ponta a ponta em navegador real (login, cadastro de dispositivos, geração de alertas, filtros de histórico, entre outros), sem uma suíte automatizada dedicada no front-end. A IA também </w:t>
+        <w:t xml:space="preserve">Além disso, o desenvolvimento contou com o apoio de uma ferramenta de inteligência artificial (Claude, da </w:t>
+      </w:r>
+      <w:proofErr w:type="spellStart"/>
+      <w:r>
+        <w:rPr>
+          <w:rFonts w:ascii="Arial" w:hAnsi="Arial" w:cs="Arial"/>
+          <w:highlight w:val="yellow"/>
+        </w:rPr>
+        <w:t>Anthropic</w:t>
+      </w:r>
+      <w:proofErr w:type="spellEnd"/>
+      <w:r>
+        <w:rPr>
+          <w:rFonts w:ascii="Arial" w:hAnsi="Arial" w:cs="Arial"/>
+          <w:highlight w:val="yellow"/>
+        </w:rPr>
+        <w:t xml:space="preserve">, na variante Claude </w:t>
+      </w:r>
+      <w:proofErr w:type="spellStart"/>
+      <w:r>
+        <w:rPr>
+          <w:rFonts w:ascii="Arial" w:hAnsi="Arial" w:cs="Arial"/>
+          <w:highlight w:val="yellow"/>
+        </w:rPr>
+        <w:t>Code</w:t>
+      </w:r>
+      <w:proofErr w:type="spellEnd"/>
+      <w:r>
+        <w:rPr>
+          <w:rFonts w:ascii="Arial" w:hAnsi="Arial" w:cs="Arial"/>
+          <w:highlight w:val="yellow"/>
+        </w:rPr>
+        <w:t xml:space="preserve">, um assistente de programação baseado em agentes) como recurso auxiliar ao longo de todas as etapas do projeto. A ferramenta foi utilizada na geração e revisão de código do </w:t>
+      </w:r>
+      <w:proofErr w:type="spellStart"/>
+      <w:r>
+        <w:rPr>
+          <w:rFonts w:ascii="Arial" w:hAnsi="Arial" w:cs="Arial"/>
+          <w:highlight w:val="yellow"/>
+        </w:rPr>
+        <w:t>back-end</w:t>
+      </w:r>
+      <w:proofErr w:type="spellEnd"/>
+      <w:r>
+        <w:rPr>
+          <w:rFonts w:ascii="Arial" w:hAnsi="Arial" w:cs="Arial"/>
+          <w:highlight w:val="yellow"/>
+        </w:rPr>
+        <w:t>, do front-</w:t>
+      </w:r>
+      <w:proofErr w:type="spellStart"/>
+      <w:r>
+        <w:rPr>
+          <w:rFonts w:ascii="Arial" w:hAnsi="Arial" w:cs="Arial"/>
+          <w:highlight w:val="yellow"/>
+        </w:rPr>
+        <w:t>end</w:t>
+      </w:r>
+      <w:proofErr w:type="spellEnd"/>
+      <w:r>
+        <w:rPr>
+          <w:rFonts w:ascii="Arial" w:hAnsi="Arial" w:cs="Arial"/>
+          <w:highlight w:val="yellow"/>
+        </w:rPr>
+        <w:t xml:space="preserve"> e do firmware do ESP32; na elaboração da documentação técnica (arquitetura, integração, segurança e documentação técnica consolidada); na escrita e execução de testes automatizados de </w:t>
+      </w:r>
+      <w:proofErr w:type="spellStart"/>
+      <w:r>
+        <w:rPr>
+          <w:rFonts w:ascii="Arial" w:hAnsi="Arial" w:cs="Arial"/>
+          <w:highlight w:val="yellow"/>
+        </w:rPr>
+        <w:t>back-end</w:t>
+      </w:r>
+      <w:proofErr w:type="spellEnd"/>
+      <w:r>
+        <w:rPr>
+          <w:rFonts w:ascii="Arial" w:hAnsi="Arial" w:cs="Arial"/>
+          <w:highlight w:val="yellow"/>
+        </w:rPr>
+        <w:t xml:space="preserve"> com </w:t>
+      </w:r>
+      <w:proofErr w:type="spellStart"/>
+      <w:r>
+        <w:rPr>
+          <w:rFonts w:ascii="Arial" w:hAnsi="Arial" w:cs="Arial"/>
+          <w:highlight w:val="yellow"/>
+        </w:rPr>
+        <w:t>Jest</w:t>
+      </w:r>
+      <w:proofErr w:type="spellEnd"/>
+      <w:r>
+        <w:rPr>
+          <w:rFonts w:ascii="Arial" w:hAnsi="Arial" w:cs="Arial"/>
+          <w:highlight w:val="yellow"/>
+        </w:rPr>
+        <w:t xml:space="preserve"> e </w:t>
+      </w:r>
+      <w:proofErr w:type="spellStart"/>
+      <w:r>
+        <w:rPr>
+          <w:rFonts w:ascii="Arial" w:hAnsi="Arial" w:cs="Arial"/>
+          <w:highlight w:val="yellow"/>
+        </w:rPr>
+        <w:t>Supertest</w:t>
+      </w:r>
+      <w:proofErr w:type="spellEnd"/>
+      <w:r>
+        <w:rPr>
+          <w:rFonts w:ascii="Arial" w:hAnsi="Arial" w:cs="Arial"/>
+          <w:highlight w:val="yellow"/>
+        </w:rPr>
+        <w:t xml:space="preserve">; e na verificação manual de fluxos de ponta a ponta em navegador real (login, cadastro de dispositivos, geração de alertas, filtros de histórico, entre outros), sem uma suíte automatizada dedicada no front-end. A IA também </w:t>
       </w:r>
       <w:r>
         <w:rPr>
@@ -2330,7 +2620,23 @@
           <w:highlight w:val="yellow"/>
         </w:rPr>
         <w:lastRenderedPageBreak/>
-        <w:t>apoiou a depuração de erros durante a configuração do ambiente de desenvolvimento local (banco de dados, variáveis de ambiente, política de execução do PowerShell) e a correção iterativa de problemas identificados durante o uso prático do sistema — como uma falha na leitura de valores decimais digitados com vírgula, o ajuste do intervalo de leituras automáticas do firmware e a reformulação da tela de notificações para separá-las por dispositivo.</w:t>
+        <w:t xml:space="preserve">apoiou a depuração de erros durante a configuração do ambiente de desenvolvimento local (banco de dados, variáveis de ambiente, política de execução do </w:t>
+      </w:r>
+      <w:proofErr w:type="spellStart"/>
+      <w:r>
+        <w:rPr>
+          <w:rFonts w:ascii="Arial" w:hAnsi="Arial" w:cs="Arial"/>
+          <w:highlight w:val="yellow"/>
+        </w:rPr>
+        <w:t>PowerShell</w:t>
+      </w:r>
+      <w:proofErr w:type="spellEnd"/>
+      <w:r>
+        <w:rPr>
+          <w:rFonts w:ascii="Arial" w:hAnsi="Arial" w:cs="Arial"/>
+          <w:highlight w:val="yellow"/>
+        </w:rPr>
+        <w:t>) e a correção iterativa de problemas identificados durante o uso prático do sistema — como uma falha na leitura de valores decimais digitados com vírgula, o ajuste do intervalo de leituras automáticas do firmware e a reformulação da tela de notificações para separá-las por dispositivo.</w:t>
       </w:r>
     </w:p>
     <w:p>
@@ -2736,278 +3042,876 @@
         </w:rPr>
         <w:t xml:space="preserve">  </w:t>
       </w:r>
+      <w:proofErr w:type="spellStart"/>
       <w:r>
         <w:rPr>
           <w:b/>
           <w:bCs/>
           <w:highlight w:val="yellow"/>
         </w:rPr>
-        <w:t>That “Internet of Things” Thing In the Real World Things Matter More than Ideas.</w:t>
-      </w:r>
-      <w:r>
-        <w:rPr>
-          <w:highlight w:val="yellow"/>
-        </w:rPr>
-        <w:t xml:space="preserve"> RFID Journal</w:t>
-      </w:r>
-      <w:r>
-        <w:rPr>
-          <w:highlight w:val="yellow"/>
-        </w:rPr>
-        <w:t xml:space="preserve"> (2009)</w:t>
-      </w:r>
-      <w:r>
-        <w:rPr>
-          <w:highlight w:val="yellow"/>
-        </w:rPr>
-        <w:t>. Disponível em: &lt;</w:t>
-      </w:r>
-      <w:r>
-        <w:rPr>
-          <w:highlight w:val="yellow"/>
-        </w:rPr>
-        <w:t>https://www.rfidjournal.com/expert-views/that-internet-of-things-thing/73881/</w:t>
-      </w:r>
-      <w:r>
-        <w:rPr>
-          <w:highlight w:val="yellow"/>
-        </w:rPr>
-        <w:t>&gt;. Acesso em</w:t>
-      </w:r>
-      <w:r>
-        <w:rPr>
-          <w:highlight w:val="yellow"/>
-        </w:rPr>
-        <w:t xml:space="preserve">: 19 </w:t>
-      </w:r>
-      <w:r>
-        <w:rPr>
-          <w:highlight w:val="yellow"/>
-        </w:rPr>
-        <w:t>m</w:t>
-      </w:r>
-      <w:r>
-        <w:rPr>
-          <w:highlight w:val="yellow"/>
-        </w:rPr>
-        <w:t>ai 2026</w:t>
-      </w:r>
-      <w:r>
-        <w:rPr>
-          <w:highlight w:val="yellow"/>
-        </w:rPr>
-        <w:t>.</w:t>
-      </w:r>
-    </w:p>
-    <w:p>
-      <w:pPr>
-        <w:pStyle w:val="ABNT-Referncias"/>
-        <w:rPr>
-          <w:highlight w:val="yellow"/>
-        </w:rPr>
-      </w:pPr>
-      <w:r>
-        <w:rPr>
-          <w:highlight w:val="yellow"/>
-        </w:rPr>
-        <w:t>KAMIENSKI,</w:t>
-      </w:r>
-      <w:r>
-        <w:rPr>
-          <w:highlight w:val="yellow"/>
-        </w:rPr>
-        <w:t xml:space="preserve"> </w:t>
-      </w:r>
-      <w:r>
-        <w:rPr>
-          <w:highlight w:val="yellow"/>
-        </w:rPr>
-        <w:t xml:space="preserve">C.; SOININEN, J. P.; TAUMBERGER, M.; DANTAS, R.; TOSCANO, A.; CINOTTI, T. S.; MAIA, R. F.; TORRE NETO, A. (2019) </w:t>
-      </w:r>
+        <w:t>That</w:t>
+      </w:r>
+      <w:proofErr w:type="spellEnd"/>
       <w:r>
         <w:rPr>
           <w:b/>
           <w:bCs/>
           <w:highlight w:val="yellow"/>
         </w:rPr>
-        <w:t>Smart Water Management Platform: IoT-Based Precision Irrigation for Agriculture</w:t>
-      </w:r>
-      <w:r>
-        <w:rPr>
-          <w:highlight w:val="yellow"/>
-        </w:rPr>
-        <w:t>. Disponível em: &lt;</w:t>
-      </w:r>
-      <w:r>
-        <w:rPr>
-          <w:highlight w:val="yellow"/>
-        </w:rPr>
-        <w:t>https://www.mdpi.com/1424-8220/19/2/276</w:t>
-      </w:r>
-      <w:r>
-        <w:rPr>
-          <w:highlight w:val="yellow"/>
-        </w:rPr>
-        <w:t xml:space="preserve">&gt;. Acesso em: </w:t>
-      </w:r>
-      <w:r>
-        <w:rPr>
-          <w:highlight w:val="yellow"/>
-        </w:rPr>
-        <w:t xml:space="preserve">20 </w:t>
-      </w:r>
-      <w:r>
-        <w:rPr>
-          <w:highlight w:val="yellow"/>
-        </w:rPr>
-        <w:t>a</w:t>
-      </w:r>
-      <w:r>
-        <w:rPr>
-          <w:highlight w:val="yellow"/>
-        </w:rPr>
-        <w:t>go 2026</w:t>
-      </w:r>
-      <w:r>
-        <w:rPr>
-          <w:highlight w:val="yellow"/>
-        </w:rPr>
-        <w:t>.</w:t>
-      </w:r>
-    </w:p>
-    <w:p>
-      <w:pPr>
-        <w:pStyle w:val="ABNT-Referncias"/>
-        <w:rPr>
-          <w:highlight w:val="yellow"/>
-        </w:rPr>
-      </w:pPr>
-      <w:r>
-        <w:rPr>
-          <w:highlight w:val="yellow"/>
-        </w:rPr>
-        <w:t xml:space="preserve">SUNDMAEKER, H., Guillemin, P., Friess, P. and Woelfflé, S. (2010) </w:t>
-      </w:r>
+        <w:t xml:space="preserve"> “Internet </w:t>
+      </w:r>
+      <w:proofErr w:type="spellStart"/>
       <w:r>
         <w:rPr>
           <w:b/>
           <w:bCs/>
           <w:highlight w:val="yellow"/>
         </w:rPr>
-        <w:t>Vision and Challenges for Realising the Internet of Things, Cluster of European Research Projects on the Internet of Things</w:t>
-      </w:r>
-      <w:r>
-        <w:rPr>
-          <w:highlight w:val="yellow"/>
-        </w:rPr>
-        <w:t xml:space="preserve"> — CERP IoT. Disponível em: &lt;</w:t>
-      </w:r>
-      <w:r>
-        <w:rPr>
-          <w:highlight w:val="yellow"/>
-        </w:rPr>
-        <w:t xml:space="preserve"> https://www.researchgate.net/publication/228664767_Vision_and_Challenges_for_Realizing_the_Internet_of_Things </w:t>
-      </w:r>
-      <w:r>
-        <w:rPr>
-          <w:highlight w:val="yellow"/>
-        </w:rPr>
-        <w:t xml:space="preserve">&gt;. Acesso em: </w:t>
-      </w:r>
-      <w:r>
-        <w:rPr>
-          <w:highlight w:val="yellow"/>
-        </w:rPr>
-        <w:t xml:space="preserve">18 </w:t>
-      </w:r>
-      <w:r>
-        <w:rPr>
-          <w:highlight w:val="yellow"/>
-        </w:rPr>
-        <w:t>a</w:t>
-      </w:r>
-      <w:r>
-        <w:rPr>
-          <w:highlight w:val="yellow"/>
-        </w:rPr>
-        <w:t>go 2026</w:t>
-      </w:r>
-      <w:r>
-        <w:rPr>
-          <w:highlight w:val="yellow"/>
-        </w:rPr>
-        <w:t>.</w:t>
-      </w:r>
-    </w:p>
-    <w:p>
-      <w:pPr>
-        <w:pStyle w:val="ABNT-Referncias"/>
-        <w:rPr>
-          <w:highlight w:val="yellow"/>
-        </w:rPr>
-      </w:pPr>
-    </w:p>
-    <w:p>
-      <w:pPr>
-        <w:pStyle w:val="ABNT-Referncias"/>
-      </w:pPr>
-      <w:r>
-        <w:rPr>
-          <w:highlight w:val="yellow"/>
-        </w:rPr>
-        <w:t>WOLFERT</w:t>
-      </w:r>
-      <w:r>
-        <w:rPr>
-          <w:highlight w:val="yellow"/>
-        </w:rPr>
-        <w:t xml:space="preserve">, S., Ge, L., Verdouw, C., &amp; Bogaardt, M. J. (2017) </w:t>
-      </w:r>
+        <w:t>of</w:t>
+      </w:r>
+      <w:proofErr w:type="spellEnd"/>
       <w:r>
         <w:rPr>
           <w:b/>
           <w:bCs/>
           <w:highlight w:val="yellow"/>
         </w:rPr>
-        <w:t>Big Data in Smart Farming</w:t>
-      </w:r>
+        <w:t xml:space="preserve"> </w:t>
+      </w:r>
+      <w:proofErr w:type="spellStart"/>
       <w:r>
         <w:rPr>
           <w:b/>
           <w:bCs/>
           <w:highlight w:val="yellow"/>
         </w:rPr>
-        <w:t xml:space="preserve"> </w:t>
-      </w:r>
+        <w:t>Things</w:t>
+      </w:r>
+      <w:proofErr w:type="spellEnd"/>
       <w:r>
         <w:rPr>
           <w:b/>
           <w:bCs/>
           <w:highlight w:val="yellow"/>
         </w:rPr>
-        <w:t>—</w:t>
-      </w:r>
+        <w:t xml:space="preserve">” Thing In </w:t>
+      </w:r>
+      <w:proofErr w:type="spellStart"/>
       <w:r>
         <w:rPr>
           <w:b/>
           <w:bCs/>
           <w:highlight w:val="yellow"/>
         </w:rPr>
-        <w:t xml:space="preserve"> </w:t>
-      </w:r>
+        <w:t>the</w:t>
+      </w:r>
+      <w:proofErr w:type="spellEnd"/>
       <w:r>
         <w:rPr>
           <w:b/>
           <w:bCs/>
           <w:highlight w:val="yellow"/>
         </w:rPr>
+        <w:t xml:space="preserve"> Real World </w:t>
+      </w:r>
+      <w:proofErr w:type="spellStart"/>
+      <w:r>
+        <w:rPr>
+          <w:b/>
+          <w:bCs/>
+          <w:highlight w:val="yellow"/>
+        </w:rPr>
+        <w:t>Things</w:t>
+      </w:r>
+      <w:proofErr w:type="spellEnd"/>
+      <w:r>
+        <w:rPr>
+          <w:b/>
+          <w:bCs/>
+          <w:highlight w:val="yellow"/>
+        </w:rPr>
+        <w:t xml:space="preserve"> Matter More </w:t>
+      </w:r>
+      <w:proofErr w:type="spellStart"/>
+      <w:r>
+        <w:rPr>
+          <w:b/>
+          <w:bCs/>
+          <w:highlight w:val="yellow"/>
+        </w:rPr>
+        <w:t>than</w:t>
+      </w:r>
+      <w:proofErr w:type="spellEnd"/>
+      <w:r>
+        <w:rPr>
+          <w:b/>
+          <w:bCs/>
+          <w:highlight w:val="yellow"/>
+        </w:rPr>
+        <w:t xml:space="preserve"> </w:t>
+      </w:r>
+      <w:proofErr w:type="spellStart"/>
+      <w:r>
+        <w:rPr>
+          <w:b/>
+          <w:bCs/>
+          <w:highlight w:val="yellow"/>
+        </w:rPr>
+        <w:t>Ideas</w:t>
+      </w:r>
+      <w:proofErr w:type="spellEnd"/>
+      <w:r>
+        <w:rPr>
+          <w:b/>
+          <w:bCs/>
+          <w:highlight w:val="yellow"/>
+        </w:rPr>
+        <w:t>.</w:t>
+      </w:r>
+      <w:r>
+        <w:rPr>
+          <w:highlight w:val="yellow"/>
+        </w:rPr>
+        <w:t xml:space="preserve"> RFID </w:t>
+      </w:r>
+      <w:proofErr w:type="spellStart"/>
+      <w:r>
+        <w:rPr>
+          <w:highlight w:val="yellow"/>
+        </w:rPr>
+        <w:t>Journal</w:t>
+      </w:r>
+      <w:proofErr w:type="spellEnd"/>
+      <w:r>
+        <w:rPr>
+          <w:highlight w:val="yellow"/>
+        </w:rPr>
+        <w:t xml:space="preserve"> (2009)</w:t>
+      </w:r>
+      <w:r>
+        <w:rPr>
+          <w:highlight w:val="yellow"/>
+        </w:rPr>
+        <w:t>. Disponível em: &lt;</w:t>
+      </w:r>
+      <w:r>
+        <w:rPr>
+          <w:highlight w:val="yellow"/>
+        </w:rPr>
+        <w:t>https://www.rfidjournal.com/expert-views/that-internet-of-things-thing/73881/</w:t>
+      </w:r>
+      <w:r>
+        <w:rPr>
+          <w:highlight w:val="yellow"/>
+        </w:rPr>
+        <w:t>&gt;. Acesso em</w:t>
+      </w:r>
+      <w:r>
+        <w:rPr>
+          <w:highlight w:val="yellow"/>
+        </w:rPr>
+        <w:t xml:space="preserve">: 19 </w:t>
+      </w:r>
+      <w:proofErr w:type="spellStart"/>
+      <w:r>
+        <w:rPr>
+          <w:highlight w:val="yellow"/>
+        </w:rPr>
+        <w:t>m</w:t>
+      </w:r>
+      <w:r>
+        <w:rPr>
+          <w:highlight w:val="yellow"/>
+        </w:rPr>
+        <w:t>ai</w:t>
+      </w:r>
+      <w:proofErr w:type="spellEnd"/>
+      <w:r>
+        <w:rPr>
+          <w:highlight w:val="yellow"/>
+        </w:rPr>
+        <w:t xml:space="preserve"> 2026</w:t>
+      </w:r>
+      <w:r>
+        <w:rPr>
+          <w:highlight w:val="yellow"/>
+        </w:rPr>
+        <w:t>.</w:t>
+      </w:r>
+    </w:p>
+    <w:p>
+      <w:pPr>
+        <w:pStyle w:val="ABNT-Referncias"/>
+        <w:rPr>
+          <w:highlight w:val="yellow"/>
+        </w:rPr>
+      </w:pPr>
+      <w:r>
+        <w:rPr>
+          <w:highlight w:val="yellow"/>
+        </w:rPr>
+        <w:t>KAMIENSKI,</w:t>
+      </w:r>
+      <w:r>
+        <w:rPr>
+          <w:highlight w:val="yellow"/>
+        </w:rPr>
+        <w:t xml:space="preserve"> </w:t>
+      </w:r>
+      <w:r>
+        <w:rPr>
+          <w:highlight w:val="yellow"/>
+        </w:rPr>
+        <w:t xml:space="preserve">C.; SOININEN, J. P.; TAUMBERGER, M.; DANTAS, R.; TOSCANO, A.; CINOTTI, T. S.; MAIA, R. F.; TORRE NETO, A. (2019) </w:t>
+      </w:r>
+      <w:proofErr w:type="spellStart"/>
+      <w:r>
+        <w:rPr>
+          <w:b/>
+          <w:bCs/>
+          <w:highlight w:val="yellow"/>
+        </w:rPr>
+        <w:t>Smart</w:t>
+      </w:r>
+      <w:proofErr w:type="spellEnd"/>
+      <w:r>
+        <w:rPr>
+          <w:b/>
+          <w:bCs/>
+          <w:highlight w:val="yellow"/>
+        </w:rPr>
+        <w:t xml:space="preserve"> </w:t>
+      </w:r>
+      <w:proofErr w:type="spellStart"/>
+      <w:r>
+        <w:rPr>
+          <w:b/>
+          <w:bCs/>
+          <w:highlight w:val="yellow"/>
+        </w:rPr>
+        <w:t>Water</w:t>
+      </w:r>
+      <w:proofErr w:type="spellEnd"/>
+      <w:r>
+        <w:rPr>
+          <w:b/>
+          <w:bCs/>
+          <w:highlight w:val="yellow"/>
+        </w:rPr>
+        <w:t xml:space="preserve"> Management Platform: IoT-</w:t>
+      </w:r>
+      <w:proofErr w:type="spellStart"/>
+      <w:r>
+        <w:rPr>
+          <w:b/>
+          <w:bCs/>
+          <w:highlight w:val="yellow"/>
+        </w:rPr>
+        <w:t>Based</w:t>
+      </w:r>
+      <w:proofErr w:type="spellEnd"/>
+      <w:r>
+        <w:rPr>
+          <w:b/>
+          <w:bCs/>
+          <w:highlight w:val="yellow"/>
+        </w:rPr>
+        <w:t xml:space="preserve"> </w:t>
+      </w:r>
+      <w:proofErr w:type="spellStart"/>
+      <w:r>
+        <w:rPr>
+          <w:b/>
+          <w:bCs/>
+          <w:highlight w:val="yellow"/>
+        </w:rPr>
+        <w:t>Precision</w:t>
+      </w:r>
+      <w:proofErr w:type="spellEnd"/>
+      <w:r>
+        <w:rPr>
+          <w:b/>
+          <w:bCs/>
+          <w:highlight w:val="yellow"/>
+        </w:rPr>
+        <w:t xml:space="preserve"> </w:t>
+      </w:r>
+      <w:proofErr w:type="spellStart"/>
+      <w:r>
+        <w:rPr>
+          <w:b/>
+          <w:bCs/>
+          <w:highlight w:val="yellow"/>
+        </w:rPr>
+        <w:t>Irrigation</w:t>
+      </w:r>
+      <w:proofErr w:type="spellEnd"/>
+      <w:r>
+        <w:rPr>
+          <w:b/>
+          <w:bCs/>
+          <w:highlight w:val="yellow"/>
+        </w:rPr>
+        <w:t xml:space="preserve"> for </w:t>
+      </w:r>
+      <w:proofErr w:type="spellStart"/>
+      <w:r>
+        <w:rPr>
+          <w:b/>
+          <w:bCs/>
+          <w:highlight w:val="yellow"/>
+        </w:rPr>
+        <w:t>Agriculture</w:t>
+      </w:r>
+      <w:proofErr w:type="spellEnd"/>
+      <w:r>
+        <w:rPr>
+          <w:highlight w:val="yellow"/>
+        </w:rPr>
+        <w:t>. Disponível em: &lt;</w:t>
+      </w:r>
+      <w:r>
+        <w:rPr>
+          <w:highlight w:val="yellow"/>
+        </w:rPr>
+        <w:t>https://www.mdpi.com/1424-8220/19/2/276</w:t>
+      </w:r>
+      <w:r>
+        <w:rPr>
+          <w:highlight w:val="yellow"/>
+        </w:rPr>
+        <w:t xml:space="preserve">&gt;. Acesso em: </w:t>
+      </w:r>
+      <w:r>
+        <w:rPr>
+          <w:highlight w:val="yellow"/>
+        </w:rPr>
+        <w:t xml:space="preserve">20 </w:t>
+      </w:r>
+      <w:proofErr w:type="spellStart"/>
+      <w:r>
+        <w:rPr>
+          <w:highlight w:val="yellow"/>
+        </w:rPr>
+        <w:t>a</w:t>
+      </w:r>
+      <w:r>
+        <w:rPr>
+          <w:highlight w:val="yellow"/>
+        </w:rPr>
+        <w:t>go</w:t>
+      </w:r>
+      <w:proofErr w:type="spellEnd"/>
+      <w:r>
+        <w:rPr>
+          <w:highlight w:val="yellow"/>
+        </w:rPr>
+        <w:t xml:space="preserve"> 2026</w:t>
+      </w:r>
+      <w:r>
+        <w:rPr>
+          <w:highlight w:val="yellow"/>
+        </w:rPr>
+        <w:t>.</w:t>
+      </w:r>
+    </w:p>
+    <w:p>
+      <w:pPr>
+        <w:pStyle w:val="ABNT-Referncias"/>
+        <w:rPr>
+          <w:highlight w:val="yellow"/>
+        </w:rPr>
+      </w:pPr>
+      <w:r>
+        <w:rPr>
+          <w:highlight w:val="yellow"/>
+        </w:rPr>
+        <w:t xml:space="preserve">SUNDMAEKER, H., Guillemin, P., </w:t>
+      </w:r>
+      <w:proofErr w:type="spellStart"/>
+      <w:r>
+        <w:rPr>
+          <w:highlight w:val="yellow"/>
+        </w:rPr>
+        <w:t>Friess</w:t>
+      </w:r>
+      <w:proofErr w:type="spellEnd"/>
+      <w:r>
+        <w:rPr>
+          <w:highlight w:val="yellow"/>
+        </w:rPr>
+        <w:t xml:space="preserve">, P. </w:t>
+      </w:r>
+      <w:proofErr w:type="spellStart"/>
+      <w:r>
+        <w:rPr>
+          <w:highlight w:val="yellow"/>
+        </w:rPr>
+        <w:t>and</w:t>
+      </w:r>
+      <w:proofErr w:type="spellEnd"/>
+      <w:r>
+        <w:rPr>
+          <w:highlight w:val="yellow"/>
+        </w:rPr>
+        <w:t xml:space="preserve"> </w:t>
+      </w:r>
+      <w:proofErr w:type="spellStart"/>
+      <w:r>
+        <w:rPr>
+          <w:highlight w:val="yellow"/>
+        </w:rPr>
+        <w:t>Woelfflé</w:t>
+      </w:r>
+      <w:proofErr w:type="spellEnd"/>
+      <w:r>
+        <w:rPr>
+          <w:highlight w:val="yellow"/>
+        </w:rPr>
+        <w:t xml:space="preserve">, S. (2010) </w:t>
+      </w:r>
+      <w:r>
+        <w:rPr>
+          <w:b/>
+          <w:bCs/>
+          <w:highlight w:val="yellow"/>
+        </w:rPr>
+        <w:t xml:space="preserve">Vision </w:t>
+      </w:r>
+      <w:proofErr w:type="spellStart"/>
+      <w:r>
+        <w:rPr>
+          <w:b/>
+          <w:bCs/>
+          <w:highlight w:val="yellow"/>
+        </w:rPr>
+        <w:t>and</w:t>
+      </w:r>
+      <w:proofErr w:type="spellEnd"/>
+      <w:r>
+        <w:rPr>
+          <w:b/>
+          <w:bCs/>
+          <w:highlight w:val="yellow"/>
+        </w:rPr>
+        <w:t xml:space="preserve"> </w:t>
+      </w:r>
+      <w:proofErr w:type="spellStart"/>
+      <w:r>
+        <w:rPr>
+          <w:b/>
+          <w:bCs/>
+          <w:highlight w:val="yellow"/>
+        </w:rPr>
+        <w:t>Challenges</w:t>
+      </w:r>
+      <w:proofErr w:type="spellEnd"/>
+      <w:r>
+        <w:rPr>
+          <w:b/>
+          <w:bCs/>
+          <w:highlight w:val="yellow"/>
+        </w:rPr>
+        <w:t xml:space="preserve"> for </w:t>
+      </w:r>
+      <w:proofErr w:type="spellStart"/>
+      <w:r>
+        <w:rPr>
+          <w:b/>
+          <w:bCs/>
+          <w:highlight w:val="yellow"/>
+        </w:rPr>
+        <w:t>Realising</w:t>
+      </w:r>
+      <w:proofErr w:type="spellEnd"/>
+      <w:r>
+        <w:rPr>
+          <w:b/>
+          <w:bCs/>
+          <w:highlight w:val="yellow"/>
+        </w:rPr>
+        <w:t xml:space="preserve"> </w:t>
+      </w:r>
+      <w:proofErr w:type="spellStart"/>
+      <w:r>
+        <w:rPr>
+          <w:b/>
+          <w:bCs/>
+          <w:highlight w:val="yellow"/>
+        </w:rPr>
+        <w:t>the</w:t>
+      </w:r>
+      <w:proofErr w:type="spellEnd"/>
+      <w:r>
+        <w:rPr>
+          <w:b/>
+          <w:bCs/>
+          <w:highlight w:val="yellow"/>
+        </w:rPr>
+        <w:t xml:space="preserve"> Internet </w:t>
+      </w:r>
+      <w:proofErr w:type="spellStart"/>
+      <w:r>
+        <w:rPr>
+          <w:b/>
+          <w:bCs/>
+          <w:highlight w:val="yellow"/>
+        </w:rPr>
+        <w:t>of</w:t>
+      </w:r>
+      <w:proofErr w:type="spellEnd"/>
+      <w:r>
+        <w:rPr>
+          <w:b/>
+          <w:bCs/>
+          <w:highlight w:val="yellow"/>
+        </w:rPr>
+        <w:t xml:space="preserve"> </w:t>
+      </w:r>
+      <w:proofErr w:type="spellStart"/>
+      <w:r>
+        <w:rPr>
+          <w:b/>
+          <w:bCs/>
+          <w:highlight w:val="yellow"/>
+        </w:rPr>
+        <w:t>Things</w:t>
+      </w:r>
+      <w:proofErr w:type="spellEnd"/>
+      <w:r>
+        <w:rPr>
+          <w:b/>
+          <w:bCs/>
+          <w:highlight w:val="yellow"/>
+        </w:rPr>
+        <w:t xml:space="preserve">, Cluster </w:t>
+      </w:r>
+      <w:proofErr w:type="spellStart"/>
+      <w:r>
+        <w:rPr>
+          <w:b/>
+          <w:bCs/>
+          <w:highlight w:val="yellow"/>
+        </w:rPr>
+        <w:t>of</w:t>
+      </w:r>
+      <w:proofErr w:type="spellEnd"/>
+      <w:r>
+        <w:rPr>
+          <w:b/>
+          <w:bCs/>
+          <w:highlight w:val="yellow"/>
+        </w:rPr>
+        <w:t xml:space="preserve"> </w:t>
+      </w:r>
+      <w:proofErr w:type="spellStart"/>
+      <w:r>
+        <w:rPr>
+          <w:b/>
+          <w:bCs/>
+          <w:highlight w:val="yellow"/>
+        </w:rPr>
+        <w:t>European</w:t>
+      </w:r>
+      <w:proofErr w:type="spellEnd"/>
+      <w:r>
+        <w:rPr>
+          <w:b/>
+          <w:bCs/>
+          <w:highlight w:val="yellow"/>
+        </w:rPr>
+        <w:t xml:space="preserve"> </w:t>
+      </w:r>
+      <w:proofErr w:type="spellStart"/>
+      <w:r>
+        <w:rPr>
+          <w:b/>
+          <w:bCs/>
+          <w:highlight w:val="yellow"/>
+        </w:rPr>
+        <w:t>Research</w:t>
+      </w:r>
+      <w:proofErr w:type="spellEnd"/>
+      <w:r>
+        <w:rPr>
+          <w:b/>
+          <w:bCs/>
+          <w:highlight w:val="yellow"/>
+        </w:rPr>
+        <w:t xml:space="preserve"> </w:t>
+      </w:r>
+      <w:proofErr w:type="spellStart"/>
+      <w:r>
+        <w:rPr>
+          <w:b/>
+          <w:bCs/>
+          <w:highlight w:val="yellow"/>
+        </w:rPr>
+        <w:t>Projects</w:t>
+      </w:r>
+      <w:proofErr w:type="spellEnd"/>
+      <w:r>
+        <w:rPr>
+          <w:b/>
+          <w:bCs/>
+          <w:highlight w:val="yellow"/>
+        </w:rPr>
+        <w:t xml:space="preserve"> </w:t>
+      </w:r>
+      <w:proofErr w:type="spellStart"/>
+      <w:r>
+        <w:rPr>
+          <w:b/>
+          <w:bCs/>
+          <w:highlight w:val="yellow"/>
+        </w:rPr>
+        <w:t>on</w:t>
+      </w:r>
+      <w:proofErr w:type="spellEnd"/>
+      <w:r>
+        <w:rPr>
+          <w:b/>
+          <w:bCs/>
+          <w:highlight w:val="yellow"/>
+        </w:rPr>
+        <w:t xml:space="preserve"> </w:t>
+      </w:r>
+      <w:proofErr w:type="spellStart"/>
+      <w:r>
+        <w:rPr>
+          <w:b/>
+          <w:bCs/>
+          <w:highlight w:val="yellow"/>
+        </w:rPr>
+        <w:t>the</w:t>
+      </w:r>
+      <w:proofErr w:type="spellEnd"/>
+      <w:r>
+        <w:rPr>
+          <w:b/>
+          <w:bCs/>
+          <w:highlight w:val="yellow"/>
+        </w:rPr>
+        <w:t xml:space="preserve"> Internet </w:t>
+      </w:r>
+      <w:proofErr w:type="spellStart"/>
+      <w:r>
+        <w:rPr>
+          <w:b/>
+          <w:bCs/>
+          <w:highlight w:val="yellow"/>
+        </w:rPr>
+        <w:t>of</w:t>
+      </w:r>
+      <w:proofErr w:type="spellEnd"/>
+      <w:r>
+        <w:rPr>
+          <w:b/>
+          <w:bCs/>
+          <w:highlight w:val="yellow"/>
+        </w:rPr>
+        <w:t xml:space="preserve"> </w:t>
+      </w:r>
+      <w:proofErr w:type="spellStart"/>
+      <w:r>
+        <w:rPr>
+          <w:b/>
+          <w:bCs/>
+          <w:highlight w:val="yellow"/>
+        </w:rPr>
+        <w:t>Things</w:t>
+      </w:r>
+      <w:proofErr w:type="spellEnd"/>
+      <w:r>
+        <w:rPr>
+          <w:highlight w:val="yellow"/>
+        </w:rPr>
+        <w:t xml:space="preserve"> — CERP IoT. Disponível em: &lt;</w:t>
+      </w:r>
+      <w:r>
+        <w:rPr>
+          <w:highlight w:val="yellow"/>
+        </w:rPr>
+        <w:t xml:space="preserve"> https://www.researchgate.net/publication/228664767_Vision_and_Challenges_for_Realizing_the_Internet_of_Things </w:t>
+      </w:r>
+      <w:r>
+        <w:rPr>
+          <w:highlight w:val="yellow"/>
+        </w:rPr>
+        <w:t xml:space="preserve">&gt;. Acesso em: </w:t>
+      </w:r>
+      <w:r>
+        <w:rPr>
+          <w:highlight w:val="yellow"/>
+        </w:rPr>
+        <w:t xml:space="preserve">18 </w:t>
+      </w:r>
+      <w:proofErr w:type="spellStart"/>
+      <w:r>
+        <w:rPr>
+          <w:highlight w:val="yellow"/>
+        </w:rPr>
+        <w:t>a</w:t>
+      </w:r>
+      <w:r>
+        <w:rPr>
+          <w:highlight w:val="yellow"/>
+        </w:rPr>
+        <w:t>go</w:t>
+      </w:r>
+      <w:proofErr w:type="spellEnd"/>
+      <w:r>
+        <w:rPr>
+          <w:highlight w:val="yellow"/>
+        </w:rPr>
+        <w:t xml:space="preserve"> 2026</w:t>
+      </w:r>
+      <w:r>
+        <w:rPr>
+          <w:highlight w:val="yellow"/>
+        </w:rPr>
+        <w:t>.</w:t>
+      </w:r>
+    </w:p>
+    <w:p>
+      <w:pPr>
+        <w:pStyle w:val="ABNT-Referncias"/>
+        <w:rPr>
+          <w:highlight w:val="yellow"/>
+        </w:rPr>
+      </w:pPr>
+    </w:p>
+    <w:p>
+      <w:pPr>
+        <w:pStyle w:val="ABNT-Referncias"/>
+      </w:pPr>
+      <w:r>
+        <w:rPr>
+          <w:highlight w:val="yellow"/>
+        </w:rPr>
+        <w:t>WOLFERT</w:t>
+      </w:r>
+      <w:r>
+        <w:rPr>
+          <w:highlight w:val="yellow"/>
+        </w:rPr>
+        <w:t xml:space="preserve">, S., Ge, L., </w:t>
+      </w:r>
+      <w:proofErr w:type="spellStart"/>
+      <w:r>
+        <w:rPr>
+          <w:highlight w:val="yellow"/>
+        </w:rPr>
+        <w:t>Verdouw</w:t>
+      </w:r>
+      <w:proofErr w:type="spellEnd"/>
+      <w:r>
+        <w:rPr>
+          <w:highlight w:val="yellow"/>
+        </w:rPr>
+        <w:t xml:space="preserve">, C., &amp; </w:t>
+      </w:r>
+      <w:proofErr w:type="spellStart"/>
+      <w:r>
+        <w:rPr>
+          <w:highlight w:val="yellow"/>
+        </w:rPr>
+        <w:t>Bogaardt</w:t>
+      </w:r>
+      <w:proofErr w:type="spellEnd"/>
+      <w:r>
+        <w:rPr>
+          <w:highlight w:val="yellow"/>
+        </w:rPr>
+        <w:t xml:space="preserve">, M. J. (2017) </w:t>
+      </w:r>
+      <w:r>
+        <w:rPr>
+          <w:b/>
+          <w:bCs/>
+          <w:highlight w:val="yellow"/>
+        </w:rPr>
+        <w:t xml:space="preserve">Big Data in </w:t>
+      </w:r>
+      <w:proofErr w:type="spellStart"/>
+      <w:r>
+        <w:rPr>
+          <w:b/>
+          <w:bCs/>
+          <w:highlight w:val="yellow"/>
+        </w:rPr>
+        <w:t>Smart</w:t>
+      </w:r>
+      <w:proofErr w:type="spellEnd"/>
+      <w:r>
+        <w:rPr>
+          <w:b/>
+          <w:bCs/>
+          <w:highlight w:val="yellow"/>
+        </w:rPr>
+        <w:t xml:space="preserve"> </w:t>
+      </w:r>
+      <w:proofErr w:type="spellStart"/>
+      <w:r>
+        <w:rPr>
+          <w:b/>
+          <w:bCs/>
+          <w:highlight w:val="yellow"/>
+        </w:rPr>
+        <w:t>Farming</w:t>
+      </w:r>
+      <w:proofErr w:type="spellEnd"/>
+      <w:r>
+        <w:rPr>
+          <w:b/>
+          <w:bCs/>
+          <w:highlight w:val="yellow"/>
+        </w:rPr>
+        <w:t xml:space="preserve"> </w:t>
+      </w:r>
+      <w:r>
+        <w:rPr>
+          <w:b/>
+          <w:bCs/>
+          <w:highlight w:val="yellow"/>
+        </w:rPr>
+        <w:t>—</w:t>
+      </w:r>
+      <w:r>
+        <w:rPr>
+          <w:b/>
+          <w:bCs/>
+          <w:highlight w:val="yellow"/>
+        </w:rPr>
+        <w:t xml:space="preserve"> </w:t>
+      </w:r>
+      <w:r>
+        <w:rPr>
+          <w:b/>
+          <w:bCs/>
+          <w:highlight w:val="yellow"/>
+        </w:rPr>
         <w:t>A Review</w:t>
       </w:r>
       <w:r>
         <w:rPr>
           <w:highlight w:val="yellow"/>
         </w:rPr>
-        <w:t>. Agricultural Systems. Disponível em: &lt;</w:t>
+        <w:t xml:space="preserve">. </w:t>
+      </w:r>
+      <w:proofErr w:type="spellStart"/>
+      <w:r>
+        <w:rPr>
+          <w:highlight w:val="yellow"/>
+        </w:rPr>
+        <w:t>Agricultural</w:t>
+      </w:r>
+      <w:proofErr w:type="spellEnd"/>
+      <w:r>
+        <w:rPr>
+          <w:highlight w:val="yellow"/>
+        </w:rPr>
+        <w:t xml:space="preserve"> Systems. Disponível em: &lt;</w:t>
       </w:r>
       <w:r>
         <w:rPr>
@@ -3027,6 +3931,7 @@
         </w:rPr>
         <w:t xml:space="preserve">15 </w:t>
       </w:r>
+      <w:proofErr w:type="spellStart"/>
       <w:r>
         <w:rPr>
           <w:highlight w:val="yellow"/>
@@ -3037,7 +3942,14 @@
         <w:rPr>
           <w:highlight w:val="yellow"/>
         </w:rPr>
-        <w:t>ai 2026</w:t>
+        <w:t>ai</w:t>
+      </w:r>
+      <w:proofErr w:type="spellEnd"/>
+      <w:r>
+        <w:rPr>
+          <w:highlight w:val="yellow"/>
+        </w:rPr>
+        <w:t xml:space="preserve"> 2026</w:t>
       </w:r>
       <w:r>
         <w:rPr>
@@ -3077,7 +3989,23 @@
           <w:rFonts w:ascii="Arial" w:hAnsi="Arial" w:cs="Arial"/>
           <w:highlight w:val="yellow"/>
         </w:rPr>
-        <w:t xml:space="preserve">Reproduz-se abaixo a função responsável pela lógica central do motor de alertas do sistema, descrita na Seção 5.3.2, extraída do arquivo alerts.service.js do back-end. A função é executada após o registro de cada medição e decide, para cada variável monitorada, entre abrir um novo evento de alerta, atualizar o valor de pico de um </w:t>
+        <w:t xml:space="preserve">Reproduz-se abaixo a função responsável pela lógica central do motor de alertas do sistema, descrita na Seção 5.3.2, extraída do arquivo alerts.service.js do </w:t>
+      </w:r>
+      <w:proofErr w:type="spellStart"/>
+      <w:r>
+        <w:rPr>
+          <w:rFonts w:ascii="Arial" w:hAnsi="Arial" w:cs="Arial"/>
+          <w:highlight w:val="yellow"/>
+        </w:rPr>
+        <w:t>back</w:t>
+      </w:r>
+      <w:proofErr w:type="spellEnd"/>
+      <w:r>
+        <w:rPr>
+          <w:rFonts w:ascii="Arial" w:hAnsi="Arial" w:cs="Arial"/>
+          <w:highlight w:val="yellow"/>
+        </w:rPr>
+        <w:t xml:space="preserve">-end. A função é executada após o registro de cada medição e decide, para cada variável monitorada, entre abrir um novo evento de alerta, atualizar o valor de pico de um </w:t>
       </w:r>
       <w:r>
         <w:rPr>
@@ -3127,14 +4055,107 @@
               </w:rPr>
             </w:pPr>
             <w:bookmarkStart w:id="10" w:name="_Hlk238797315"/>
-            <w:r>
-              <w:rPr>
-                <w:rFonts w:ascii="Arial" w:eastAsia="Courier New" w:hAnsi="Arial" w:cs="Arial"/>
-                <w:sz w:val="18"/>
-                <w:szCs w:val="18"/>
-                <w:highlight w:val="yellow"/>
-              </w:rPr>
-              <w:t>async function evaluateMeasurement(measurement, device, thresholds,</w:t>
+            <w:proofErr w:type="spellStart"/>
+            <w:r>
+              <w:rPr>
+                <w:rFonts w:ascii="Arial" w:eastAsia="Courier New" w:hAnsi="Arial" w:cs="Arial"/>
+                <w:sz w:val="18"/>
+                <w:szCs w:val="18"/>
+                <w:highlight w:val="yellow"/>
+              </w:rPr>
+              <w:t>async</w:t>
+            </w:r>
+            <w:proofErr w:type="spellEnd"/>
+            <w:r>
+              <w:rPr>
+                <w:rFonts w:ascii="Arial" w:eastAsia="Courier New" w:hAnsi="Arial" w:cs="Arial"/>
+                <w:sz w:val="18"/>
+                <w:szCs w:val="18"/>
+                <w:highlight w:val="yellow"/>
+              </w:rPr>
+              <w:t xml:space="preserve"> </w:t>
+            </w:r>
+            <w:proofErr w:type="spellStart"/>
+            <w:r>
+              <w:rPr>
+                <w:rFonts w:ascii="Arial" w:eastAsia="Courier New" w:hAnsi="Arial" w:cs="Arial"/>
+                <w:sz w:val="18"/>
+                <w:szCs w:val="18"/>
+                <w:highlight w:val="yellow"/>
+              </w:rPr>
+              <w:t>function</w:t>
+            </w:r>
+            <w:proofErr w:type="spellEnd"/>
+            <w:r>
+              <w:rPr>
+                <w:rFonts w:ascii="Arial" w:eastAsia="Courier New" w:hAnsi="Arial" w:cs="Arial"/>
+                <w:sz w:val="18"/>
+                <w:szCs w:val="18"/>
+                <w:highlight w:val="yellow"/>
+              </w:rPr>
+              <w:t xml:space="preserve"> </w:t>
+            </w:r>
+            <w:proofErr w:type="spellStart"/>
+            <w:proofErr w:type="gramStart"/>
+            <w:r>
+              <w:rPr>
+                <w:rFonts w:ascii="Arial" w:eastAsia="Courier New" w:hAnsi="Arial" w:cs="Arial"/>
+                <w:sz w:val="18"/>
+                <w:szCs w:val="18"/>
+                <w:highlight w:val="yellow"/>
+              </w:rPr>
+              <w:t>evaluateMeasurement</w:t>
+            </w:r>
+            <w:proofErr w:type="spellEnd"/>
+            <w:r>
+              <w:rPr>
+                <w:rFonts w:ascii="Arial" w:eastAsia="Courier New" w:hAnsi="Arial" w:cs="Arial"/>
+                <w:sz w:val="18"/>
+                <w:szCs w:val="18"/>
+                <w:highlight w:val="yellow"/>
+              </w:rPr>
+              <w:t>(</w:t>
+            </w:r>
+            <w:proofErr w:type="spellStart"/>
+            <w:proofErr w:type="gramEnd"/>
+            <w:r>
+              <w:rPr>
+                <w:rFonts w:ascii="Arial" w:eastAsia="Courier New" w:hAnsi="Arial" w:cs="Arial"/>
+                <w:sz w:val="18"/>
+                <w:szCs w:val="18"/>
+                <w:highlight w:val="yellow"/>
+              </w:rPr>
+              <w:t>measurement</w:t>
+            </w:r>
+            <w:proofErr w:type="spellEnd"/>
+            <w:r>
+              <w:rPr>
+                <w:rFonts w:ascii="Arial" w:eastAsia="Courier New" w:hAnsi="Arial" w:cs="Arial"/>
+                <w:sz w:val="18"/>
+                <w:szCs w:val="18"/>
+                <w:highlight w:val="yellow"/>
+              </w:rPr>
+              <w:t xml:space="preserve">, device, </w:t>
+            </w:r>
+            <w:proofErr w:type="spellStart"/>
+            <w:r>
+              <w:rPr>
+                <w:rFonts w:ascii="Arial" w:eastAsia="Courier New" w:hAnsi="Arial" w:cs="Arial"/>
+                <w:sz w:val="18"/>
+                <w:szCs w:val="18"/>
+                <w:highlight w:val="yellow"/>
+              </w:rPr>
+              <w:t>thresholds</w:t>
+            </w:r>
+            <w:proofErr w:type="spellEnd"/>
+            <w:r>
+              <w:rPr>
+                <w:rFonts w:ascii="Arial" w:eastAsia="Courier New" w:hAnsi="Arial" w:cs="Arial"/>
+                <w:sz w:val="18"/>
+                <w:szCs w:val="18"/>
+                <w:highlight w:val="yellow"/>
+              </w:rPr>
+              <w:t>,</w:t>
             </w:r>
           </w:p>
           <w:p>
@@ -3151,7 +4172,118 @@
                 <w:szCs w:val="18"/>
                 <w:highlight w:val="yellow"/>
               </w:rPr>
-              <w:t xml:space="preserve">  notifyFlags = { temperature: true, humidity: true }) {</w:t>
+              <w:t xml:space="preserve">  </w:t>
+            </w:r>
+            <w:proofErr w:type="spellStart"/>
+            <w:r>
+              <w:rPr>
+                <w:rFonts w:ascii="Arial" w:eastAsia="Courier New" w:hAnsi="Arial" w:cs="Arial"/>
+                <w:sz w:val="18"/>
+                <w:szCs w:val="18"/>
+                <w:highlight w:val="yellow"/>
+              </w:rPr>
+              <w:t>notifyFlags</w:t>
+            </w:r>
+            <w:proofErr w:type="spellEnd"/>
+            <w:r>
+              <w:rPr>
+                <w:rFonts w:ascii="Arial" w:eastAsia="Courier New" w:hAnsi="Arial" w:cs="Arial"/>
+                <w:sz w:val="18"/>
+                <w:szCs w:val="18"/>
+                <w:highlight w:val="yellow"/>
+              </w:rPr>
+              <w:t xml:space="preserve"> = </w:t>
+            </w:r>
+            <w:proofErr w:type="gramStart"/>
+            <w:r>
+              <w:rPr>
+                <w:rFonts w:ascii="Arial" w:eastAsia="Courier New" w:hAnsi="Arial" w:cs="Arial"/>
+                <w:sz w:val="18"/>
+                <w:szCs w:val="18"/>
+                <w:highlight w:val="yellow"/>
+              </w:rPr>
+              <w:t xml:space="preserve">{ </w:t>
+            </w:r>
+            <w:proofErr w:type="spellStart"/>
+            <w:r>
+              <w:rPr>
+                <w:rFonts w:ascii="Arial" w:eastAsia="Courier New" w:hAnsi="Arial" w:cs="Arial"/>
+                <w:sz w:val="18"/>
+                <w:szCs w:val="18"/>
+                <w:highlight w:val="yellow"/>
+              </w:rPr>
+              <w:t>temperature</w:t>
+            </w:r>
+            <w:proofErr w:type="spellEnd"/>
+            <w:proofErr w:type="gramEnd"/>
+            <w:r>
+              <w:rPr>
+                <w:rFonts w:ascii="Arial" w:eastAsia="Courier New" w:hAnsi="Arial" w:cs="Arial"/>
+                <w:sz w:val="18"/>
+                <w:szCs w:val="18"/>
+                <w:highlight w:val="yellow"/>
+              </w:rPr>
+              <w:t xml:space="preserve">: </w:t>
+            </w:r>
+            <w:proofErr w:type="spellStart"/>
+            <w:r>
+              <w:rPr>
+                <w:rFonts w:ascii="Arial" w:eastAsia="Courier New" w:hAnsi="Arial" w:cs="Arial"/>
+                <w:sz w:val="18"/>
+                <w:szCs w:val="18"/>
+                <w:highlight w:val="yellow"/>
+              </w:rPr>
+              <w:t>true</w:t>
+            </w:r>
+            <w:proofErr w:type="spellEnd"/>
+            <w:r>
+              <w:rPr>
+                <w:rFonts w:ascii="Arial" w:eastAsia="Courier New" w:hAnsi="Arial" w:cs="Arial"/>
+                <w:sz w:val="18"/>
+                <w:szCs w:val="18"/>
+                <w:highlight w:val="yellow"/>
+              </w:rPr>
+              <w:t xml:space="preserve">, </w:t>
+            </w:r>
+            <w:proofErr w:type="spellStart"/>
+            <w:r>
+              <w:rPr>
+                <w:rFonts w:ascii="Arial" w:eastAsia="Courier New" w:hAnsi="Arial" w:cs="Arial"/>
+                <w:sz w:val="18"/>
+                <w:szCs w:val="18"/>
+                <w:highlight w:val="yellow"/>
+              </w:rPr>
+              <w:t>humidity</w:t>
+            </w:r>
+            <w:proofErr w:type="spellEnd"/>
+            <w:r>
+              <w:rPr>
+                <w:rFonts w:ascii="Arial" w:eastAsia="Courier New" w:hAnsi="Arial" w:cs="Arial"/>
+                <w:sz w:val="18"/>
+                <w:szCs w:val="18"/>
+                <w:highlight w:val="yellow"/>
+              </w:rPr>
+              <w:t xml:space="preserve">: </w:t>
+            </w:r>
+            <w:proofErr w:type="spellStart"/>
+            <w:r>
+              <w:rPr>
+                <w:rFonts w:ascii="Arial" w:eastAsia="Courier New" w:hAnsi="Arial" w:cs="Arial"/>
+                <w:sz w:val="18"/>
+                <w:szCs w:val="18"/>
+                <w:highlight w:val="yellow"/>
+              </w:rPr>
+              <w:t>true</w:t>
+            </w:r>
+            <w:proofErr w:type="spellEnd"/>
+            <w:r>
+              <w:rPr>
+                <w:rFonts w:ascii="Arial" w:eastAsia="Courier New" w:hAnsi="Arial" w:cs="Arial"/>
+                <w:sz w:val="18"/>
+                <w:szCs w:val="18"/>
+                <w:highlight w:val="yellow"/>
+              </w:rPr>
+              <w:t xml:space="preserve"> }) {</w:t>
             </w:r>
           </w:p>
           <w:p>
@@ -3168,7 +4300,67 @@
                 <w:szCs w:val="18"/>
                 <w:highlight w:val="yellow"/>
               </w:rPr>
-              <w:t xml:space="preserve">  for (const variable of VARIABLES) {</w:t>
+              <w:t xml:space="preserve">  for (</w:t>
+            </w:r>
+            <w:proofErr w:type="spellStart"/>
+            <w:r>
+              <w:rPr>
+                <w:rFonts w:ascii="Arial" w:eastAsia="Courier New" w:hAnsi="Arial" w:cs="Arial"/>
+                <w:sz w:val="18"/>
+                <w:szCs w:val="18"/>
+                <w:highlight w:val="yellow"/>
+              </w:rPr>
+              <w:t>const</w:t>
+            </w:r>
+            <w:proofErr w:type="spellEnd"/>
+            <w:r>
+              <w:rPr>
+                <w:rFonts w:ascii="Arial" w:eastAsia="Courier New" w:hAnsi="Arial" w:cs="Arial"/>
+                <w:sz w:val="18"/>
+                <w:szCs w:val="18"/>
+                <w:highlight w:val="yellow"/>
+              </w:rPr>
+              <w:t xml:space="preserve"> </w:t>
+            </w:r>
+            <w:proofErr w:type="spellStart"/>
+            <w:r>
+              <w:rPr>
+                <w:rFonts w:ascii="Arial" w:eastAsia="Courier New" w:hAnsi="Arial" w:cs="Arial"/>
+                <w:sz w:val="18"/>
+                <w:szCs w:val="18"/>
+                <w:highlight w:val="yellow"/>
+              </w:rPr>
+              <w:t>variable</w:t>
+            </w:r>
+            <w:proofErr w:type="spellEnd"/>
+            <w:r>
+              <w:rPr>
+                <w:rFonts w:ascii="Arial" w:eastAsia="Courier New" w:hAnsi="Arial" w:cs="Arial"/>
+                <w:sz w:val="18"/>
+                <w:szCs w:val="18"/>
+                <w:highlight w:val="yellow"/>
+              </w:rPr>
+              <w:t xml:space="preserve"> </w:t>
+            </w:r>
+            <w:proofErr w:type="spellStart"/>
+            <w:r>
+              <w:rPr>
+                <w:rFonts w:ascii="Arial" w:eastAsia="Courier New" w:hAnsi="Arial" w:cs="Arial"/>
+                <w:sz w:val="18"/>
+                <w:szCs w:val="18"/>
+                <w:highlight w:val="yellow"/>
+              </w:rPr>
+              <w:t>of</w:t>
+            </w:r>
+            <w:proofErr w:type="spellEnd"/>
+            <w:r>
+              <w:rPr>
+                <w:rFonts w:ascii="Arial" w:eastAsia="Courier New" w:hAnsi="Arial" w:cs="Arial"/>
+                <w:sz w:val="18"/>
+                <w:szCs w:val="18"/>
+                <w:highlight w:val="yellow"/>
+              </w:rPr>
+              <w:t xml:space="preserve"> VARIABLES) {</w:t>
             </w:r>
           </w:p>
           <w:p>
@@ -3185,7 +4377,107 @@
                 <w:szCs w:val="18"/>
                 <w:highlight w:val="yellow"/>
               </w:rPr>
-              <w:t xml:space="preserve">    const value = Number(measurement[variable]);</w:t>
+              <w:t xml:space="preserve">    </w:t>
+            </w:r>
+            <w:proofErr w:type="spellStart"/>
+            <w:r>
+              <w:rPr>
+                <w:rFonts w:ascii="Arial" w:eastAsia="Courier New" w:hAnsi="Arial" w:cs="Arial"/>
+                <w:sz w:val="18"/>
+                <w:szCs w:val="18"/>
+                <w:highlight w:val="yellow"/>
+              </w:rPr>
+              <w:t>const</w:t>
+            </w:r>
+            <w:proofErr w:type="spellEnd"/>
+            <w:r>
+              <w:rPr>
+                <w:rFonts w:ascii="Arial" w:eastAsia="Courier New" w:hAnsi="Arial" w:cs="Arial"/>
+                <w:sz w:val="18"/>
+                <w:szCs w:val="18"/>
+                <w:highlight w:val="yellow"/>
+              </w:rPr>
+              <w:t xml:space="preserve"> </w:t>
+            </w:r>
+            <w:proofErr w:type="spellStart"/>
+            <w:r>
+              <w:rPr>
+                <w:rFonts w:ascii="Arial" w:eastAsia="Courier New" w:hAnsi="Arial" w:cs="Arial"/>
+                <w:sz w:val="18"/>
+                <w:szCs w:val="18"/>
+                <w:highlight w:val="yellow"/>
+              </w:rPr>
+              <w:t>value</w:t>
+            </w:r>
+            <w:proofErr w:type="spellEnd"/>
+            <w:r>
+              <w:rPr>
+                <w:rFonts w:ascii="Arial" w:eastAsia="Courier New" w:hAnsi="Arial" w:cs="Arial"/>
+                <w:sz w:val="18"/>
+                <w:szCs w:val="18"/>
+                <w:highlight w:val="yellow"/>
+              </w:rPr>
+              <w:t xml:space="preserve"> = </w:t>
+            </w:r>
+            <w:proofErr w:type="spellStart"/>
+            <w:r>
+              <w:rPr>
+                <w:rFonts w:ascii="Arial" w:eastAsia="Courier New" w:hAnsi="Arial" w:cs="Arial"/>
+                <w:sz w:val="18"/>
+                <w:szCs w:val="18"/>
+                <w:highlight w:val="yellow"/>
+              </w:rPr>
+              <w:t>Number</w:t>
+            </w:r>
+            <w:proofErr w:type="spellEnd"/>
+            <w:r>
+              <w:rPr>
+                <w:rFonts w:ascii="Arial" w:eastAsia="Courier New" w:hAnsi="Arial" w:cs="Arial"/>
+                <w:sz w:val="18"/>
+                <w:szCs w:val="18"/>
+                <w:highlight w:val="yellow"/>
+              </w:rPr>
+              <w:t>(</w:t>
+            </w:r>
+            <w:proofErr w:type="spellStart"/>
+            <w:r>
+              <w:rPr>
+                <w:rFonts w:ascii="Arial" w:eastAsia="Courier New" w:hAnsi="Arial" w:cs="Arial"/>
+                <w:sz w:val="18"/>
+                <w:szCs w:val="18"/>
+                <w:highlight w:val="yellow"/>
+              </w:rPr>
+              <w:t>measurement</w:t>
+            </w:r>
+            <w:proofErr w:type="spellEnd"/>
+            <w:r>
+              <w:rPr>
+                <w:rFonts w:ascii="Arial" w:eastAsia="Courier New" w:hAnsi="Arial" w:cs="Arial"/>
+                <w:sz w:val="18"/>
+                <w:szCs w:val="18"/>
+                <w:highlight w:val="yellow"/>
+              </w:rPr>
+              <w:t>[</w:t>
+            </w:r>
+            <w:proofErr w:type="spellStart"/>
+            <w:r>
+              <w:rPr>
+                <w:rFonts w:ascii="Arial" w:eastAsia="Courier New" w:hAnsi="Arial" w:cs="Arial"/>
+                <w:sz w:val="18"/>
+                <w:szCs w:val="18"/>
+                <w:highlight w:val="yellow"/>
+              </w:rPr>
+              <w:t>variable</w:t>
+            </w:r>
+            <w:proofErr w:type="spellEnd"/>
+            <w:r>
+              <w:rPr>
+                <w:rFonts w:ascii="Arial" w:eastAsia="Courier New" w:hAnsi="Arial" w:cs="Arial"/>
+                <w:sz w:val="18"/>
+                <w:szCs w:val="18"/>
+                <w:highlight w:val="yellow"/>
+              </w:rPr>
+              <w:t>]);</w:t>
             </w:r>
           </w:p>
           <w:p>
@@ -3202,7 +4494,107 @@
                 <w:szCs w:val="18"/>
                 <w:highlight w:val="yellow"/>
               </w:rPr>
-              <w:t xml:space="preserve">    const { min, max } = thresholds[variable];</w:t>
+              <w:t xml:space="preserve">    </w:t>
+            </w:r>
+            <w:proofErr w:type="spellStart"/>
+            <w:r>
+              <w:rPr>
+                <w:rFonts w:ascii="Arial" w:eastAsia="Courier New" w:hAnsi="Arial" w:cs="Arial"/>
+                <w:sz w:val="18"/>
+                <w:szCs w:val="18"/>
+                <w:highlight w:val="yellow"/>
+              </w:rPr>
+              <w:t>const</w:t>
+            </w:r>
+            <w:proofErr w:type="spellEnd"/>
+            <w:r>
+              <w:rPr>
+                <w:rFonts w:ascii="Arial" w:eastAsia="Courier New" w:hAnsi="Arial" w:cs="Arial"/>
+                <w:sz w:val="18"/>
+                <w:szCs w:val="18"/>
+                <w:highlight w:val="yellow"/>
+              </w:rPr>
+              <w:t xml:space="preserve"> </w:t>
+            </w:r>
+            <w:proofErr w:type="gramStart"/>
+            <w:r>
+              <w:rPr>
+                <w:rFonts w:ascii="Arial" w:eastAsia="Courier New" w:hAnsi="Arial" w:cs="Arial"/>
+                <w:sz w:val="18"/>
+                <w:szCs w:val="18"/>
+                <w:highlight w:val="yellow"/>
+              </w:rPr>
+              <w:t>{ min</w:t>
+            </w:r>
+            <w:proofErr w:type="gramEnd"/>
+            <w:r>
+              <w:rPr>
+                <w:rFonts w:ascii="Arial" w:eastAsia="Courier New" w:hAnsi="Arial" w:cs="Arial"/>
+                <w:sz w:val="18"/>
+                <w:szCs w:val="18"/>
+                <w:highlight w:val="yellow"/>
+              </w:rPr>
+              <w:t xml:space="preserve">, </w:t>
+            </w:r>
+            <w:proofErr w:type="spellStart"/>
+            <w:r>
+              <w:rPr>
+                <w:rFonts w:ascii="Arial" w:eastAsia="Courier New" w:hAnsi="Arial" w:cs="Arial"/>
+                <w:sz w:val="18"/>
+                <w:szCs w:val="18"/>
+                <w:highlight w:val="yellow"/>
+              </w:rPr>
+              <w:t>max</w:t>
+            </w:r>
+            <w:proofErr w:type="spellEnd"/>
+            <w:r>
+              <w:rPr>
+                <w:rFonts w:ascii="Arial" w:eastAsia="Courier New" w:hAnsi="Arial" w:cs="Arial"/>
+                <w:sz w:val="18"/>
+                <w:szCs w:val="18"/>
+                <w:highlight w:val="yellow"/>
+              </w:rPr>
+              <w:t xml:space="preserve"> } = </w:t>
+            </w:r>
+            <w:proofErr w:type="spellStart"/>
+            <w:r>
+              <w:rPr>
+                <w:rFonts w:ascii="Arial" w:eastAsia="Courier New" w:hAnsi="Arial" w:cs="Arial"/>
+                <w:sz w:val="18"/>
+                <w:szCs w:val="18"/>
+                <w:highlight w:val="yellow"/>
+              </w:rPr>
+              <w:t>thresholds</w:t>
+            </w:r>
+            <w:proofErr w:type="spellEnd"/>
+            <w:r>
+              <w:rPr>
+                <w:rFonts w:ascii="Arial" w:eastAsia="Courier New" w:hAnsi="Arial" w:cs="Arial"/>
+                <w:sz w:val="18"/>
+                <w:szCs w:val="18"/>
+                <w:highlight w:val="yellow"/>
+              </w:rPr>
+              <w:t>[</w:t>
+            </w:r>
+            <w:proofErr w:type="spellStart"/>
+            <w:r>
+              <w:rPr>
+                <w:rFonts w:ascii="Arial" w:eastAsia="Courier New" w:hAnsi="Arial" w:cs="Arial"/>
+                <w:sz w:val="18"/>
+                <w:szCs w:val="18"/>
+                <w:highlight w:val="yellow"/>
+              </w:rPr>
+              <w:t>variable</w:t>
+            </w:r>
+            <w:proofErr w:type="spellEnd"/>
+            <w:r>
+              <w:rPr>
+                <w:rFonts w:ascii="Arial" w:eastAsia="Courier New" w:hAnsi="Arial" w:cs="Arial"/>
+                <w:sz w:val="18"/>
+                <w:szCs w:val="18"/>
+                <w:highlight w:val="yellow"/>
+              </w:rPr>
+              <w:t>];</w:t>
             </w:r>
           </w:p>
           <w:p>
@@ -3219,7 +4611,107 @@
                 <w:szCs w:val="18"/>
                 <w:highlight w:val="yellow"/>
               </w:rPr>
-              <w:t xml:space="preserve">    const isOutOfRange = value &lt; min || value &gt; max;</w:t>
+              <w:t xml:space="preserve">    </w:t>
+            </w:r>
+            <w:proofErr w:type="spellStart"/>
+            <w:r>
+              <w:rPr>
+                <w:rFonts w:ascii="Arial" w:eastAsia="Courier New" w:hAnsi="Arial" w:cs="Arial"/>
+                <w:sz w:val="18"/>
+                <w:szCs w:val="18"/>
+                <w:highlight w:val="yellow"/>
+              </w:rPr>
+              <w:t>const</w:t>
+            </w:r>
+            <w:proofErr w:type="spellEnd"/>
+            <w:r>
+              <w:rPr>
+                <w:rFonts w:ascii="Arial" w:eastAsia="Courier New" w:hAnsi="Arial" w:cs="Arial"/>
+                <w:sz w:val="18"/>
+                <w:szCs w:val="18"/>
+                <w:highlight w:val="yellow"/>
+              </w:rPr>
+              <w:t xml:space="preserve"> </w:t>
+            </w:r>
+            <w:proofErr w:type="spellStart"/>
+            <w:r>
+              <w:rPr>
+                <w:rFonts w:ascii="Arial" w:eastAsia="Courier New" w:hAnsi="Arial" w:cs="Arial"/>
+                <w:sz w:val="18"/>
+                <w:szCs w:val="18"/>
+                <w:highlight w:val="yellow"/>
+              </w:rPr>
+              <w:t>isOutOfRange</w:t>
+            </w:r>
+            <w:proofErr w:type="spellEnd"/>
+            <w:r>
+              <w:rPr>
+                <w:rFonts w:ascii="Arial" w:eastAsia="Courier New" w:hAnsi="Arial" w:cs="Arial"/>
+                <w:sz w:val="18"/>
+                <w:szCs w:val="18"/>
+                <w:highlight w:val="yellow"/>
+              </w:rPr>
+              <w:t xml:space="preserve"> = </w:t>
+            </w:r>
+            <w:proofErr w:type="spellStart"/>
+            <w:r>
+              <w:rPr>
+                <w:rFonts w:ascii="Arial" w:eastAsia="Courier New" w:hAnsi="Arial" w:cs="Arial"/>
+                <w:sz w:val="18"/>
+                <w:szCs w:val="18"/>
+                <w:highlight w:val="yellow"/>
+              </w:rPr>
+              <w:t>value</w:t>
+            </w:r>
+            <w:proofErr w:type="spellEnd"/>
+            <w:r>
+              <w:rPr>
+                <w:rFonts w:ascii="Arial" w:eastAsia="Courier New" w:hAnsi="Arial" w:cs="Arial"/>
+                <w:sz w:val="18"/>
+                <w:szCs w:val="18"/>
+                <w:highlight w:val="yellow"/>
+              </w:rPr>
+              <w:t xml:space="preserve"> &lt; min || </w:t>
+            </w:r>
+            <w:proofErr w:type="spellStart"/>
+            <w:r>
+              <w:rPr>
+                <w:rFonts w:ascii="Arial" w:eastAsia="Courier New" w:hAnsi="Arial" w:cs="Arial"/>
+                <w:sz w:val="18"/>
+                <w:szCs w:val="18"/>
+                <w:highlight w:val="yellow"/>
+              </w:rPr>
+              <w:t>value</w:t>
+            </w:r>
+            <w:proofErr w:type="spellEnd"/>
+            <w:r>
+              <w:rPr>
+                <w:rFonts w:ascii="Arial" w:eastAsia="Courier New" w:hAnsi="Arial" w:cs="Arial"/>
+                <w:sz w:val="18"/>
+                <w:szCs w:val="18"/>
+                <w:highlight w:val="yellow"/>
+              </w:rPr>
+              <w:t xml:space="preserve"> &gt; </w:t>
+            </w:r>
+            <w:proofErr w:type="spellStart"/>
+            <w:r>
+              <w:rPr>
+                <w:rFonts w:ascii="Arial" w:eastAsia="Courier New" w:hAnsi="Arial" w:cs="Arial"/>
+                <w:sz w:val="18"/>
+                <w:szCs w:val="18"/>
+                <w:highlight w:val="yellow"/>
+              </w:rPr>
+              <w:t>max</w:t>
+            </w:r>
+            <w:proofErr w:type="spellEnd"/>
+            <w:r>
+              <w:rPr>
+                <w:rFonts w:ascii="Arial" w:eastAsia="Courier New" w:hAnsi="Arial" w:cs="Arial"/>
+                <w:sz w:val="18"/>
+                <w:szCs w:val="18"/>
+                <w:highlight w:val="yellow"/>
+              </w:rPr>
+              <w:t>;</w:t>
             </w:r>
           </w:p>
           <w:p>
@@ -3253,7 +4745,98 @@
                 <w:szCs w:val="18"/>
                 <w:highlight w:val="yellow"/>
               </w:rPr>
-              <w:t xml:space="preserve">    const activeAlert = await prisma.alert.findFirst({</w:t>
+              <w:t xml:space="preserve">    </w:t>
+            </w:r>
+            <w:proofErr w:type="spellStart"/>
+            <w:r>
+              <w:rPr>
+                <w:rFonts w:ascii="Arial" w:eastAsia="Courier New" w:hAnsi="Arial" w:cs="Arial"/>
+                <w:sz w:val="18"/>
+                <w:szCs w:val="18"/>
+                <w:highlight w:val="yellow"/>
+              </w:rPr>
+              <w:t>const</w:t>
+            </w:r>
+            <w:proofErr w:type="spellEnd"/>
+            <w:r>
+              <w:rPr>
+                <w:rFonts w:ascii="Arial" w:eastAsia="Courier New" w:hAnsi="Arial" w:cs="Arial"/>
+                <w:sz w:val="18"/>
+                <w:szCs w:val="18"/>
+                <w:highlight w:val="yellow"/>
+              </w:rPr>
+              <w:t xml:space="preserve"> </w:t>
+            </w:r>
+            <w:proofErr w:type="spellStart"/>
+            <w:r>
+              <w:rPr>
+                <w:rFonts w:ascii="Arial" w:eastAsia="Courier New" w:hAnsi="Arial" w:cs="Arial"/>
+                <w:sz w:val="18"/>
+                <w:szCs w:val="18"/>
+                <w:highlight w:val="yellow"/>
+              </w:rPr>
+              <w:t>activeAlert</w:t>
+            </w:r>
+            <w:proofErr w:type="spellEnd"/>
+            <w:r>
+              <w:rPr>
+                <w:rFonts w:ascii="Arial" w:eastAsia="Courier New" w:hAnsi="Arial" w:cs="Arial"/>
+                <w:sz w:val="18"/>
+                <w:szCs w:val="18"/>
+                <w:highlight w:val="yellow"/>
+              </w:rPr>
+              <w:t xml:space="preserve"> = </w:t>
+            </w:r>
+            <w:proofErr w:type="spellStart"/>
+            <w:r>
+              <w:rPr>
+                <w:rFonts w:ascii="Arial" w:eastAsia="Courier New" w:hAnsi="Arial" w:cs="Arial"/>
+                <w:sz w:val="18"/>
+                <w:szCs w:val="18"/>
+                <w:highlight w:val="yellow"/>
+              </w:rPr>
+              <w:t>await</w:t>
+            </w:r>
+            <w:proofErr w:type="spellEnd"/>
+            <w:r>
+              <w:rPr>
+                <w:rFonts w:ascii="Arial" w:eastAsia="Courier New" w:hAnsi="Arial" w:cs="Arial"/>
+                <w:sz w:val="18"/>
+                <w:szCs w:val="18"/>
+                <w:highlight w:val="yellow"/>
+              </w:rPr>
+              <w:t xml:space="preserve"> </w:t>
+            </w:r>
+            <w:proofErr w:type="spellStart"/>
+            <w:proofErr w:type="gramStart"/>
+            <w:r>
+              <w:rPr>
+                <w:rFonts w:ascii="Arial" w:eastAsia="Courier New" w:hAnsi="Arial" w:cs="Arial"/>
+                <w:sz w:val="18"/>
+                <w:szCs w:val="18"/>
+                <w:highlight w:val="yellow"/>
+              </w:rPr>
+              <w:t>prisma.alert</w:t>
+            </w:r>
+            <w:proofErr w:type="gramEnd"/>
+            <w:r>
+              <w:rPr>
+                <w:rFonts w:ascii="Arial" w:eastAsia="Courier New" w:hAnsi="Arial" w:cs="Arial"/>
+                <w:sz w:val="18"/>
+                <w:szCs w:val="18"/>
+                <w:highlight w:val="yellow"/>
+              </w:rPr>
+              <w:t>.findFirst</w:t>
+            </w:r>
+            <w:proofErr w:type="spellEnd"/>
+            <w:r>
+              <w:rPr>
+                <w:rFonts w:ascii="Arial" w:eastAsia="Courier New" w:hAnsi="Arial" w:cs="Arial"/>
+                <w:sz w:val="18"/>
+                <w:szCs w:val="18"/>
+                <w:highlight w:val="yellow"/>
+              </w:rPr>
+              <w:t>({</w:t>
             </w:r>
           </w:p>
           <w:p>
@@ -3270,7 +4853,98 @@
                 <w:szCs w:val="18"/>
                 <w:highlight w:val="yellow"/>
               </w:rPr>
-              <w:t xml:space="preserve">      where: { deviceId: device.id, variable, status: 'active' },</w:t>
+              <w:t xml:space="preserve">      </w:t>
+            </w:r>
+            <w:proofErr w:type="spellStart"/>
+            <w:r>
+              <w:rPr>
+                <w:rFonts w:ascii="Arial" w:eastAsia="Courier New" w:hAnsi="Arial" w:cs="Arial"/>
+                <w:sz w:val="18"/>
+                <w:szCs w:val="18"/>
+                <w:highlight w:val="yellow"/>
+              </w:rPr>
+              <w:t>where</w:t>
+            </w:r>
+            <w:proofErr w:type="spellEnd"/>
+            <w:r>
+              <w:rPr>
+                <w:rFonts w:ascii="Arial" w:eastAsia="Courier New" w:hAnsi="Arial" w:cs="Arial"/>
+                <w:sz w:val="18"/>
+                <w:szCs w:val="18"/>
+                <w:highlight w:val="yellow"/>
+              </w:rPr>
+              <w:t xml:space="preserve">: </w:t>
+            </w:r>
+            <w:proofErr w:type="gramStart"/>
+            <w:r>
+              <w:rPr>
+                <w:rFonts w:ascii="Arial" w:eastAsia="Courier New" w:hAnsi="Arial" w:cs="Arial"/>
+                <w:sz w:val="18"/>
+                <w:szCs w:val="18"/>
+                <w:highlight w:val="yellow"/>
+              </w:rPr>
+              <w:t xml:space="preserve">{ </w:t>
+            </w:r>
+            <w:proofErr w:type="spellStart"/>
+            <w:r>
+              <w:rPr>
+                <w:rFonts w:ascii="Arial" w:eastAsia="Courier New" w:hAnsi="Arial" w:cs="Arial"/>
+                <w:sz w:val="18"/>
+                <w:szCs w:val="18"/>
+                <w:highlight w:val="yellow"/>
+              </w:rPr>
+              <w:t>deviceId</w:t>
+            </w:r>
+            <w:proofErr w:type="spellEnd"/>
+            <w:proofErr w:type="gramEnd"/>
+            <w:r>
+              <w:rPr>
+                <w:rFonts w:ascii="Arial" w:eastAsia="Courier New" w:hAnsi="Arial" w:cs="Arial"/>
+                <w:sz w:val="18"/>
+                <w:szCs w:val="18"/>
+                <w:highlight w:val="yellow"/>
+              </w:rPr>
+              <w:t xml:space="preserve">: device.id, </w:t>
+            </w:r>
+            <w:proofErr w:type="spellStart"/>
+            <w:r>
+              <w:rPr>
+                <w:rFonts w:ascii="Arial" w:eastAsia="Courier New" w:hAnsi="Arial" w:cs="Arial"/>
+                <w:sz w:val="18"/>
+                <w:szCs w:val="18"/>
+                <w:highlight w:val="yellow"/>
+              </w:rPr>
+              <w:t>variable</w:t>
+            </w:r>
+            <w:proofErr w:type="spellEnd"/>
+            <w:r>
+              <w:rPr>
+                <w:rFonts w:ascii="Arial" w:eastAsia="Courier New" w:hAnsi="Arial" w:cs="Arial"/>
+                <w:sz w:val="18"/>
+                <w:szCs w:val="18"/>
+                <w:highlight w:val="yellow"/>
+              </w:rPr>
+              <w:t>, status: '</w:t>
+            </w:r>
+            <w:proofErr w:type="spellStart"/>
+            <w:r>
+              <w:rPr>
+                <w:rFonts w:ascii="Arial" w:eastAsia="Courier New" w:hAnsi="Arial" w:cs="Arial"/>
+                <w:sz w:val="18"/>
+                <w:szCs w:val="18"/>
+                <w:highlight w:val="yellow"/>
+              </w:rPr>
+              <w:t>active</w:t>
+            </w:r>
+            <w:proofErr w:type="spellEnd"/>
+            <w:r>
+              <w:rPr>
+                <w:rFonts w:ascii="Arial" w:eastAsia="Courier New" w:hAnsi="Arial" w:cs="Arial"/>
+                <w:sz w:val="18"/>
+                <w:szCs w:val="18"/>
+                <w:highlight w:val="yellow"/>
+              </w:rPr>
+              <w:t>' },</w:t>
             </w:r>
           </w:p>
           <w:p>
@@ -3321,7 +4995,47 @@
                 <w:szCs w:val="18"/>
                 <w:highlight w:val="yellow"/>
               </w:rPr>
-              <w:t xml:space="preserve">    if (isOutOfRange) {</w:t>
+              <w:t xml:space="preserve">    </w:t>
+            </w:r>
+            <w:proofErr w:type="spellStart"/>
+            <w:r>
+              <w:rPr>
+                <w:rFonts w:ascii="Arial" w:eastAsia="Courier New" w:hAnsi="Arial" w:cs="Arial"/>
+                <w:sz w:val="18"/>
+                <w:szCs w:val="18"/>
+                <w:highlight w:val="yellow"/>
+              </w:rPr>
+              <w:t>if</w:t>
+            </w:r>
+            <w:proofErr w:type="spellEnd"/>
+            <w:r>
+              <w:rPr>
+                <w:rFonts w:ascii="Arial" w:eastAsia="Courier New" w:hAnsi="Arial" w:cs="Arial"/>
+                <w:sz w:val="18"/>
+                <w:szCs w:val="18"/>
+                <w:highlight w:val="yellow"/>
+              </w:rPr>
+              <w:t xml:space="preserve"> (</w:t>
+            </w:r>
+            <w:proofErr w:type="spellStart"/>
+            <w:r>
+              <w:rPr>
+                <w:rFonts w:ascii="Arial" w:eastAsia="Courier New" w:hAnsi="Arial" w:cs="Arial"/>
+                <w:sz w:val="18"/>
+                <w:szCs w:val="18"/>
+                <w:highlight w:val="yellow"/>
+              </w:rPr>
+              <w:t>isOutOfRange</w:t>
+            </w:r>
+            <w:proofErr w:type="spellEnd"/>
+            <w:r>
+              <w:rPr>
+                <w:rFonts w:ascii="Arial" w:eastAsia="Courier New" w:hAnsi="Arial" w:cs="Arial"/>
+                <w:sz w:val="18"/>
+                <w:szCs w:val="18"/>
+                <w:highlight w:val="yellow"/>
+              </w:rPr>
+              <w:t>) {</w:t>
             </w:r>
           </w:p>
           <w:p>
@@ -3338,7 +5052,98 @@
                 <w:szCs w:val="18"/>
                 <w:highlight w:val="yellow"/>
               </w:rPr>
-              <w:t xml:space="preserve">      if (!notifyFlags[variable] &amp;&amp; !activeAlert) {</w:t>
+              <w:t xml:space="preserve">      </w:t>
+            </w:r>
+            <w:proofErr w:type="spellStart"/>
+            <w:r>
+              <w:rPr>
+                <w:rFonts w:ascii="Arial" w:eastAsia="Courier New" w:hAnsi="Arial" w:cs="Arial"/>
+                <w:sz w:val="18"/>
+                <w:szCs w:val="18"/>
+                <w:highlight w:val="yellow"/>
+              </w:rPr>
+              <w:t>if</w:t>
+            </w:r>
+            <w:proofErr w:type="spellEnd"/>
+            <w:r>
+              <w:rPr>
+                <w:rFonts w:ascii="Arial" w:eastAsia="Courier New" w:hAnsi="Arial" w:cs="Arial"/>
+                <w:sz w:val="18"/>
+                <w:szCs w:val="18"/>
+                <w:highlight w:val="yellow"/>
+              </w:rPr>
+              <w:t xml:space="preserve"> </w:t>
+            </w:r>
+            <w:proofErr w:type="gramStart"/>
+            <w:r>
+              <w:rPr>
+                <w:rFonts w:ascii="Arial" w:eastAsia="Courier New" w:hAnsi="Arial" w:cs="Arial"/>
+                <w:sz w:val="18"/>
+                <w:szCs w:val="18"/>
+                <w:highlight w:val="yellow"/>
+              </w:rPr>
+              <w:t>(!</w:t>
+            </w:r>
+            <w:proofErr w:type="spellStart"/>
+            <w:r>
+              <w:rPr>
+                <w:rFonts w:ascii="Arial" w:eastAsia="Courier New" w:hAnsi="Arial" w:cs="Arial"/>
+                <w:sz w:val="18"/>
+                <w:szCs w:val="18"/>
+                <w:highlight w:val="yellow"/>
+              </w:rPr>
+              <w:t>notifyFlags</w:t>
+            </w:r>
+            <w:proofErr w:type="spellEnd"/>
+            <w:proofErr w:type="gramEnd"/>
+            <w:r>
+              <w:rPr>
+                <w:rFonts w:ascii="Arial" w:eastAsia="Courier New" w:hAnsi="Arial" w:cs="Arial"/>
+                <w:sz w:val="18"/>
+                <w:szCs w:val="18"/>
+                <w:highlight w:val="yellow"/>
+              </w:rPr>
+              <w:t>[</w:t>
+            </w:r>
+            <w:proofErr w:type="spellStart"/>
+            <w:r>
+              <w:rPr>
+                <w:rFonts w:ascii="Arial" w:eastAsia="Courier New" w:hAnsi="Arial" w:cs="Arial"/>
+                <w:sz w:val="18"/>
+                <w:szCs w:val="18"/>
+                <w:highlight w:val="yellow"/>
+              </w:rPr>
+              <w:t>variable</w:t>
+            </w:r>
+            <w:proofErr w:type="spellEnd"/>
+            <w:r>
+              <w:rPr>
+                <w:rFonts w:ascii="Arial" w:eastAsia="Courier New" w:hAnsi="Arial" w:cs="Arial"/>
+                <w:sz w:val="18"/>
+                <w:szCs w:val="18"/>
+                <w:highlight w:val="yellow"/>
+              </w:rPr>
+              <w:t>] &amp;&amp; !</w:t>
+            </w:r>
+            <w:proofErr w:type="spellStart"/>
+            <w:r>
+              <w:rPr>
+                <w:rFonts w:ascii="Arial" w:eastAsia="Courier New" w:hAnsi="Arial" w:cs="Arial"/>
+                <w:sz w:val="18"/>
+                <w:szCs w:val="18"/>
+                <w:highlight w:val="yellow"/>
+              </w:rPr>
+              <w:t>activeAlert</w:t>
+            </w:r>
+            <w:proofErr w:type="spellEnd"/>
+            <w:r>
+              <w:rPr>
+                <w:rFonts w:ascii="Arial" w:eastAsia="Courier New" w:hAnsi="Arial" w:cs="Arial"/>
+                <w:sz w:val="18"/>
+                <w:szCs w:val="18"/>
+                <w:highlight w:val="yellow"/>
+              </w:rPr>
+              <w:t>) {</w:t>
             </w:r>
           </w:p>
           <w:p>
@@ -3406,7 +5211,138 @@
                 <w:szCs w:val="18"/>
                 <w:highlight w:val="yellow"/>
               </w:rPr>
-              <w:t xml:space="preserve">      const direction = value &lt; min ? 'below_min' : 'above_max';</w:t>
+              <w:t xml:space="preserve">      </w:t>
+            </w:r>
+            <w:proofErr w:type="spellStart"/>
+            <w:r>
+              <w:rPr>
+                <w:rFonts w:ascii="Arial" w:eastAsia="Courier New" w:hAnsi="Arial" w:cs="Arial"/>
+                <w:sz w:val="18"/>
+                <w:szCs w:val="18"/>
+                <w:highlight w:val="yellow"/>
+              </w:rPr>
+              <w:t>const</w:t>
+            </w:r>
+            <w:proofErr w:type="spellEnd"/>
+            <w:r>
+              <w:rPr>
+                <w:rFonts w:ascii="Arial" w:eastAsia="Courier New" w:hAnsi="Arial" w:cs="Arial"/>
+                <w:sz w:val="18"/>
+                <w:szCs w:val="18"/>
+                <w:highlight w:val="yellow"/>
+              </w:rPr>
+              <w:t xml:space="preserve"> </w:t>
+            </w:r>
+            <w:proofErr w:type="spellStart"/>
+            <w:r>
+              <w:rPr>
+                <w:rFonts w:ascii="Arial" w:eastAsia="Courier New" w:hAnsi="Arial" w:cs="Arial"/>
+                <w:sz w:val="18"/>
+                <w:szCs w:val="18"/>
+                <w:highlight w:val="yellow"/>
+              </w:rPr>
+              <w:t>direction</w:t>
+            </w:r>
+            <w:proofErr w:type="spellEnd"/>
+            <w:r>
+              <w:rPr>
+                <w:rFonts w:ascii="Arial" w:eastAsia="Courier New" w:hAnsi="Arial" w:cs="Arial"/>
+                <w:sz w:val="18"/>
+                <w:szCs w:val="18"/>
+                <w:highlight w:val="yellow"/>
+              </w:rPr>
+              <w:t xml:space="preserve"> = </w:t>
+            </w:r>
+            <w:proofErr w:type="spellStart"/>
+            <w:r>
+              <w:rPr>
+                <w:rFonts w:ascii="Arial" w:eastAsia="Courier New" w:hAnsi="Arial" w:cs="Arial"/>
+                <w:sz w:val="18"/>
+                <w:szCs w:val="18"/>
+                <w:highlight w:val="yellow"/>
+              </w:rPr>
+              <w:t>value</w:t>
+            </w:r>
+            <w:proofErr w:type="spellEnd"/>
+            <w:r>
+              <w:rPr>
+                <w:rFonts w:ascii="Arial" w:eastAsia="Courier New" w:hAnsi="Arial" w:cs="Arial"/>
+                <w:sz w:val="18"/>
+                <w:szCs w:val="18"/>
+                <w:highlight w:val="yellow"/>
+              </w:rPr>
+              <w:t xml:space="preserve"> &lt; </w:t>
+            </w:r>
+            <w:proofErr w:type="gramStart"/>
+            <w:r>
+              <w:rPr>
+                <w:rFonts w:ascii="Arial" w:eastAsia="Courier New" w:hAnsi="Arial" w:cs="Arial"/>
+                <w:sz w:val="18"/>
+                <w:szCs w:val="18"/>
+                <w:highlight w:val="yellow"/>
+              </w:rPr>
+              <w:t>min ?</w:t>
+            </w:r>
+            <w:proofErr w:type="gramEnd"/>
+            <w:r>
+              <w:rPr>
+                <w:rFonts w:ascii="Arial" w:eastAsia="Courier New" w:hAnsi="Arial" w:cs="Arial"/>
+                <w:sz w:val="18"/>
+                <w:szCs w:val="18"/>
+                <w:highlight w:val="yellow"/>
+              </w:rPr>
+              <w:t xml:space="preserve"> '</w:t>
+            </w:r>
+            <w:proofErr w:type="spellStart"/>
+            <w:r>
+              <w:rPr>
+                <w:rFonts w:ascii="Arial" w:eastAsia="Courier New" w:hAnsi="Arial" w:cs="Arial"/>
+                <w:sz w:val="18"/>
+                <w:szCs w:val="18"/>
+                <w:highlight w:val="yellow"/>
+              </w:rPr>
+              <w:t>below_min</w:t>
+            </w:r>
+            <w:proofErr w:type="spellEnd"/>
+            <w:proofErr w:type="gramStart"/>
+            <w:r>
+              <w:rPr>
+                <w:rFonts w:ascii="Arial" w:eastAsia="Courier New" w:hAnsi="Arial" w:cs="Arial"/>
+                <w:sz w:val="18"/>
+                <w:szCs w:val="18"/>
+                <w:highlight w:val="yellow"/>
+              </w:rPr>
+              <w:t>' :</w:t>
+            </w:r>
+            <w:proofErr w:type="gramEnd"/>
+            <w:r>
+              <w:rPr>
+                <w:rFonts w:ascii="Arial" w:eastAsia="Courier New" w:hAnsi="Arial" w:cs="Arial"/>
+                <w:sz w:val="18"/>
+                <w:szCs w:val="18"/>
+                <w:highlight w:val="yellow"/>
+              </w:rPr>
+              <w:t xml:space="preserve"> '</w:t>
+            </w:r>
+            <w:proofErr w:type="spellStart"/>
+            <w:r>
+              <w:rPr>
+                <w:rFonts w:ascii="Arial" w:eastAsia="Courier New" w:hAnsi="Arial" w:cs="Arial"/>
+                <w:sz w:val="18"/>
+                <w:szCs w:val="18"/>
+                <w:highlight w:val="yellow"/>
+              </w:rPr>
+              <w:t>above_max</w:t>
+            </w:r>
+            <w:proofErr w:type="spellEnd"/>
+            <w:r>
+              <w:rPr>
+                <w:rFonts w:ascii="Arial" w:eastAsia="Courier New" w:hAnsi="Arial" w:cs="Arial"/>
+                <w:sz w:val="18"/>
+                <w:szCs w:val="18"/>
+                <w:highlight w:val="yellow"/>
+              </w:rPr>
+              <w:t>';</w:t>
             </w:r>
           </w:p>
           <w:p>
@@ -3440,7 +5376,58 @@
                 <w:szCs w:val="18"/>
                 <w:highlight w:val="yellow"/>
               </w:rPr>
-              <w:t xml:space="preserve">      if (!activeAlert) {</w:t>
+              <w:t xml:space="preserve">      </w:t>
+            </w:r>
+            <w:proofErr w:type="spellStart"/>
+            <w:r>
+              <w:rPr>
+                <w:rFonts w:ascii="Arial" w:eastAsia="Courier New" w:hAnsi="Arial" w:cs="Arial"/>
+                <w:sz w:val="18"/>
+                <w:szCs w:val="18"/>
+                <w:highlight w:val="yellow"/>
+              </w:rPr>
+              <w:t>if</w:t>
+            </w:r>
+            <w:proofErr w:type="spellEnd"/>
+            <w:r>
+              <w:rPr>
+                <w:rFonts w:ascii="Arial" w:eastAsia="Courier New" w:hAnsi="Arial" w:cs="Arial"/>
+                <w:sz w:val="18"/>
+                <w:szCs w:val="18"/>
+                <w:highlight w:val="yellow"/>
+              </w:rPr>
+              <w:t xml:space="preserve"> </w:t>
+            </w:r>
+            <w:proofErr w:type="gramStart"/>
+            <w:r>
+              <w:rPr>
+                <w:rFonts w:ascii="Arial" w:eastAsia="Courier New" w:hAnsi="Arial" w:cs="Arial"/>
+                <w:sz w:val="18"/>
+                <w:szCs w:val="18"/>
+                <w:highlight w:val="yellow"/>
+              </w:rPr>
+              <w:t>(!</w:t>
+            </w:r>
+            <w:proofErr w:type="spellStart"/>
+            <w:r>
+              <w:rPr>
+                <w:rFonts w:ascii="Arial" w:eastAsia="Courier New" w:hAnsi="Arial" w:cs="Arial"/>
+                <w:sz w:val="18"/>
+                <w:szCs w:val="18"/>
+                <w:highlight w:val="yellow"/>
+              </w:rPr>
+              <w:t>activeAlert</w:t>
+            </w:r>
+            <w:proofErr w:type="spellEnd"/>
+            <w:proofErr w:type="gramEnd"/>
+            <w:r>
+              <w:rPr>
+                <w:rFonts w:ascii="Arial" w:eastAsia="Courier New" w:hAnsi="Arial" w:cs="Arial"/>
+                <w:sz w:val="18"/>
+                <w:szCs w:val="18"/>
+                <w:highlight w:val="yellow"/>
+              </w:rPr>
+              <w:t>) {</w:t>
             </w:r>
           </w:p>
           <w:p>
@@ -3457,7 +5444,58 @@
                 <w:szCs w:val="18"/>
                 <w:highlight w:val="yellow"/>
               </w:rPr>
-              <w:t xml:space="preserve">        await prisma.alert.create({</w:t>
+              <w:t xml:space="preserve">        </w:t>
+            </w:r>
+            <w:proofErr w:type="spellStart"/>
+            <w:r>
+              <w:rPr>
+                <w:rFonts w:ascii="Arial" w:eastAsia="Courier New" w:hAnsi="Arial" w:cs="Arial"/>
+                <w:sz w:val="18"/>
+                <w:szCs w:val="18"/>
+                <w:highlight w:val="yellow"/>
+              </w:rPr>
+              <w:t>await</w:t>
+            </w:r>
+            <w:proofErr w:type="spellEnd"/>
+            <w:r>
+              <w:rPr>
+                <w:rFonts w:ascii="Arial" w:eastAsia="Courier New" w:hAnsi="Arial" w:cs="Arial"/>
+                <w:sz w:val="18"/>
+                <w:szCs w:val="18"/>
+                <w:highlight w:val="yellow"/>
+              </w:rPr>
+              <w:t xml:space="preserve"> </w:t>
+            </w:r>
+            <w:proofErr w:type="spellStart"/>
+            <w:proofErr w:type="gramStart"/>
+            <w:r>
+              <w:rPr>
+                <w:rFonts w:ascii="Arial" w:eastAsia="Courier New" w:hAnsi="Arial" w:cs="Arial"/>
+                <w:sz w:val="18"/>
+                <w:szCs w:val="18"/>
+                <w:highlight w:val="yellow"/>
+              </w:rPr>
+              <w:t>prisma.alert</w:t>
+            </w:r>
+            <w:proofErr w:type="gramEnd"/>
+            <w:r>
+              <w:rPr>
+                <w:rFonts w:ascii="Arial" w:eastAsia="Courier New" w:hAnsi="Arial" w:cs="Arial"/>
+                <w:sz w:val="18"/>
+                <w:szCs w:val="18"/>
+                <w:highlight w:val="yellow"/>
+              </w:rPr>
+              <w:t>.create</w:t>
+            </w:r>
+            <w:proofErr w:type="spellEnd"/>
+            <w:r>
+              <w:rPr>
+                <w:rFonts w:ascii="Arial" w:eastAsia="Courier New" w:hAnsi="Arial" w:cs="Arial"/>
+                <w:sz w:val="18"/>
+                <w:szCs w:val="18"/>
+                <w:highlight w:val="yellow"/>
+              </w:rPr>
+              <w:t>({</w:t>
             </w:r>
           </w:p>
           <w:p>
@@ -3474,7 +5512,47 @@
                 <w:szCs w:val="18"/>
                 <w:highlight w:val="yellow"/>
               </w:rPr>
-              <w:t xml:space="preserve">          data: { /* ...abre um novo evento... */ status: 'active' },</w:t>
+              <w:t xml:space="preserve">          data: </w:t>
+            </w:r>
+            <w:proofErr w:type="gramStart"/>
+            <w:r>
+              <w:rPr>
+                <w:rFonts w:ascii="Arial" w:eastAsia="Courier New" w:hAnsi="Arial" w:cs="Arial"/>
+                <w:sz w:val="18"/>
+                <w:szCs w:val="18"/>
+                <w:highlight w:val="yellow"/>
+              </w:rPr>
+              <w:t>{ /</w:t>
+            </w:r>
+            <w:proofErr w:type="gramEnd"/>
+            <w:r>
+              <w:rPr>
+                <w:rFonts w:ascii="Arial" w:eastAsia="Courier New" w:hAnsi="Arial" w:cs="Arial"/>
+                <w:sz w:val="18"/>
+                <w:szCs w:val="18"/>
+                <w:highlight w:val="yellow"/>
+              </w:rPr>
+              <w:t>* ...abre um novo evento... */ status: '</w:t>
+            </w:r>
+            <w:proofErr w:type="spellStart"/>
+            <w:r>
+              <w:rPr>
+                <w:rFonts w:ascii="Arial" w:eastAsia="Courier New" w:hAnsi="Arial" w:cs="Arial"/>
+                <w:sz w:val="18"/>
+                <w:szCs w:val="18"/>
+                <w:highlight w:val="yellow"/>
+              </w:rPr>
+              <w:t>active</w:t>
+            </w:r>
+            <w:proofErr w:type="spellEnd"/>
+            <w:r>
+              <w:rPr>
+                <w:rFonts w:ascii="Arial" w:eastAsia="Courier New" w:hAnsi="Arial" w:cs="Arial"/>
+                <w:sz w:val="18"/>
+                <w:szCs w:val="18"/>
+                <w:highlight w:val="yellow"/>
+              </w:rPr>
+              <w:t>' },</w:t>
             </w:r>
           </w:p>
           <w:p>
@@ -3576,7 +5654,89 @@
                 <w:szCs w:val="18"/>
                 <w:highlight w:val="yellow"/>
               </w:rPr>
-              <w:t xml:space="preserve">      const currentPeak = Number(activeAlert.peakValue);</w:t>
+              <w:t xml:space="preserve">      </w:t>
+            </w:r>
+            <w:proofErr w:type="spellStart"/>
+            <w:r>
+              <w:rPr>
+                <w:rFonts w:ascii="Arial" w:eastAsia="Courier New" w:hAnsi="Arial" w:cs="Arial"/>
+                <w:sz w:val="18"/>
+                <w:szCs w:val="18"/>
+                <w:highlight w:val="yellow"/>
+              </w:rPr>
+              <w:t>const</w:t>
+            </w:r>
+            <w:proofErr w:type="spellEnd"/>
+            <w:r>
+              <w:rPr>
+                <w:rFonts w:ascii="Arial" w:eastAsia="Courier New" w:hAnsi="Arial" w:cs="Arial"/>
+                <w:sz w:val="18"/>
+                <w:szCs w:val="18"/>
+                <w:highlight w:val="yellow"/>
+              </w:rPr>
+              <w:t xml:space="preserve"> </w:t>
+            </w:r>
+            <w:proofErr w:type="spellStart"/>
+            <w:r>
+              <w:rPr>
+                <w:rFonts w:ascii="Arial" w:eastAsia="Courier New" w:hAnsi="Arial" w:cs="Arial"/>
+                <w:sz w:val="18"/>
+                <w:szCs w:val="18"/>
+                <w:highlight w:val="yellow"/>
+              </w:rPr>
+              <w:t>currentPeak</w:t>
+            </w:r>
+            <w:proofErr w:type="spellEnd"/>
+            <w:r>
+              <w:rPr>
+                <w:rFonts w:ascii="Arial" w:eastAsia="Courier New" w:hAnsi="Arial" w:cs="Arial"/>
+                <w:sz w:val="18"/>
+                <w:szCs w:val="18"/>
+                <w:highlight w:val="yellow"/>
+              </w:rPr>
+              <w:t xml:space="preserve"> = </w:t>
+            </w:r>
+            <w:proofErr w:type="spellStart"/>
+            <w:proofErr w:type="gramStart"/>
+            <w:r>
+              <w:rPr>
+                <w:rFonts w:ascii="Arial" w:eastAsia="Courier New" w:hAnsi="Arial" w:cs="Arial"/>
+                <w:sz w:val="18"/>
+                <w:szCs w:val="18"/>
+                <w:highlight w:val="yellow"/>
+              </w:rPr>
+              <w:t>Number</w:t>
+            </w:r>
+            <w:proofErr w:type="spellEnd"/>
+            <w:r>
+              <w:rPr>
+                <w:rFonts w:ascii="Arial" w:eastAsia="Courier New" w:hAnsi="Arial" w:cs="Arial"/>
+                <w:sz w:val="18"/>
+                <w:szCs w:val="18"/>
+                <w:highlight w:val="yellow"/>
+              </w:rPr>
+              <w:t>(</w:t>
+            </w:r>
+            <w:proofErr w:type="spellStart"/>
+            <w:proofErr w:type="gramEnd"/>
+            <w:r>
+              <w:rPr>
+                <w:rFonts w:ascii="Arial" w:eastAsia="Courier New" w:hAnsi="Arial" w:cs="Arial"/>
+                <w:sz w:val="18"/>
+                <w:szCs w:val="18"/>
+                <w:highlight w:val="yellow"/>
+              </w:rPr>
+              <w:t>activeAlert.peakValue</w:t>
+            </w:r>
+            <w:proofErr w:type="spellEnd"/>
+            <w:r>
+              <w:rPr>
+                <w:rFonts w:ascii="Arial" w:eastAsia="Courier New" w:hAnsi="Arial" w:cs="Arial"/>
+                <w:sz w:val="18"/>
+                <w:szCs w:val="18"/>
+                <w:highlight w:val="yellow"/>
+              </w:rPr>
+              <w:t>);</w:t>
             </w:r>
           </w:p>
           <w:p>
@@ -3594,7 +5754,87 @@
                 <w:highlight w:val="yellow"/>
               </w:rPr>
               <w:lastRenderedPageBreak/>
-              <w:t xml:space="preserve">      const isMoreExtreme = activeAlert.direction === 'above_max'</w:t>
+              <w:t xml:space="preserve">      </w:t>
+            </w:r>
+            <w:proofErr w:type="spellStart"/>
+            <w:r>
+              <w:rPr>
+                <w:rFonts w:ascii="Arial" w:eastAsia="Courier New" w:hAnsi="Arial" w:cs="Arial"/>
+                <w:sz w:val="18"/>
+                <w:szCs w:val="18"/>
+                <w:highlight w:val="yellow"/>
+              </w:rPr>
+              <w:t>const</w:t>
+            </w:r>
+            <w:proofErr w:type="spellEnd"/>
+            <w:r>
+              <w:rPr>
+                <w:rFonts w:ascii="Arial" w:eastAsia="Courier New" w:hAnsi="Arial" w:cs="Arial"/>
+                <w:sz w:val="18"/>
+                <w:szCs w:val="18"/>
+                <w:highlight w:val="yellow"/>
+              </w:rPr>
+              <w:t xml:space="preserve"> </w:t>
+            </w:r>
+            <w:proofErr w:type="spellStart"/>
+            <w:r>
+              <w:rPr>
+                <w:rFonts w:ascii="Arial" w:eastAsia="Courier New" w:hAnsi="Arial" w:cs="Arial"/>
+                <w:sz w:val="18"/>
+                <w:szCs w:val="18"/>
+                <w:highlight w:val="yellow"/>
+              </w:rPr>
+              <w:t>isMoreExtreme</w:t>
+            </w:r>
+            <w:proofErr w:type="spellEnd"/>
+            <w:r>
+              <w:rPr>
+                <w:rFonts w:ascii="Arial" w:eastAsia="Courier New" w:hAnsi="Arial" w:cs="Arial"/>
+                <w:sz w:val="18"/>
+                <w:szCs w:val="18"/>
+                <w:highlight w:val="yellow"/>
+              </w:rPr>
+              <w:t xml:space="preserve"> = </w:t>
+            </w:r>
+            <w:proofErr w:type="spellStart"/>
+            <w:r>
+              <w:rPr>
+                <w:rFonts w:ascii="Arial" w:eastAsia="Courier New" w:hAnsi="Arial" w:cs="Arial"/>
+                <w:sz w:val="18"/>
+                <w:szCs w:val="18"/>
+                <w:highlight w:val="yellow"/>
+              </w:rPr>
+              <w:t>activeAlert.direction</w:t>
+            </w:r>
+            <w:proofErr w:type="spellEnd"/>
+            <w:r>
+              <w:rPr>
+                <w:rFonts w:ascii="Arial" w:eastAsia="Courier New" w:hAnsi="Arial" w:cs="Arial"/>
+                <w:sz w:val="18"/>
+                <w:szCs w:val="18"/>
+                <w:highlight w:val="yellow"/>
+              </w:rPr>
+              <w:t xml:space="preserve"> === '</w:t>
+            </w:r>
+            <w:proofErr w:type="spellStart"/>
+            <w:r>
+              <w:rPr>
+                <w:rFonts w:ascii="Arial" w:eastAsia="Courier New" w:hAnsi="Arial" w:cs="Arial"/>
+                <w:sz w:val="18"/>
+                <w:szCs w:val="18"/>
+                <w:highlight w:val="yellow"/>
+              </w:rPr>
+              <w:t>above_max</w:t>
+            </w:r>
+            <w:proofErr w:type="spellEnd"/>
+            <w:r>
+              <w:rPr>
+                <w:rFonts w:ascii="Arial" w:eastAsia="Courier New" w:hAnsi="Arial" w:cs="Arial"/>
+                <w:sz w:val="18"/>
+                <w:szCs w:val="18"/>
+                <w:highlight w:val="yellow"/>
+              </w:rPr>
+              <w:t>'</w:t>
             </w:r>
           </w:p>
           <w:p>
@@ -3611,7 +5851,98 @@
                 <w:szCs w:val="18"/>
                 <w:highlight w:val="yellow"/>
               </w:rPr>
-              <w:t xml:space="preserve">        ? value &gt; currentPeak : value &lt; currentPeak;</w:t>
+              <w:t xml:space="preserve">        ? </w:t>
+            </w:r>
+            <w:proofErr w:type="spellStart"/>
+            <w:r>
+              <w:rPr>
+                <w:rFonts w:ascii="Arial" w:eastAsia="Courier New" w:hAnsi="Arial" w:cs="Arial"/>
+                <w:sz w:val="18"/>
+                <w:szCs w:val="18"/>
+                <w:highlight w:val="yellow"/>
+              </w:rPr>
+              <w:t>value</w:t>
+            </w:r>
+            <w:proofErr w:type="spellEnd"/>
+            <w:r>
+              <w:rPr>
+                <w:rFonts w:ascii="Arial" w:eastAsia="Courier New" w:hAnsi="Arial" w:cs="Arial"/>
+                <w:sz w:val="18"/>
+                <w:szCs w:val="18"/>
+                <w:highlight w:val="yellow"/>
+              </w:rPr>
+              <w:t xml:space="preserve"> &gt; </w:t>
+            </w:r>
+            <w:proofErr w:type="spellStart"/>
+            <w:proofErr w:type="gramStart"/>
+            <w:r>
+              <w:rPr>
+                <w:rFonts w:ascii="Arial" w:eastAsia="Courier New" w:hAnsi="Arial" w:cs="Arial"/>
+                <w:sz w:val="18"/>
+                <w:szCs w:val="18"/>
+                <w:highlight w:val="yellow"/>
+              </w:rPr>
+              <w:t>currentPeak</w:t>
+            </w:r>
+            <w:proofErr w:type="spellEnd"/>
+            <w:r>
+              <w:rPr>
+                <w:rFonts w:ascii="Arial" w:eastAsia="Courier New" w:hAnsi="Arial" w:cs="Arial"/>
+                <w:sz w:val="18"/>
+                <w:szCs w:val="18"/>
+                <w:highlight w:val="yellow"/>
+              </w:rPr>
+              <w:t xml:space="preserve"> :</w:t>
+            </w:r>
+            <w:proofErr w:type="gramEnd"/>
+            <w:r>
+              <w:rPr>
+                <w:rFonts w:ascii="Arial" w:eastAsia="Courier New" w:hAnsi="Arial" w:cs="Arial"/>
+                <w:sz w:val="18"/>
+                <w:szCs w:val="18"/>
+                <w:highlight w:val="yellow"/>
+              </w:rPr>
+              <w:t xml:space="preserve"> </w:t>
+            </w:r>
+            <w:proofErr w:type="spellStart"/>
+            <w:r>
+              <w:rPr>
+                <w:rFonts w:ascii="Arial" w:eastAsia="Courier New" w:hAnsi="Arial" w:cs="Arial"/>
+                <w:sz w:val="18"/>
+                <w:szCs w:val="18"/>
+                <w:highlight w:val="yellow"/>
+              </w:rPr>
+              <w:t>value</w:t>
+            </w:r>
+            <w:proofErr w:type="spellEnd"/>
+            <w:r>
+              <w:rPr>
+                <w:rFonts w:ascii="Arial" w:eastAsia="Courier New" w:hAnsi="Arial" w:cs="Arial"/>
+                <w:sz w:val="18"/>
+                <w:szCs w:val="18"/>
+                <w:highlight w:val="yellow"/>
+              </w:rPr>
+              <w:t xml:space="preserve"> &lt; </w:t>
+            </w:r>
+            <w:proofErr w:type="spellStart"/>
+            <w:r>
+              <w:rPr>
+                <w:rFonts w:ascii="Arial" w:eastAsia="Courier New" w:hAnsi="Arial" w:cs="Arial"/>
+                <w:sz w:val="18"/>
+                <w:szCs w:val="18"/>
+                <w:highlight w:val="yellow"/>
+              </w:rPr>
+              <w:t>currentPeak</w:t>
+            </w:r>
+            <w:proofErr w:type="spellEnd"/>
+            <w:r>
+              <w:rPr>
+                <w:rFonts w:ascii="Arial" w:eastAsia="Courier New" w:hAnsi="Arial" w:cs="Arial"/>
+                <w:sz w:val="18"/>
+                <w:szCs w:val="18"/>
+                <w:highlight w:val="yellow"/>
+              </w:rPr>
+              <w:t>;</w:t>
             </w:r>
           </w:p>
           <w:p>
@@ -3628,7 +5959,47 @@
                 <w:szCs w:val="18"/>
                 <w:highlight w:val="yellow"/>
               </w:rPr>
-              <w:t xml:space="preserve">      if (isMoreExtreme) {</w:t>
+              <w:t xml:space="preserve">      </w:t>
+            </w:r>
+            <w:proofErr w:type="spellStart"/>
+            <w:r>
+              <w:rPr>
+                <w:rFonts w:ascii="Arial" w:eastAsia="Courier New" w:hAnsi="Arial" w:cs="Arial"/>
+                <w:sz w:val="18"/>
+                <w:szCs w:val="18"/>
+                <w:highlight w:val="yellow"/>
+              </w:rPr>
+              <w:t>if</w:t>
+            </w:r>
+            <w:proofErr w:type="spellEnd"/>
+            <w:r>
+              <w:rPr>
+                <w:rFonts w:ascii="Arial" w:eastAsia="Courier New" w:hAnsi="Arial" w:cs="Arial"/>
+                <w:sz w:val="18"/>
+                <w:szCs w:val="18"/>
+                <w:highlight w:val="yellow"/>
+              </w:rPr>
+              <w:t xml:space="preserve"> (</w:t>
+            </w:r>
+            <w:proofErr w:type="spellStart"/>
+            <w:r>
+              <w:rPr>
+                <w:rFonts w:ascii="Arial" w:eastAsia="Courier New" w:hAnsi="Arial" w:cs="Arial"/>
+                <w:sz w:val="18"/>
+                <w:szCs w:val="18"/>
+                <w:highlight w:val="yellow"/>
+              </w:rPr>
+              <w:t>isMoreExtreme</w:t>
+            </w:r>
+            <w:proofErr w:type="spellEnd"/>
+            <w:r>
+              <w:rPr>
+                <w:rFonts w:ascii="Arial" w:eastAsia="Courier New" w:hAnsi="Arial" w:cs="Arial"/>
+                <w:sz w:val="18"/>
+                <w:szCs w:val="18"/>
+                <w:highlight w:val="yellow"/>
+              </w:rPr>
+              <w:t>) {</w:t>
             </w:r>
           </w:p>
           <w:p>
@@ -3645,7 +6016,118 @@
                 <w:szCs w:val="18"/>
                 <w:highlight w:val="yellow"/>
               </w:rPr>
-              <w:t xml:space="preserve">        await prisma.alert.update({ where: { id: activeAlert.id }, data: { peakValue: value } });</w:t>
+              <w:t xml:space="preserve">        </w:t>
+            </w:r>
+            <w:proofErr w:type="spellStart"/>
+            <w:r>
+              <w:rPr>
+                <w:rFonts w:ascii="Arial" w:eastAsia="Courier New" w:hAnsi="Arial" w:cs="Arial"/>
+                <w:sz w:val="18"/>
+                <w:szCs w:val="18"/>
+                <w:highlight w:val="yellow"/>
+              </w:rPr>
+              <w:t>await</w:t>
+            </w:r>
+            <w:proofErr w:type="spellEnd"/>
+            <w:r>
+              <w:rPr>
+                <w:rFonts w:ascii="Arial" w:eastAsia="Courier New" w:hAnsi="Arial" w:cs="Arial"/>
+                <w:sz w:val="18"/>
+                <w:szCs w:val="18"/>
+                <w:highlight w:val="yellow"/>
+              </w:rPr>
+              <w:t xml:space="preserve"> </w:t>
+            </w:r>
+            <w:proofErr w:type="spellStart"/>
+            <w:proofErr w:type="gramStart"/>
+            <w:r>
+              <w:rPr>
+                <w:rFonts w:ascii="Arial" w:eastAsia="Courier New" w:hAnsi="Arial" w:cs="Arial"/>
+                <w:sz w:val="18"/>
+                <w:szCs w:val="18"/>
+                <w:highlight w:val="yellow"/>
+              </w:rPr>
+              <w:t>prisma.alert</w:t>
+            </w:r>
+            <w:proofErr w:type="gramEnd"/>
+            <w:r>
+              <w:rPr>
+                <w:rFonts w:ascii="Arial" w:eastAsia="Courier New" w:hAnsi="Arial" w:cs="Arial"/>
+                <w:sz w:val="18"/>
+                <w:szCs w:val="18"/>
+                <w:highlight w:val="yellow"/>
+              </w:rPr>
+              <w:t>.update</w:t>
+            </w:r>
+            <w:proofErr w:type="spellEnd"/>
+            <w:r>
+              <w:rPr>
+                <w:rFonts w:ascii="Arial" w:eastAsia="Courier New" w:hAnsi="Arial" w:cs="Arial"/>
+                <w:sz w:val="18"/>
+                <w:szCs w:val="18"/>
+                <w:highlight w:val="yellow"/>
+              </w:rPr>
+              <w:t xml:space="preserve">({ </w:t>
+            </w:r>
+            <w:proofErr w:type="spellStart"/>
+            <w:r>
+              <w:rPr>
+                <w:rFonts w:ascii="Arial" w:eastAsia="Courier New" w:hAnsi="Arial" w:cs="Arial"/>
+                <w:sz w:val="18"/>
+                <w:szCs w:val="18"/>
+                <w:highlight w:val="yellow"/>
+              </w:rPr>
+              <w:t>where</w:t>
+            </w:r>
+            <w:proofErr w:type="spellEnd"/>
+            <w:r>
+              <w:rPr>
+                <w:rFonts w:ascii="Arial" w:eastAsia="Courier New" w:hAnsi="Arial" w:cs="Arial"/>
+                <w:sz w:val="18"/>
+                <w:szCs w:val="18"/>
+                <w:highlight w:val="yellow"/>
+              </w:rPr>
+              <w:t xml:space="preserve">: { id: activeAlert.id }, data: { </w:t>
+            </w:r>
+            <w:proofErr w:type="spellStart"/>
+            <w:r>
+              <w:rPr>
+                <w:rFonts w:ascii="Arial" w:eastAsia="Courier New" w:hAnsi="Arial" w:cs="Arial"/>
+                <w:sz w:val="18"/>
+                <w:szCs w:val="18"/>
+                <w:highlight w:val="yellow"/>
+              </w:rPr>
+              <w:t>peakValue</w:t>
+            </w:r>
+            <w:proofErr w:type="spellEnd"/>
+            <w:r>
+              <w:rPr>
+                <w:rFonts w:ascii="Arial" w:eastAsia="Courier New" w:hAnsi="Arial" w:cs="Arial"/>
+                <w:sz w:val="18"/>
+                <w:szCs w:val="18"/>
+                <w:highlight w:val="yellow"/>
+              </w:rPr>
+              <w:t xml:space="preserve">: </w:t>
+            </w:r>
+            <w:proofErr w:type="spellStart"/>
+            <w:r>
+              <w:rPr>
+                <w:rFonts w:ascii="Arial" w:eastAsia="Courier New" w:hAnsi="Arial" w:cs="Arial"/>
+                <w:sz w:val="18"/>
+                <w:szCs w:val="18"/>
+                <w:highlight w:val="yellow"/>
+              </w:rPr>
+              <w:t>value</w:t>
+            </w:r>
+            <w:proofErr w:type="spellEnd"/>
+            <w:r>
+              <w:rPr>
+                <w:rFonts w:ascii="Arial" w:eastAsia="Courier New" w:hAnsi="Arial" w:cs="Arial"/>
+                <w:sz w:val="18"/>
+                <w:szCs w:val="18"/>
+                <w:highlight w:val="yellow"/>
+              </w:rPr>
+              <w:t xml:space="preserve"> } });</w:t>
             </w:r>
           </w:p>
           <w:p>
@@ -3747,7 +6229,47 @@
                 <w:szCs w:val="18"/>
                 <w:highlight w:val="yellow"/>
               </w:rPr>
-              <w:t xml:space="preserve">    if (activeAlert) {</w:t>
+              <w:t xml:space="preserve">    </w:t>
+            </w:r>
+            <w:proofErr w:type="spellStart"/>
+            <w:r>
+              <w:rPr>
+                <w:rFonts w:ascii="Arial" w:eastAsia="Courier New" w:hAnsi="Arial" w:cs="Arial"/>
+                <w:sz w:val="18"/>
+                <w:szCs w:val="18"/>
+                <w:highlight w:val="yellow"/>
+              </w:rPr>
+              <w:t>if</w:t>
+            </w:r>
+            <w:proofErr w:type="spellEnd"/>
+            <w:r>
+              <w:rPr>
+                <w:rFonts w:ascii="Arial" w:eastAsia="Courier New" w:hAnsi="Arial" w:cs="Arial"/>
+                <w:sz w:val="18"/>
+                <w:szCs w:val="18"/>
+                <w:highlight w:val="yellow"/>
+              </w:rPr>
+              <w:t xml:space="preserve"> (</w:t>
+            </w:r>
+            <w:proofErr w:type="spellStart"/>
+            <w:r>
+              <w:rPr>
+                <w:rFonts w:ascii="Arial" w:eastAsia="Courier New" w:hAnsi="Arial" w:cs="Arial"/>
+                <w:sz w:val="18"/>
+                <w:szCs w:val="18"/>
+                <w:highlight w:val="yellow"/>
+              </w:rPr>
+              <w:t>activeAlert</w:t>
+            </w:r>
+            <w:proofErr w:type="spellEnd"/>
+            <w:r>
+              <w:rPr>
+                <w:rFonts w:ascii="Arial" w:eastAsia="Courier New" w:hAnsi="Arial" w:cs="Arial"/>
+                <w:sz w:val="18"/>
+                <w:szCs w:val="18"/>
+                <w:highlight w:val="yellow"/>
+              </w:rPr>
+              <w:t>) {</w:t>
             </w:r>
           </w:p>
           <w:p>
@@ -3764,7 +6286,58 @@
                 <w:szCs w:val="18"/>
                 <w:highlight w:val="yellow"/>
               </w:rPr>
-              <w:t xml:space="preserve">      await prisma.alert.update({</w:t>
+              <w:t xml:space="preserve">      </w:t>
+            </w:r>
+            <w:proofErr w:type="spellStart"/>
+            <w:r>
+              <w:rPr>
+                <w:rFonts w:ascii="Arial" w:eastAsia="Courier New" w:hAnsi="Arial" w:cs="Arial"/>
+                <w:sz w:val="18"/>
+                <w:szCs w:val="18"/>
+                <w:highlight w:val="yellow"/>
+              </w:rPr>
+              <w:t>await</w:t>
+            </w:r>
+            <w:proofErr w:type="spellEnd"/>
+            <w:r>
+              <w:rPr>
+                <w:rFonts w:ascii="Arial" w:eastAsia="Courier New" w:hAnsi="Arial" w:cs="Arial"/>
+                <w:sz w:val="18"/>
+                <w:szCs w:val="18"/>
+                <w:highlight w:val="yellow"/>
+              </w:rPr>
+              <w:t xml:space="preserve"> </w:t>
+            </w:r>
+            <w:proofErr w:type="spellStart"/>
+            <w:proofErr w:type="gramStart"/>
+            <w:r>
+              <w:rPr>
+                <w:rFonts w:ascii="Arial" w:eastAsia="Courier New" w:hAnsi="Arial" w:cs="Arial"/>
+                <w:sz w:val="18"/>
+                <w:szCs w:val="18"/>
+                <w:highlight w:val="yellow"/>
+              </w:rPr>
+              <w:t>prisma.alert</w:t>
+            </w:r>
+            <w:proofErr w:type="gramEnd"/>
+            <w:r>
+              <w:rPr>
+                <w:rFonts w:ascii="Arial" w:eastAsia="Courier New" w:hAnsi="Arial" w:cs="Arial"/>
+                <w:sz w:val="18"/>
+                <w:szCs w:val="18"/>
+                <w:highlight w:val="yellow"/>
+              </w:rPr>
+              <w:t>.update</w:t>
+            </w:r>
+            <w:proofErr w:type="spellEnd"/>
+            <w:r>
+              <w:rPr>
+                <w:rFonts w:ascii="Arial" w:eastAsia="Courier New" w:hAnsi="Arial" w:cs="Arial"/>
+                <w:sz w:val="18"/>
+                <w:szCs w:val="18"/>
+                <w:highlight w:val="yellow"/>
+              </w:rPr>
+              <w:t>({</w:t>
             </w:r>
           </w:p>
           <w:p>
@@ -3781,7 +6354,47 @@
                 <w:szCs w:val="18"/>
                 <w:highlight w:val="yellow"/>
               </w:rPr>
-              <w:t xml:space="preserve">        where: { id: activeAlert.id },</w:t>
+              <w:t xml:space="preserve">        </w:t>
+            </w:r>
+            <w:proofErr w:type="spellStart"/>
+            <w:r>
+              <w:rPr>
+                <w:rFonts w:ascii="Arial" w:eastAsia="Courier New" w:hAnsi="Arial" w:cs="Arial"/>
+                <w:sz w:val="18"/>
+                <w:szCs w:val="18"/>
+                <w:highlight w:val="yellow"/>
+              </w:rPr>
+              <w:t>where</w:t>
+            </w:r>
+            <w:proofErr w:type="spellEnd"/>
+            <w:r>
+              <w:rPr>
+                <w:rFonts w:ascii="Arial" w:eastAsia="Courier New" w:hAnsi="Arial" w:cs="Arial"/>
+                <w:sz w:val="18"/>
+                <w:szCs w:val="18"/>
+                <w:highlight w:val="yellow"/>
+              </w:rPr>
+              <w:t xml:space="preserve">: </w:t>
+            </w:r>
+            <w:proofErr w:type="gramStart"/>
+            <w:r>
+              <w:rPr>
+                <w:rFonts w:ascii="Arial" w:eastAsia="Courier New" w:hAnsi="Arial" w:cs="Arial"/>
+                <w:sz w:val="18"/>
+                <w:szCs w:val="18"/>
+                <w:highlight w:val="yellow"/>
+              </w:rPr>
+              <w:t>{ id</w:t>
+            </w:r>
+            <w:proofErr w:type="gramEnd"/>
+            <w:r>
+              <w:rPr>
+                <w:rFonts w:ascii="Arial" w:eastAsia="Courier New" w:hAnsi="Arial" w:cs="Arial"/>
+                <w:sz w:val="18"/>
+                <w:szCs w:val="18"/>
+                <w:highlight w:val="yellow"/>
+              </w:rPr>
+              <w:t>: activeAlert.id },</w:t>
             </w:r>
           </w:p>
           <w:p>
@@ -3798,7 +6411,87 @@
                 <w:szCs w:val="18"/>
                 <w:highlight w:val="yellow"/>
               </w:rPr>
-              <w:t xml:space="preserve">        data: { status: 'resolved', endedAt: measurement.measuredAt },</w:t>
+              <w:t xml:space="preserve">        data: </w:t>
+            </w:r>
+            <w:proofErr w:type="gramStart"/>
+            <w:r>
+              <w:rPr>
+                <w:rFonts w:ascii="Arial" w:eastAsia="Courier New" w:hAnsi="Arial" w:cs="Arial"/>
+                <w:sz w:val="18"/>
+                <w:szCs w:val="18"/>
+                <w:highlight w:val="yellow"/>
+              </w:rPr>
+              <w:t>{ status</w:t>
+            </w:r>
+            <w:proofErr w:type="gramEnd"/>
+            <w:r>
+              <w:rPr>
+                <w:rFonts w:ascii="Arial" w:eastAsia="Courier New" w:hAnsi="Arial" w:cs="Arial"/>
+                <w:sz w:val="18"/>
+                <w:szCs w:val="18"/>
+                <w:highlight w:val="yellow"/>
+              </w:rPr>
+              <w:t>: '</w:t>
+            </w:r>
+            <w:proofErr w:type="spellStart"/>
+            <w:r>
+              <w:rPr>
+                <w:rFonts w:ascii="Arial" w:eastAsia="Courier New" w:hAnsi="Arial" w:cs="Arial"/>
+                <w:sz w:val="18"/>
+                <w:szCs w:val="18"/>
+                <w:highlight w:val="yellow"/>
+              </w:rPr>
+              <w:t>resolved</w:t>
+            </w:r>
+            <w:proofErr w:type="spellEnd"/>
+            <w:r>
+              <w:rPr>
+                <w:rFonts w:ascii="Arial" w:eastAsia="Courier New" w:hAnsi="Arial" w:cs="Arial"/>
+                <w:sz w:val="18"/>
+                <w:szCs w:val="18"/>
+                <w:highlight w:val="yellow"/>
+              </w:rPr>
+              <w:t xml:space="preserve">', </w:t>
+            </w:r>
+            <w:proofErr w:type="spellStart"/>
+            <w:r>
+              <w:rPr>
+                <w:rFonts w:ascii="Arial" w:eastAsia="Courier New" w:hAnsi="Arial" w:cs="Arial"/>
+                <w:sz w:val="18"/>
+                <w:szCs w:val="18"/>
+                <w:highlight w:val="yellow"/>
+              </w:rPr>
+              <w:t>endedAt</w:t>
+            </w:r>
+            <w:proofErr w:type="spellEnd"/>
+            <w:r>
+              <w:rPr>
+                <w:rFonts w:ascii="Arial" w:eastAsia="Courier New" w:hAnsi="Arial" w:cs="Arial"/>
+                <w:sz w:val="18"/>
+                <w:szCs w:val="18"/>
+                <w:highlight w:val="yellow"/>
+              </w:rPr>
+              <w:t xml:space="preserve">: </w:t>
+            </w:r>
+            <w:proofErr w:type="spellStart"/>
+            <w:r>
+              <w:rPr>
+                <w:rFonts w:ascii="Arial" w:eastAsia="Courier New" w:hAnsi="Arial" w:cs="Arial"/>
+                <w:sz w:val="18"/>
+                <w:szCs w:val="18"/>
+                <w:highlight w:val="yellow"/>
+              </w:rPr>
+              <w:t>measurement.measuredAt</w:t>
+            </w:r>
+            <w:proofErr w:type="spellEnd"/>
+            <w:r>
+              <w:rPr>
+                <w:rFonts w:ascii="Arial" w:eastAsia="Courier New" w:hAnsi="Arial" w:cs="Arial"/>
+                <w:sz w:val="18"/>
+                <w:szCs w:val="18"/>
+                <w:highlight w:val="yellow"/>
+              </w:rPr>
+              <w:t xml:space="preserve"> },</w:t>
             </w:r>
           </w:p>
           <w:p>
@@ -3924,21 +6617,39 @@
           <w:rFonts w:ascii="Arial" w:hAnsi="Arial" w:cs="Arial"/>
           <w:highlight w:val="yellow"/>
         </w:rPr>
-        <w:t xml:space="preserve">Além deste trabalho, o desenvolvimento do sistema foi documentado por um conjunto de </w:t>
-      </w:r>
-      <w:r>
-        <w:rPr>
-          <w:rFonts w:ascii="Arial" w:hAnsi="Arial" w:cs="Arial"/>
-          <w:highlight w:val="yellow"/>
-        </w:rPr>
-        <w:t>dez</w:t>
-      </w:r>
-      <w:r>
-        <w:rPr>
-          <w:rFonts w:ascii="Arial" w:hAnsi="Arial" w:cs="Arial"/>
-          <w:highlight w:val="yellow"/>
-        </w:rPr>
-        <w:t xml:space="preserve"> documentos técnicos, mantidos junto ao código-fonte do projeto (diretório docs/documentacao/ do repositório), referenciados ao longo deste trabalho como material de apoio técnico. O Quadro 1 relaciona o conteúdo de cada um.</w:t>
+        <w:t xml:space="preserve">Além deste trabalho, o desenvolvimento do sistema foi documentado por um conjunto de dez documentos técnicos, mantidos junto ao código-fonte do projeto (diretório </w:t>
+      </w:r>
+      <w:proofErr w:type="spellStart"/>
+      <w:r>
+        <w:rPr>
+          <w:rFonts w:ascii="Arial" w:hAnsi="Arial" w:cs="Arial"/>
+          <w:highlight w:val="yellow"/>
+        </w:rPr>
+        <w:t>docs</w:t>
+      </w:r>
+      <w:proofErr w:type="spellEnd"/>
+      <w:r>
+        <w:rPr>
+          <w:rFonts w:ascii="Arial" w:hAnsi="Arial" w:cs="Arial"/>
+          <w:highlight w:val="yellow"/>
+        </w:rPr>
+        <w:t>/</w:t>
+      </w:r>
+      <w:proofErr w:type="spellStart"/>
+      <w:r>
+        <w:rPr>
+          <w:rFonts w:ascii="Arial" w:hAnsi="Arial" w:cs="Arial"/>
+          <w:highlight w:val="yellow"/>
+        </w:rPr>
+        <w:t>documentacao</w:t>
+      </w:r>
+      <w:proofErr w:type="spellEnd"/>
+      <w:r>
+        <w:rPr>
+          <w:rFonts w:ascii="Arial" w:hAnsi="Arial" w:cs="Arial"/>
+          <w:highlight w:val="yellow"/>
+        </w:rPr>
+        <w:t>/ do repositório), referenciados ao longo deste trabalho como material de apoio técnico. O Quadro 1 relaciona o conteúdo de cada um.</w:t>
       </w:r>
     </w:p>
     <w:p>
@@ -4071,8 +6782,19 @@
                 <w:szCs w:val="18"/>
                 <w:highlight w:val="yellow"/>
               </w:rPr>
-              <w:t>01-arquitetura-e-decisoes.md</w:t>
-            </w:r>
+              <w:t>01-</w:t>
+            </w:r>
+            <w:proofErr w:type="gramStart"/>
+            <w:r>
+              <w:rPr>
+                <w:rFonts w:ascii="Arial" w:eastAsia="Courier New" w:hAnsi="Arial" w:cs="Arial"/>
+                <w:sz w:val="18"/>
+                <w:szCs w:val="18"/>
+                <w:highlight w:val="yellow"/>
+              </w:rPr>
+              <w:t>arquitetura-e-decisoes.md</w:t>
+            </w:r>
+            <w:proofErr w:type="gramEnd"/>
           </w:p>
         </w:tc>
         <w:tc>
@@ -4099,7 +6821,27 @@
                 <w:szCs w:val="20"/>
                 <w:highlight w:val="yellow"/>
               </w:rPr>
-              <w:t>Arquitetura geral, stack tecnológica e decisões de modelagem do sistema.</w:t>
+              <w:t xml:space="preserve">Arquitetura geral, </w:t>
+            </w:r>
+            <w:proofErr w:type="spellStart"/>
+            <w:r>
+              <w:rPr>
+                <w:rFonts w:ascii="Arial" w:hAnsi="Arial" w:cs="Arial"/>
+                <w:sz w:val="20"/>
+                <w:szCs w:val="20"/>
+                <w:highlight w:val="yellow"/>
+              </w:rPr>
+              <w:t>stack</w:t>
+            </w:r>
+            <w:proofErr w:type="spellEnd"/>
+            <w:r>
+              <w:rPr>
+                <w:rFonts w:ascii="Arial" w:hAnsi="Arial" w:cs="Arial"/>
+                <w:sz w:val="20"/>
+                <w:szCs w:val="20"/>
+                <w:highlight w:val="yellow"/>
+              </w:rPr>
+              <w:t xml:space="preserve"> tecnológica e decisões de modelagem do sistema.</w:t>
             </w:r>
           </w:p>
         </w:tc>
@@ -4129,8 +6871,19 @@
                 <w:szCs w:val="18"/>
                 <w:highlight w:val="yellow"/>
               </w:rPr>
-              <w:t>02-integracao.md</w:t>
-            </w:r>
+              <w:t>02-</w:t>
+            </w:r>
+            <w:proofErr w:type="gramStart"/>
+            <w:r>
+              <w:rPr>
+                <w:rFonts w:ascii="Arial" w:eastAsia="Courier New" w:hAnsi="Arial" w:cs="Arial"/>
+                <w:sz w:val="18"/>
+                <w:szCs w:val="18"/>
+                <w:highlight w:val="yellow"/>
+              </w:rPr>
+              <w:t>integracao.md</w:t>
+            </w:r>
+            <w:proofErr w:type="gramEnd"/>
           </w:p>
         </w:tc>
         <w:tc>
@@ -4187,8 +6940,19 @@
                 <w:szCs w:val="18"/>
                 <w:highlight w:val="yellow"/>
               </w:rPr>
-              <w:t>03-seguranca.md</w:t>
-            </w:r>
+              <w:t>03-</w:t>
+            </w:r>
+            <w:proofErr w:type="gramStart"/>
+            <w:r>
+              <w:rPr>
+                <w:rFonts w:ascii="Arial" w:eastAsia="Courier New" w:hAnsi="Arial" w:cs="Arial"/>
+                <w:sz w:val="18"/>
+                <w:szCs w:val="18"/>
+                <w:highlight w:val="yellow"/>
+              </w:rPr>
+              <w:t>seguranca.md</w:t>
+            </w:r>
+            <w:proofErr w:type="gramEnd"/>
           </w:p>
         </w:tc>
         <w:tc>
@@ -4245,8 +7009,19 @@
                 <w:szCs w:val="18"/>
                 <w:highlight w:val="yellow"/>
               </w:rPr>
-              <w:t>04-documentacao-tecnica.md</w:t>
-            </w:r>
+              <w:t>04-</w:t>
+            </w:r>
+            <w:proofErr w:type="gramStart"/>
+            <w:r>
+              <w:rPr>
+                <w:rFonts w:ascii="Arial" w:eastAsia="Courier New" w:hAnsi="Arial" w:cs="Arial"/>
+                <w:sz w:val="18"/>
+                <w:szCs w:val="18"/>
+                <w:highlight w:val="yellow"/>
+              </w:rPr>
+              <w:t>documentacao-tecnica.md</w:t>
+            </w:r>
+            <w:proofErr w:type="gramEnd"/>
           </w:p>
         </w:tc>
         <w:tc>
@@ -4303,8 +7078,19 @@
                 <w:szCs w:val="18"/>
                 <w:highlight w:val="yellow"/>
               </w:rPr>
-              <w:t>05-guia-teste-iniciante.md</w:t>
-            </w:r>
+              <w:t>05-</w:t>
+            </w:r>
+            <w:proofErr w:type="gramStart"/>
+            <w:r>
+              <w:rPr>
+                <w:rFonts w:ascii="Arial" w:eastAsia="Courier New" w:hAnsi="Arial" w:cs="Arial"/>
+                <w:sz w:val="18"/>
+                <w:szCs w:val="18"/>
+                <w:highlight w:val="yellow"/>
+              </w:rPr>
+              <w:t>guia-teste-iniciante.md</w:t>
+            </w:r>
+            <w:proofErr w:type="gramEnd"/>
           </w:p>
         </w:tc>
         <w:tc>
@@ -4361,8 +7147,19 @@
                 <w:szCs w:val="18"/>
                 <w:highlight w:val="yellow"/>
               </w:rPr>
-              <w:t>06-guia-teste-arduino-real.md</w:t>
-            </w:r>
+              <w:t>06-</w:t>
+            </w:r>
+            <w:proofErr w:type="gramStart"/>
+            <w:r>
+              <w:rPr>
+                <w:rFonts w:ascii="Arial" w:eastAsia="Courier New" w:hAnsi="Arial" w:cs="Arial"/>
+                <w:sz w:val="18"/>
+                <w:szCs w:val="18"/>
+                <w:highlight w:val="yellow"/>
+              </w:rPr>
+              <w:t>guia-teste-arduino-real.md</w:t>
+            </w:r>
+            <w:proofErr w:type="gramEnd"/>
           </w:p>
         </w:tc>
         <w:tc>
@@ -4419,8 +7216,19 @@
                 <w:szCs w:val="18"/>
                 <w:highlight w:val="yellow"/>
               </w:rPr>
-              <w:t>07-metodologia-tcc.md</w:t>
-            </w:r>
+              <w:t>07-</w:t>
+            </w:r>
+            <w:proofErr w:type="gramStart"/>
+            <w:r>
+              <w:rPr>
+                <w:rFonts w:ascii="Arial" w:eastAsia="Courier New" w:hAnsi="Arial" w:cs="Arial"/>
+                <w:sz w:val="18"/>
+                <w:szCs w:val="18"/>
+                <w:highlight w:val="yellow"/>
+              </w:rPr>
+              <w:t>metodologia-tcc.md</w:t>
+            </w:r>
+            <w:proofErr w:type="gramEnd"/>
           </w:p>
         </w:tc>
         <w:tc>
@@ -4479,24 +7287,17 @@
               </w:rPr>
               <w:t>08-</w:t>
             </w:r>
-            <w:r>
-              <w:rPr>
-                <w:rFonts w:ascii="Arial" w:eastAsia="Courier New" w:hAnsi="Arial" w:cs="Arial"/>
-                <w:sz w:val="18"/>
-                <w:szCs w:val="18"/>
-                <w:highlight w:val="yellow"/>
-              </w:rPr>
-              <w:t>explicacao-sistema</w:t>
-            </w:r>
-            <w:r>
-              <w:rPr>
-                <w:rFonts w:ascii="Arial" w:eastAsia="Courier New" w:hAnsi="Arial" w:cs="Arial"/>
-                <w:sz w:val="18"/>
-                <w:szCs w:val="18"/>
-                <w:highlight w:val="yellow"/>
-              </w:rPr>
-              <w:t>.md</w:t>
-            </w:r>
+            <w:proofErr w:type="gramStart"/>
+            <w:r>
+              <w:rPr>
+                <w:rFonts w:ascii="Arial" w:eastAsia="Courier New" w:hAnsi="Arial" w:cs="Arial"/>
+                <w:sz w:val="18"/>
+                <w:szCs w:val="18"/>
+                <w:highlight w:val="yellow"/>
+              </w:rPr>
+              <w:t>explicacao-sistema.md</w:t>
+            </w:r>
+            <w:proofErr w:type="gramEnd"/>
           </w:p>
         </w:tc>
         <w:tc>
@@ -4555,24 +7356,17 @@
               </w:rPr>
               <w:t>09-</w:t>
             </w:r>
-            <w:r>
-              <w:rPr>
-                <w:rFonts w:ascii="Arial" w:eastAsia="Courier New" w:hAnsi="Arial" w:cs="Arial"/>
-                <w:sz w:val="18"/>
-                <w:szCs w:val="18"/>
-                <w:highlight w:val="yellow"/>
-              </w:rPr>
-              <w:t>funcao-e-conceito</w:t>
-            </w:r>
-            <w:r>
-              <w:rPr>
-                <w:rFonts w:ascii="Arial" w:eastAsia="Courier New" w:hAnsi="Arial" w:cs="Arial"/>
-                <w:sz w:val="18"/>
-                <w:szCs w:val="18"/>
-                <w:highlight w:val="yellow"/>
-              </w:rPr>
-              <w:t>.md</w:t>
-            </w:r>
+            <w:proofErr w:type="gramStart"/>
+            <w:r>
+              <w:rPr>
+                <w:rFonts w:ascii="Arial" w:eastAsia="Courier New" w:hAnsi="Arial" w:cs="Arial"/>
+                <w:sz w:val="18"/>
+                <w:szCs w:val="18"/>
+                <w:highlight w:val="yellow"/>
+              </w:rPr>
+              <w:t>funcao-e-conceito.md</w:t>
+            </w:r>
+            <w:proofErr w:type="gramEnd"/>
           </w:p>
         </w:tc>
         <w:tc>
@@ -4631,24 +7425,17 @@
               </w:rPr>
               <w:t>10-</w:t>
             </w:r>
-            <w:r>
-              <w:rPr>
-                <w:rFonts w:ascii="Arial" w:eastAsia="Courier New" w:hAnsi="Arial" w:cs="Arial"/>
-                <w:sz w:val="18"/>
-                <w:szCs w:val="18"/>
-                <w:highlight w:val="yellow"/>
-              </w:rPr>
-              <w:t>referencia-pasta-arquivo</w:t>
-            </w:r>
-            <w:r>
-              <w:rPr>
-                <w:rFonts w:ascii="Arial" w:eastAsia="Courier New" w:hAnsi="Arial" w:cs="Arial"/>
-                <w:sz w:val="18"/>
-                <w:szCs w:val="18"/>
-                <w:highlight w:val="yellow"/>
-              </w:rPr>
-              <w:t>.md</w:t>
-            </w:r>
+            <w:proofErr w:type="gramStart"/>
+            <w:r>
+              <w:rPr>
+                <w:rFonts w:ascii="Arial" w:eastAsia="Courier New" w:hAnsi="Arial" w:cs="Arial"/>
+                <w:sz w:val="18"/>
+                <w:szCs w:val="18"/>
+                <w:highlight w:val="yellow"/>
+              </w:rPr>
+              <w:t>referencia-pasta-arquivo.md</w:t>
+            </w:r>
+            <w:proofErr w:type="gramEnd"/>
           </w:p>
         </w:tc>
         <w:tc>

</xml_diff>